<commit_message>
Added the part to doc
</commit_message>
<xml_diff>
--- a/IcebreakerReport.docx
+++ b/IcebreakerReport.docx
@@ -2,6 +2,26 @@
 <file path=word/document.xml><?xml version="1.0" encoding="utf-8"?>
 <w:document xmlns:wpc="http://schemas.microsoft.com/office/word/2010/wordprocessingCanvas" xmlns:cx="http://schemas.microsoft.com/office/drawing/2014/chartex" xmlns:cx1="http://schemas.microsoft.com/office/drawing/2015/9/8/chartex" xmlns:cx2="http://schemas.microsoft.com/office/drawing/2015/10/21/chartex" xmlns:cx3="http://schemas.microsoft.com/office/drawing/2016/5/9/chartex" xmlns:cx4="http://schemas.microsoft.com/office/drawing/2016/5/10/chartex" xmlns:cx5="http://schemas.microsoft.com/office/drawing/2016/5/11/chartex" xmlns:cx6="http://schemas.microsoft.com/office/drawing/2016/5/12/chartex" xmlns:cx7="http://schemas.microsoft.com/office/drawing/2016/5/13/chartex" xmlns:cx8="http://schemas.microsoft.com/office/drawing/2016/5/14/chartex" xmlns:mc="http://schemas.openxmlformats.org/markup-compatibility/2006" xmlns:aink="http://schemas.microsoft.com/office/drawing/2016/ink" xmlns:am3d="http://schemas.microsoft.com/office/drawing/2017/model3d" xmlns:o="urn:schemas-microsoft-com:office:office" xmlns:oel="http://schemas.microsoft.com/office/2019/extlst" xmlns:r="http://schemas.openxmlformats.org/officeDocument/2006/relationships" xmlns:m="http://schemas.openxmlformats.org/officeDocument/2006/math" xmlns:v="urn:schemas-microsoft-com:vml" xmlns:wp14="http://schemas.microsoft.com/office/word/2010/wordprocessingDrawing" xmlns:wp="http://schemas.openxmlformats.org/drawingml/2006/wordprocessingDrawing" xmlns:w10="urn:schemas-microsoft-com:office:word" xmlns:w="http://schemas.openxmlformats.org/wordprocessingml/2006/main" xmlns:w14="http://schemas.microsoft.com/office/word/2010/wordml" xmlns:w15="http://schemas.microsoft.com/office/word/2012/wordml" xmlns:w16cex="http://schemas.microsoft.com/office/word/2018/wordml/cex" xmlns:w16cid="http://schemas.microsoft.com/office/word/2016/wordml/cid" xmlns:w16="http://schemas.microsoft.com/office/word/2018/wordml" xmlns:w16du="http://schemas.microsoft.com/office/word/2023/wordml/word16du" xmlns:w16sdtdh="http://schemas.microsoft.com/office/word/2020/wordml/sdtdatahash" xmlns:w16sdtfl="http://schemas.microsoft.com/office/word/2024/wordml/sdtformatlock" xmlns:w16se="http://schemas.microsoft.com/office/word/2015/wordml/symex" xmlns:wpg="http://schemas.microsoft.com/office/word/2010/wordprocessingGroup" xmlns:wpi="http://schemas.microsoft.com/office/word/2010/wordprocessingInk" xmlns:wne="http://schemas.microsoft.com/office/word/2006/wordml" xmlns:wps="http://schemas.microsoft.com/office/word/2010/wordprocessingShape" mc:Ignorable="w14 w15 w16se w16cid w16 w16cex w16sdtdh w16sdtfl w16du wp14">
   <w:body>
+    <w:p>
+      <w:pPr>
+        <w:jc w:val="center"/>
+        <w:rPr>
+          <w:b/>
+          <w:bCs/>
+          <w:sz w:val="56"/>
+          <w:szCs w:val="56"/>
+        </w:rPr>
+      </w:pPr>
+      <w:r>
+        <w:rPr>
+          <w:b/>
+          <w:bCs/>
+          <w:sz w:val="56"/>
+          <w:szCs w:val="56"/>
+        </w:rPr>
+        <w:t>Table of Content</w:t>
+      </w:r>
+    </w:p>
     <w:sdt>
       <w:sdtPr>
         <w:id w:val="1681232975"/>
@@ -24,11 +44,14 @@
             <w:tabs>
               <w:tab w:val="right" w:leader="dot" w:pos="9016"/>
             </w:tabs>
-            <w:rPr>
-              <w:rFonts w:eastAsiaTheme="minorEastAsia"/>
-              <w:noProof/>
-              <w:lang w:val="en-DE" w:eastAsia="en-DE"/>
-            </w:rPr>
+          </w:pPr>
+        </w:p>
+        <w:p>
+          <w:pPr>
+            <w:pStyle w:val="TOC1"/>
+            <w:tabs>
+              <w:tab w:val="right" w:leader="dot" w:pos="9016"/>
+            </w:tabs>
           </w:pPr>
           <w:r>
             <w:fldChar w:fldCharType="begin"/>
@@ -39,7 +62,7 @@
           <w:r>
             <w:fldChar w:fldCharType="separate"/>
           </w:r>
-          <w:hyperlink w:anchor="_Toc189313935" w:history="1">
+          <w:hyperlink w:anchor="_Toc189596641" w:history="1">
             <w:r>
               <w:rPr>
                 <w:rStyle w:val="Hyperlink"/>
@@ -66,7 +89,7 @@
                 <w:noProof/>
                 <w:webHidden/>
               </w:rPr>
-              <w:instrText xml:space="preserve"> PAGEREF _Toc189313935 \h </w:instrText>
+              <w:instrText xml:space="preserve"> PAGEREF _Toc189596641 \h </w:instrText>
             </w:r>
             <w:r>
               <w:rPr>
@@ -106,10 +129,9 @@
             <w:rPr>
               <w:rFonts w:eastAsiaTheme="minorEastAsia"/>
               <w:noProof/>
-              <w:lang w:val="en-DE" w:eastAsia="en-DE"/>
             </w:rPr>
           </w:pPr>
-          <w:hyperlink w:anchor="_Toc189313936" w:history="1">
+          <w:hyperlink w:anchor="_Toc189596642" w:history="1">
             <w:r>
               <w:rPr>
                 <w:rStyle w:val="Hyperlink"/>
@@ -136,7 +158,7 @@
                 <w:noProof/>
                 <w:webHidden/>
               </w:rPr>
-              <w:instrText xml:space="preserve"> PAGEREF _Toc189313936 \h </w:instrText>
+              <w:instrText xml:space="preserve"> PAGEREF _Toc189596642 \h </w:instrText>
             </w:r>
             <w:r>
               <w:rPr>
@@ -176,10 +198,9 @@
             <w:rPr>
               <w:rFonts w:eastAsiaTheme="minorEastAsia"/>
               <w:noProof/>
-              <w:lang w:val="en-DE" w:eastAsia="en-DE"/>
             </w:rPr>
           </w:pPr>
-          <w:hyperlink w:anchor="_Toc189313937" w:history="1">
+          <w:hyperlink w:anchor="_Toc189596643" w:history="1">
             <w:r>
               <w:rPr>
                 <w:rStyle w:val="Hyperlink"/>
@@ -206,7 +227,7 @@
                 <w:noProof/>
                 <w:webHidden/>
               </w:rPr>
-              <w:instrText xml:space="preserve"> PAGEREF _Toc189313937 \h </w:instrText>
+              <w:instrText xml:space="preserve"> PAGEREF _Toc189596643 \h </w:instrText>
             </w:r>
             <w:r>
               <w:rPr>
@@ -246,10 +267,9 @@
             <w:rPr>
               <w:rFonts w:eastAsiaTheme="minorEastAsia"/>
               <w:noProof/>
-              <w:lang w:val="en-DE" w:eastAsia="en-DE"/>
             </w:rPr>
           </w:pPr>
-          <w:hyperlink w:anchor="_Toc189313938" w:history="1">
+          <w:hyperlink w:anchor="_Toc189596644" w:history="1">
             <w:r>
               <w:rPr>
                 <w:rStyle w:val="Hyperlink"/>
@@ -276,7 +296,7 @@
                 <w:noProof/>
                 <w:webHidden/>
               </w:rPr>
-              <w:instrText xml:space="preserve"> PAGEREF _Toc189313938 \h </w:instrText>
+              <w:instrText xml:space="preserve"> PAGEREF _Toc189596644 \h </w:instrText>
             </w:r>
             <w:r>
               <w:rPr>
@@ -316,10 +336,9 @@
             <w:rPr>
               <w:rFonts w:eastAsiaTheme="minorEastAsia"/>
               <w:noProof/>
-              <w:lang w:val="en-DE" w:eastAsia="en-DE"/>
             </w:rPr>
           </w:pPr>
-          <w:hyperlink w:anchor="_Toc189313939" w:history="1">
+          <w:hyperlink w:anchor="_Toc189596645" w:history="1">
             <w:r>
               <w:rPr>
                 <w:rStyle w:val="Hyperlink"/>
@@ -346,7 +365,7 @@
                 <w:noProof/>
                 <w:webHidden/>
               </w:rPr>
-              <w:instrText xml:space="preserve"> PAGEREF _Toc189313939 \h </w:instrText>
+              <w:instrText xml:space="preserve"> PAGEREF _Toc189596645 \h </w:instrText>
             </w:r>
             <w:r>
               <w:rPr>
@@ -386,10 +405,9 @@
             <w:rPr>
               <w:rFonts w:eastAsiaTheme="minorEastAsia"/>
               <w:noProof/>
-              <w:lang w:val="en-DE" w:eastAsia="en-DE"/>
             </w:rPr>
           </w:pPr>
-          <w:hyperlink w:anchor="_Toc189313940" w:history="1">
+          <w:hyperlink w:anchor="_Toc189596646" w:history="1">
             <w:r>
               <w:rPr>
                 <w:rStyle w:val="Hyperlink"/>
@@ -416,7 +434,7 @@
                 <w:noProof/>
                 <w:webHidden/>
               </w:rPr>
-              <w:instrText xml:space="preserve"> PAGEREF _Toc189313940 \h </w:instrText>
+              <w:instrText xml:space="preserve"> PAGEREF _Toc189596646 \h </w:instrText>
             </w:r>
             <w:r>
               <w:rPr>
@@ -456,10 +474,9 @@
             <w:rPr>
               <w:rFonts w:eastAsiaTheme="minorEastAsia"/>
               <w:noProof/>
-              <w:lang w:val="en-DE" w:eastAsia="en-DE"/>
             </w:rPr>
           </w:pPr>
-          <w:hyperlink w:anchor="_Toc189313941" w:history="1">
+          <w:hyperlink w:anchor="_Toc189596647" w:history="1">
             <w:r>
               <w:rPr>
                 <w:rStyle w:val="Hyperlink"/>
@@ -486,7 +503,7 @@
                 <w:noProof/>
                 <w:webHidden/>
               </w:rPr>
-              <w:instrText xml:space="preserve"> PAGEREF _Toc189313941 \h </w:instrText>
+              <w:instrText xml:space="preserve"> PAGEREF _Toc189596647 \h </w:instrText>
             </w:r>
             <w:r>
               <w:rPr>
@@ -526,10 +543,9 @@
             <w:rPr>
               <w:rFonts w:eastAsiaTheme="minorEastAsia"/>
               <w:noProof/>
-              <w:lang w:val="en-DE" w:eastAsia="en-DE"/>
             </w:rPr>
           </w:pPr>
-          <w:hyperlink w:anchor="_Toc189313942" w:history="1">
+          <w:hyperlink w:anchor="_Toc189596648" w:history="1">
             <w:r>
               <w:rPr>
                 <w:rStyle w:val="Hyperlink"/>
@@ -556,7 +572,7 @@
                 <w:noProof/>
                 <w:webHidden/>
               </w:rPr>
-              <w:instrText xml:space="preserve"> PAGEREF _Toc189313942 \h </w:instrText>
+              <w:instrText xml:space="preserve"> PAGEREF _Toc189596648 \h </w:instrText>
             </w:r>
             <w:r>
               <w:rPr>
@@ -576,7 +592,7 @@
                 <w:noProof/>
                 <w:webHidden/>
               </w:rPr>
-              <w:t>11</w:t>
+              <w:t>10</w:t>
             </w:r>
             <w:r>
               <w:rPr>
@@ -596,10 +612,9 @@
             <w:rPr>
               <w:rFonts w:eastAsiaTheme="minorEastAsia"/>
               <w:noProof/>
-              <w:lang w:val="en-DE" w:eastAsia="en-DE"/>
             </w:rPr>
           </w:pPr>
-          <w:hyperlink w:anchor="_Toc189313943" w:history="1">
+          <w:hyperlink w:anchor="_Toc189596649" w:history="1">
             <w:r>
               <w:rPr>
                 <w:rStyle w:val="Hyperlink"/>
@@ -626,7 +641,7 @@
                 <w:noProof/>
                 <w:webHidden/>
               </w:rPr>
-              <w:instrText xml:space="preserve"> PAGEREF _Toc189313943 \h </w:instrText>
+              <w:instrText xml:space="preserve"> PAGEREF _Toc189596649 \h </w:instrText>
             </w:r>
             <w:r>
               <w:rPr>
@@ -666,10 +681,9 @@
             <w:rPr>
               <w:rFonts w:eastAsiaTheme="minorEastAsia"/>
               <w:noProof/>
-              <w:lang w:val="en-DE" w:eastAsia="en-DE"/>
             </w:rPr>
           </w:pPr>
-          <w:hyperlink w:anchor="_Toc189313944" w:history="1">
+          <w:hyperlink w:anchor="_Toc189596650" w:history="1">
             <w:r>
               <w:rPr>
                 <w:rStyle w:val="Hyperlink"/>
@@ -696,7 +710,7 @@
                 <w:noProof/>
                 <w:webHidden/>
               </w:rPr>
-              <w:instrText xml:space="preserve"> PAGEREF _Toc189313944 \h </w:instrText>
+              <w:instrText xml:space="preserve"> PAGEREF _Toc189596650 \h </w:instrText>
             </w:r>
             <w:r>
               <w:rPr>
@@ -716,7 +730,7 @@
                 <w:noProof/>
                 <w:webHidden/>
               </w:rPr>
-              <w:t>11</w:t>
+              <w:t>12</w:t>
             </w:r>
             <w:r>
               <w:rPr>
@@ -736,10 +750,9 @@
             <w:rPr>
               <w:rFonts w:eastAsiaTheme="minorEastAsia"/>
               <w:noProof/>
-              <w:lang w:val="en-DE" w:eastAsia="en-DE"/>
             </w:rPr>
           </w:pPr>
-          <w:hyperlink w:anchor="_Toc189313945" w:history="1">
+          <w:hyperlink w:anchor="_Toc189596651" w:history="1">
             <w:r>
               <w:rPr>
                 <w:rStyle w:val="Hyperlink"/>
@@ -766,7 +779,7 @@
                 <w:noProof/>
                 <w:webHidden/>
               </w:rPr>
-              <w:instrText xml:space="preserve"> PAGEREF _Toc189313945 \h </w:instrText>
+              <w:instrText xml:space="preserve"> PAGEREF _Toc189596651 \h </w:instrText>
             </w:r>
             <w:r>
               <w:rPr>
@@ -786,7 +799,7 @@
                 <w:noProof/>
                 <w:webHidden/>
               </w:rPr>
-              <w:t>11</w:t>
+              <w:t>12</w:t>
             </w:r>
             <w:r>
               <w:rPr>
@@ -806,10 +819,9 @@
             <w:rPr>
               <w:rFonts w:eastAsiaTheme="minorEastAsia"/>
               <w:noProof/>
-              <w:lang w:val="en-DE" w:eastAsia="en-DE"/>
             </w:rPr>
           </w:pPr>
-          <w:hyperlink w:anchor="_Toc189313946" w:history="1">
+          <w:hyperlink w:anchor="_Toc189596652" w:history="1">
             <w:r>
               <w:rPr>
                 <w:rStyle w:val="Hyperlink"/>
@@ -836,7 +848,7 @@
                 <w:noProof/>
                 <w:webHidden/>
               </w:rPr>
-              <w:instrText xml:space="preserve"> PAGEREF _Toc189313946 \h </w:instrText>
+              <w:instrText xml:space="preserve"> PAGEREF _Toc189596652 \h </w:instrText>
             </w:r>
             <w:r>
               <w:rPr>
@@ -856,7 +868,7 @@
                 <w:noProof/>
                 <w:webHidden/>
               </w:rPr>
-              <w:t>11</w:t>
+              <w:t>13</w:t>
             </w:r>
             <w:r>
               <w:rPr>
@@ -876,10 +888,9 @@
             <w:rPr>
               <w:rFonts w:eastAsiaTheme="minorEastAsia"/>
               <w:noProof/>
-              <w:lang w:val="en-DE" w:eastAsia="en-DE"/>
             </w:rPr>
           </w:pPr>
-          <w:hyperlink w:anchor="_Toc189313947" w:history="1">
+          <w:hyperlink w:anchor="_Toc189596653" w:history="1">
             <w:r>
               <w:rPr>
                 <w:rStyle w:val="Hyperlink"/>
@@ -906,7 +917,7 @@
                 <w:noProof/>
                 <w:webHidden/>
               </w:rPr>
-              <w:instrText xml:space="preserve"> PAGEREF _Toc189313947 \h </w:instrText>
+              <w:instrText xml:space="preserve"> PAGEREF _Toc189596653 \h </w:instrText>
             </w:r>
             <w:r>
               <w:rPr>
@@ -926,7 +937,7 @@
                 <w:noProof/>
                 <w:webHidden/>
               </w:rPr>
-              <w:t>11</w:t>
+              <w:t>13</w:t>
             </w:r>
             <w:r>
               <w:rPr>
@@ -946,10 +957,9 @@
             <w:rPr>
               <w:rFonts w:eastAsiaTheme="minorEastAsia"/>
               <w:noProof/>
-              <w:lang w:val="en-DE" w:eastAsia="en-DE"/>
             </w:rPr>
           </w:pPr>
-          <w:hyperlink w:anchor="_Toc189313948" w:history="1">
+          <w:hyperlink w:anchor="_Toc189596654" w:history="1">
             <w:r>
               <w:rPr>
                 <w:rStyle w:val="Hyperlink"/>
@@ -976,7 +986,7 @@
                 <w:noProof/>
                 <w:webHidden/>
               </w:rPr>
-              <w:instrText xml:space="preserve"> PAGEREF _Toc189313948 \h </w:instrText>
+              <w:instrText xml:space="preserve"> PAGEREF _Toc189596654 \h </w:instrText>
             </w:r>
             <w:r>
               <w:rPr>
@@ -996,7 +1006,7 @@
                 <w:noProof/>
                 <w:webHidden/>
               </w:rPr>
-              <w:t>12</w:t>
+              <w:t>14</w:t>
             </w:r>
             <w:r>
               <w:rPr>
@@ -1016,10 +1026,9 @@
             <w:rPr>
               <w:rFonts w:eastAsiaTheme="minorEastAsia"/>
               <w:noProof/>
-              <w:lang w:val="en-DE" w:eastAsia="en-DE"/>
             </w:rPr>
           </w:pPr>
-          <w:hyperlink w:anchor="_Toc189313949" w:history="1">
+          <w:hyperlink w:anchor="_Toc189596655" w:history="1">
             <w:r>
               <w:rPr>
                 <w:rStyle w:val="Hyperlink"/>
@@ -1046,7 +1055,7 @@
                 <w:noProof/>
                 <w:webHidden/>
               </w:rPr>
-              <w:instrText xml:space="preserve"> PAGEREF _Toc189313949 \h </w:instrText>
+              <w:instrText xml:space="preserve"> PAGEREF _Toc189596655 \h </w:instrText>
             </w:r>
             <w:r>
               <w:rPr>
@@ -1066,7 +1075,7 @@
                 <w:noProof/>
                 <w:webHidden/>
               </w:rPr>
-              <w:t>13</w:t>
+              <w:t>15</w:t>
             </w:r>
             <w:r>
               <w:rPr>
@@ -1086,10 +1095,9 @@
             <w:rPr>
               <w:rFonts w:eastAsiaTheme="minorEastAsia"/>
               <w:noProof/>
-              <w:lang w:val="en-DE" w:eastAsia="en-DE"/>
             </w:rPr>
           </w:pPr>
-          <w:hyperlink w:anchor="_Toc189313950" w:history="1">
+          <w:hyperlink w:anchor="_Toc189596656" w:history="1">
             <w:r>
               <w:rPr>
                 <w:rStyle w:val="Hyperlink"/>
@@ -1116,7 +1124,7 @@
                 <w:noProof/>
                 <w:webHidden/>
               </w:rPr>
-              <w:instrText xml:space="preserve"> PAGEREF _Toc189313950 \h </w:instrText>
+              <w:instrText xml:space="preserve"> PAGEREF _Toc189596656 \h </w:instrText>
             </w:r>
             <w:r>
               <w:rPr>
@@ -1136,7 +1144,76 @@
                 <w:noProof/>
                 <w:webHidden/>
               </w:rPr>
-              <w:t>15</w:t>
+              <w:t>17</w:t>
+            </w:r>
+            <w:r>
+              <w:rPr>
+                <w:noProof/>
+                <w:webHidden/>
+              </w:rPr>
+              <w:fldChar w:fldCharType="end"/>
+            </w:r>
+          </w:hyperlink>
+        </w:p>
+        <w:p>
+          <w:pPr>
+            <w:pStyle w:val="TOC1"/>
+            <w:tabs>
+              <w:tab w:val="right" w:leader="dot" w:pos="9016"/>
+            </w:tabs>
+            <w:rPr>
+              <w:rFonts w:eastAsiaTheme="minorEastAsia"/>
+              <w:noProof/>
+            </w:rPr>
+          </w:pPr>
+          <w:hyperlink w:anchor="_Toc189596657" w:history="1">
+            <w:r>
+              <w:rPr>
+                <w:rStyle w:val="Hyperlink"/>
+                <w:noProof/>
+              </w:rPr>
+              <w:t>Challenges we have faced</w:t>
+            </w:r>
+            <w:r>
+              <w:rPr>
+                <w:noProof/>
+                <w:webHidden/>
+              </w:rPr>
+              <w:tab/>
+            </w:r>
+            <w:r>
+              <w:rPr>
+                <w:noProof/>
+                <w:webHidden/>
+              </w:rPr>
+              <w:fldChar w:fldCharType="begin"/>
+            </w:r>
+            <w:r>
+              <w:rPr>
+                <w:noProof/>
+                <w:webHidden/>
+              </w:rPr>
+              <w:instrText xml:space="preserve"> PAGEREF _Toc189596657 \h </w:instrText>
+            </w:r>
+            <w:r>
+              <w:rPr>
+                <w:noProof/>
+                <w:webHidden/>
+              </w:rPr>
+            </w:r>
+            <w:r>
+              <w:rPr>
+                <w:noProof/>
+                <w:webHidden/>
+              </w:rPr>
+              <w:fldChar w:fldCharType="separate"/>
+            </w:r>
+            <w:r>
+              <w:rPr>
+                <w:noProof/>
+                <w:webHidden/>
+              </w:rPr>
+              <w:t>17</w:t>
             </w:r>
             <w:r>
               <w:rPr>
@@ -1156,16 +1233,15 @@
             <w:rPr>
               <w:rFonts w:eastAsiaTheme="minorEastAsia"/>
               <w:noProof/>
-              <w:lang w:val="en-DE" w:eastAsia="en-DE"/>
             </w:rPr>
           </w:pPr>
-          <w:hyperlink w:anchor="_Toc189313951" w:history="1">
+          <w:hyperlink w:anchor="_Toc189596658" w:history="1">
             <w:r>
               <w:rPr>
                 <w:rStyle w:val="Hyperlink"/>
                 <w:noProof/>
               </w:rPr>
-              <w:t>Login functionality</w:t>
+              <w:t>AI feature</w:t>
             </w:r>
             <w:r>
               <w:rPr>
@@ -1186,7 +1262,7 @@
                 <w:noProof/>
                 <w:webHidden/>
               </w:rPr>
-              <w:instrText xml:space="preserve"> PAGEREF _Toc189313951 \h </w:instrText>
+              <w:instrText xml:space="preserve"> PAGEREF _Toc189596658 \h </w:instrText>
             </w:r>
             <w:r>
               <w:rPr>
@@ -1206,7 +1282,7 @@
                 <w:noProof/>
                 <w:webHidden/>
               </w:rPr>
-              <w:t>15</w:t>
+              <w:t>17</w:t>
             </w:r>
             <w:r>
               <w:rPr>
@@ -1226,16 +1302,15 @@
             <w:rPr>
               <w:rFonts w:eastAsiaTheme="minorEastAsia"/>
               <w:noProof/>
-              <w:lang w:val="en-DE" w:eastAsia="en-DE"/>
             </w:rPr>
           </w:pPr>
-          <w:hyperlink w:anchor="_Toc189313952" w:history="1">
+          <w:hyperlink w:anchor="_Toc189596659" w:history="1">
             <w:r>
               <w:rPr>
                 <w:rStyle w:val="Hyperlink"/>
                 <w:noProof/>
               </w:rPr>
-              <w:t>Challenges we have faced</w:t>
+              <w:t>Who has done what</w:t>
             </w:r>
             <w:r>
               <w:rPr>
@@ -1256,7 +1331,7 @@
                 <w:noProof/>
                 <w:webHidden/>
               </w:rPr>
-              <w:instrText xml:space="preserve"> PAGEREF _Toc189313952 \h </w:instrText>
+              <w:instrText xml:space="preserve"> PAGEREF _Toc189596659 \h </w:instrText>
             </w:r>
             <w:r>
               <w:rPr>
@@ -1276,77 +1351,7 @@
                 <w:noProof/>
                 <w:webHidden/>
               </w:rPr>
-              <w:t>15</w:t>
-            </w:r>
-            <w:r>
-              <w:rPr>
-                <w:noProof/>
-                <w:webHidden/>
-              </w:rPr>
-              <w:fldChar w:fldCharType="end"/>
-            </w:r>
-          </w:hyperlink>
-        </w:p>
-        <w:p>
-          <w:pPr>
-            <w:pStyle w:val="TOC2"/>
-            <w:tabs>
-              <w:tab w:val="right" w:leader="dot" w:pos="9016"/>
-            </w:tabs>
-            <w:rPr>
-              <w:rFonts w:eastAsiaTheme="minorEastAsia"/>
-              <w:noProof/>
-              <w:lang w:val="en-DE" w:eastAsia="en-DE"/>
-            </w:rPr>
-          </w:pPr>
-          <w:hyperlink w:anchor="_Toc189313953" w:history="1">
-            <w:r>
-              <w:rPr>
-                <w:rStyle w:val="Hyperlink"/>
-                <w:noProof/>
-              </w:rPr>
-              <w:t>AI feature</w:t>
-            </w:r>
-            <w:r>
-              <w:rPr>
-                <w:noProof/>
-                <w:webHidden/>
-              </w:rPr>
-              <w:tab/>
-            </w:r>
-            <w:r>
-              <w:rPr>
-                <w:noProof/>
-                <w:webHidden/>
-              </w:rPr>
-              <w:fldChar w:fldCharType="begin"/>
-            </w:r>
-            <w:r>
-              <w:rPr>
-                <w:noProof/>
-                <w:webHidden/>
-              </w:rPr>
-              <w:instrText xml:space="preserve"> PAGEREF _Toc189313953 \h </w:instrText>
-            </w:r>
-            <w:r>
-              <w:rPr>
-                <w:noProof/>
-                <w:webHidden/>
-              </w:rPr>
-            </w:r>
-            <w:r>
-              <w:rPr>
-                <w:noProof/>
-                <w:webHidden/>
-              </w:rPr>
-              <w:fldChar w:fldCharType="separate"/>
-            </w:r>
-            <w:r>
-              <w:rPr>
-                <w:noProof/>
-                <w:webHidden/>
-              </w:rPr>
-              <w:t>15</w:t>
+              <w:t>18</w:t>
             </w:r>
             <w:r>
               <w:rPr>
@@ -1366,16 +1371,15 @@
             <w:rPr>
               <w:rFonts w:eastAsiaTheme="minorEastAsia"/>
               <w:noProof/>
-              <w:lang w:val="en-DE" w:eastAsia="en-DE"/>
             </w:rPr>
           </w:pPr>
-          <w:hyperlink w:anchor="_Toc189313954" w:history="1">
+          <w:hyperlink w:anchor="_Toc189596660" w:history="1">
             <w:r>
               <w:rPr>
                 <w:rStyle w:val="Hyperlink"/>
                 <w:noProof/>
               </w:rPr>
-              <w:t>Who has done what</w:t>
+              <w:t>Conclusion</w:t>
             </w:r>
             <w:r>
               <w:rPr>
@@ -1396,7 +1400,7 @@
                 <w:noProof/>
                 <w:webHidden/>
               </w:rPr>
-              <w:instrText xml:space="preserve"> PAGEREF _Toc189313954 \h </w:instrText>
+              <w:instrText xml:space="preserve"> PAGEREF _Toc189596660 \h </w:instrText>
             </w:r>
             <w:r>
               <w:rPr>
@@ -1416,77 +1420,7 @@
                 <w:noProof/>
                 <w:webHidden/>
               </w:rPr>
-              <w:t>16</w:t>
-            </w:r>
-            <w:r>
-              <w:rPr>
-                <w:noProof/>
-                <w:webHidden/>
-              </w:rPr>
-              <w:fldChar w:fldCharType="end"/>
-            </w:r>
-          </w:hyperlink>
-        </w:p>
-        <w:p>
-          <w:pPr>
-            <w:pStyle w:val="TOC1"/>
-            <w:tabs>
-              <w:tab w:val="right" w:leader="dot" w:pos="9016"/>
-            </w:tabs>
-            <w:rPr>
-              <w:rFonts w:eastAsiaTheme="minorEastAsia"/>
-              <w:noProof/>
-              <w:lang w:val="en-DE" w:eastAsia="en-DE"/>
-            </w:rPr>
-          </w:pPr>
-          <w:hyperlink w:anchor="_Toc189313955" w:history="1">
-            <w:r>
-              <w:rPr>
-                <w:rStyle w:val="Hyperlink"/>
-                <w:noProof/>
-              </w:rPr>
-              <w:t>Conclusion</w:t>
-            </w:r>
-            <w:r>
-              <w:rPr>
-                <w:noProof/>
-                <w:webHidden/>
-              </w:rPr>
-              <w:tab/>
-            </w:r>
-            <w:r>
-              <w:rPr>
-                <w:noProof/>
-                <w:webHidden/>
-              </w:rPr>
-              <w:fldChar w:fldCharType="begin"/>
-            </w:r>
-            <w:r>
-              <w:rPr>
-                <w:noProof/>
-                <w:webHidden/>
-              </w:rPr>
-              <w:instrText xml:space="preserve"> PAGEREF _Toc189313955 \h </w:instrText>
-            </w:r>
-            <w:r>
-              <w:rPr>
-                <w:noProof/>
-                <w:webHidden/>
-              </w:rPr>
-            </w:r>
-            <w:r>
-              <w:rPr>
-                <w:noProof/>
-                <w:webHidden/>
-              </w:rPr>
-              <w:fldChar w:fldCharType="separate"/>
-            </w:r>
-            <w:r>
-              <w:rPr>
-                <w:noProof/>
-                <w:webHidden/>
-              </w:rPr>
-              <w:t>16</w:t>
+              <w:t>18</w:t>
             </w:r>
             <w:r>
               <w:rPr>
@@ -1516,25 +1450,26 @@
     </w:p>
     <w:p>
       <w:pPr>
+        <w:jc w:val="center"/>
+        <w:rPr>
+          <w:b/>
+          <w:bCs/>
+          <w:sz w:val="56"/>
+          <w:szCs w:val="56"/>
+        </w:rPr>
+      </w:pPr>
+    </w:p>
+    <w:p>
+      <w:pPr>
         <w:pStyle w:val="Heading1"/>
       </w:pPr>
     </w:p>
+    <w:p/>
     <w:p>
       <w:pPr>
         <w:pStyle w:val="Heading1"/>
       </w:pPr>
-    </w:p>
-    <w:p>
-      <w:pPr>
-        <w:pStyle w:val="Heading1"/>
-      </w:pPr>
-    </w:p>
-    <w:p/>
-    <w:p>
-      <w:pPr>
-        <w:pStyle w:val="Heading1"/>
-      </w:pPr>
-      <w:bookmarkStart w:id="0" w:name="_Toc189313935"/>
+      <w:bookmarkStart w:id="0" w:name="_Toc189596641"/>
       <w:r>
         <w:lastRenderedPageBreak/>
         <w:t>Introduction</w:t>
@@ -1582,7 +1517,7 @@
       <w:pPr>
         <w:pStyle w:val="Heading1"/>
       </w:pPr>
-      <w:bookmarkStart w:id="1" w:name="_Toc189313936"/>
+      <w:bookmarkStart w:id="1" w:name="_Toc189596642"/>
       <w:r>
         <w:lastRenderedPageBreak/>
         <w:t>What is our app?</w:t>
@@ -1610,7 +1545,7 @@
       <w:pPr>
         <w:pStyle w:val="Heading2"/>
       </w:pPr>
-      <w:bookmarkStart w:id="2" w:name="_Toc189313937"/>
+      <w:bookmarkStart w:id="2" w:name="_Toc189596643"/>
       <w:r>
         <w:t>High level requirements.</w:t>
       </w:r>
@@ -1880,7 +1815,7 @@
       <w:pPr>
         <w:pStyle w:val="Heading2"/>
       </w:pPr>
-      <w:bookmarkStart w:id="3" w:name="_Toc189313938"/>
+      <w:bookmarkStart w:id="3" w:name="_Toc189596644"/>
       <w:r>
         <w:lastRenderedPageBreak/>
         <w:t>High level design</w:t>
@@ -1899,14 +1834,18 @@
       </w:r>
     </w:p>
     <w:p>
+      <w:pPr>
+        <w:keepNext/>
+        <w:jc w:val="center"/>
+      </w:pPr>
       <w:r>
         <w:rPr>
           <w:noProof/>
         </w:rPr>
         <w:drawing>
-          <wp:inline distT="0" distB="0" distL="0" distR="0" wp14:anchorId="534D7C9C" wp14:editId="32CBD342">
-            <wp:extent cx="2743200" cy="1907837"/>
-            <wp:effectExtent l="0" t="0" r="0" b="0"/>
+          <wp:inline distT="0" distB="0" distL="0" distR="0" wp14:anchorId="534D7C9C" wp14:editId="1AD17628">
+            <wp:extent cx="3152785" cy="2192694"/>
+            <wp:effectExtent l="0" t="0" r="0" b="4445"/>
             <wp:docPr id="1354477810" name="Picture 1"/>
             <wp:cNvGraphicFramePr>
               <a:graphicFrameLocks xmlns:a="http://schemas.openxmlformats.org/drawingml/2006/main" noChangeAspect="1"/>
@@ -1936,7 +1875,7 @@
                   <pic:spPr bwMode="auto">
                     <a:xfrm>
                       <a:off x="0" y="0"/>
-                      <a:ext cx="2783566" cy="1935910"/>
+                      <a:ext cx="3244759" cy="2256660"/>
                     </a:xfrm>
                     <a:prstGeom prst="rect">
                       <a:avLst/>
@@ -1953,6 +1892,34 @@
         </w:drawing>
       </w:r>
     </w:p>
+    <w:p>
+      <w:pPr>
+        <w:pStyle w:val="Caption"/>
+        <w:jc w:val="center"/>
+      </w:pPr>
+      <w:r>
+        <w:t xml:space="preserve">Figure </w:t>
+      </w:r>
+      <w:fldSimple w:instr=" SEQ Figure \* ARABIC ">
+        <w:r>
+          <w:rPr>
+            <w:noProof/>
+          </w:rPr>
+          <w:t>1</w:t>
+        </w:r>
+      </w:fldSimple>
+      <w:r>
+        <w:t xml:space="preserve">: </w:t>
+      </w:r>
+      <w:proofErr w:type="spellStart"/>
+      <w:r>
+        <w:t>Keycloak</w:t>
+      </w:r>
+      <w:proofErr w:type="spellEnd"/>
+      <w:r>
+        <w:t xml:space="preserve"> Login Terminal</w:t>
+      </w:r>
+    </w:p>
     <w:p/>
     <w:p>
       <w:r>
@@ -1969,14 +1936,18 @@
       </w:r>
     </w:p>
     <w:p>
+      <w:pPr>
+        <w:keepNext/>
+        <w:jc w:val="center"/>
+      </w:pPr>
       <w:r>
         <w:rPr>
           <w:noProof/>
         </w:rPr>
         <w:drawing>
-          <wp:inline distT="0" distB="0" distL="0" distR="0" wp14:anchorId="16DAF017" wp14:editId="649210D4">
-            <wp:extent cx="2810107" cy="1600200"/>
-            <wp:effectExtent l="0" t="0" r="9525" b="0"/>
+          <wp:inline distT="0" distB="0" distL="0" distR="0" wp14:anchorId="16DAF017" wp14:editId="7E1B2DB9">
+            <wp:extent cx="2809802" cy="1833284"/>
+            <wp:effectExtent l="0" t="0" r="0" b="0"/>
             <wp:docPr id="1693178264" name="Picture 4"/>
             <wp:cNvGraphicFramePr>
               <a:graphicFrameLocks xmlns:a="http://schemas.openxmlformats.org/drawingml/2006/main" noChangeAspect="1"/>
@@ -2006,7 +1977,7 @@
                   <pic:spPr bwMode="auto">
                     <a:xfrm>
                       <a:off x="0" y="0"/>
-                      <a:ext cx="2815296" cy="1603155"/>
+                      <a:ext cx="2851137" cy="1860254"/>
                     </a:xfrm>
                     <a:prstGeom prst="rect">
                       <a:avLst/>
@@ -2022,17 +1993,43 @@
           </wp:inline>
         </w:drawing>
       </w:r>
-      <w:r>
-        <w:t xml:space="preserve"> </w:t>
-      </w:r>
+    </w:p>
+    <w:p>
+      <w:pPr>
+        <w:pStyle w:val="Caption"/>
+        <w:jc w:val="center"/>
+      </w:pPr>
+      <w:r>
+        <w:t xml:space="preserve">Figure </w:t>
+      </w:r>
+      <w:fldSimple w:instr=" SEQ Figure \* ARABIC ">
+        <w:r>
+          <w:rPr>
+            <w:noProof/>
+          </w:rPr>
+          <w:t>2</w:t>
+        </w:r>
+      </w:fldSimple>
+      <w:r>
+        <w:rPr>
+          <w:lang w:val="de-DE"/>
+        </w:rPr>
+        <w:t>: Pass Phrase Input</w:t>
+      </w:r>
+    </w:p>
+    <w:p>
+      <w:pPr>
+        <w:keepNext/>
+        <w:jc w:val="center"/>
+      </w:pPr>
       <w:r>
         <w:rPr>
           <w:noProof/>
         </w:rPr>
         <w:drawing>
-          <wp:inline distT="0" distB="0" distL="0" distR="0" wp14:anchorId="760C51E3" wp14:editId="003F6FAA">
-            <wp:extent cx="1722120" cy="2176796"/>
-            <wp:effectExtent l="0" t="0" r="0" b="0"/>
+          <wp:inline distT="0" distB="0" distL="0" distR="0" wp14:anchorId="760C51E3" wp14:editId="57501880">
+            <wp:extent cx="2594636" cy="1650891"/>
+            <wp:effectExtent l="0" t="0" r="0" b="635"/>
             <wp:docPr id="1076001603" name="Picture 5"/>
             <wp:cNvGraphicFramePr>
               <a:graphicFrameLocks xmlns:a="http://schemas.openxmlformats.org/drawingml/2006/main" noChangeAspect="1"/>
@@ -2062,7 +2059,7 @@
                   <pic:spPr bwMode="auto">
                     <a:xfrm>
                       <a:off x="0" y="0"/>
-                      <a:ext cx="1732487" cy="2189900"/>
+                      <a:ext cx="2744716" cy="1746382"/>
                     </a:xfrm>
                     <a:prstGeom prst="rect">
                       <a:avLst/>
@@ -2079,6 +2076,26 @@
         </w:drawing>
       </w:r>
     </w:p>
+    <w:p>
+      <w:pPr>
+        <w:pStyle w:val="Caption"/>
+        <w:jc w:val="center"/>
+      </w:pPr>
+      <w:r>
+        <w:t xml:space="preserve">Figure </w:t>
+      </w:r>
+      <w:fldSimple w:instr=" SEQ Figure \* ARABIC ">
+        <w:r>
+          <w:rPr>
+            <w:noProof/>
+          </w:rPr>
+          <w:t>3</w:t>
+        </w:r>
+      </w:fldSimple>
+      <w:r>
+        <w:t>: Passphrase Setup</w:t>
+      </w:r>
+    </w:p>
     <w:p/>
     <w:p>
       <w:r>
@@ -2092,14 +2109,18 @@
       </w:r>
     </w:p>
     <w:p>
+      <w:pPr>
+        <w:keepNext/>
+        <w:jc w:val="center"/>
+      </w:pPr>
       <w:r>
         <w:rPr>
           <w:noProof/>
         </w:rPr>
         <w:drawing>
-          <wp:inline distT="0" distB="0" distL="0" distR="0" wp14:anchorId="7A0F80C1" wp14:editId="3D04E7DA">
-            <wp:extent cx="3413760" cy="1615846"/>
-            <wp:effectExtent l="0" t="0" r="0" b="3810"/>
+          <wp:inline distT="0" distB="0" distL="0" distR="0" wp14:anchorId="7A0F80C1" wp14:editId="5FA41110">
+            <wp:extent cx="3638939" cy="1722430"/>
+            <wp:effectExtent l="0" t="0" r="0" b="5080"/>
             <wp:docPr id="2118275476" name="Picture 6" descr="A screenshot of a computer&#10;&#10;Description automatically generated"/>
             <wp:cNvGraphicFramePr>
               <a:graphicFrameLocks xmlns:a="http://schemas.openxmlformats.org/drawingml/2006/main" noChangeAspect="1"/>
@@ -2129,7 +2150,7 @@
                   <pic:spPr bwMode="auto">
                     <a:xfrm>
                       <a:off x="0" y="0"/>
-                      <a:ext cx="3425395" cy="1621353"/>
+                      <a:ext cx="3675524" cy="1739747"/>
                     </a:xfrm>
                     <a:prstGeom prst="rect">
                       <a:avLst/>
@@ -2147,12 +2168,35 @@
       </w:r>
     </w:p>
     <w:p>
-      <w:r>
-        <w:lastRenderedPageBreak/>
+      <w:pPr>
+        <w:pStyle w:val="Caption"/>
+        <w:jc w:val="center"/>
+      </w:pPr>
+      <w:r>
+        <w:t xml:space="preserve">Figure </w:t>
+      </w:r>
+      <w:fldSimple w:instr=" SEQ Figure \* ARABIC ">
+        <w:r>
+          <w:rPr>
+            <w:noProof/>
+          </w:rPr>
+          <w:t>4</w:t>
+        </w:r>
+      </w:fldSimple>
+      <w:r>
+        <w:t>: Available Users-Home Screen</w:t>
+      </w:r>
+    </w:p>
+    <w:p>
+      <w:r>
         <w:t xml:space="preserve">When the user then clicks on complete profile, he will need to write a description about him/herself disclose their age and their gender, additionally, users can choose to use a profile photo. </w:t>
       </w:r>
     </w:p>
     <w:p>
+      <w:pPr>
+        <w:keepNext/>
+        <w:jc w:val="center"/>
+      </w:pPr>
       <w:r>
         <w:rPr>
           <w:noProof/>
@@ -2207,6 +2251,26 @@
         </w:drawing>
       </w:r>
     </w:p>
+    <w:p>
+      <w:pPr>
+        <w:pStyle w:val="Caption"/>
+        <w:jc w:val="center"/>
+      </w:pPr>
+      <w:r>
+        <w:t xml:space="preserve">Figure </w:t>
+      </w:r>
+      <w:fldSimple w:instr=" SEQ Figure \* ARABIC ">
+        <w:r>
+          <w:rPr>
+            <w:noProof/>
+          </w:rPr>
+          <w:t>5</w:t>
+        </w:r>
+      </w:fldSimple>
+      <w:r>
+        <w:t>: Public User Profile</w:t>
+      </w:r>
+    </w:p>
     <w:p/>
     <w:p>
       <w:r>
@@ -2214,14 +2278,18 @@
       </w:r>
     </w:p>
     <w:p>
+      <w:pPr>
+        <w:keepNext/>
+        <w:jc w:val="center"/>
+      </w:pPr>
       <w:r>
         <w:rPr>
           <w:noProof/>
         </w:rPr>
         <w:drawing>
-          <wp:inline distT="0" distB="0" distL="0" distR="0" wp14:anchorId="7FBADC50" wp14:editId="461E880B">
-            <wp:extent cx="5715000" cy="2491740"/>
-            <wp:effectExtent l="0" t="0" r="0" b="3810"/>
+          <wp:inline distT="0" distB="0" distL="0" distR="0" wp14:anchorId="7FBADC50" wp14:editId="3BCAA872">
+            <wp:extent cx="4711959" cy="2054414"/>
+            <wp:effectExtent l="0" t="0" r="0" b="3175"/>
             <wp:docPr id="80259576" name="Picture 8"/>
             <wp:cNvGraphicFramePr>
               <a:graphicFrameLocks xmlns:a="http://schemas.openxmlformats.org/drawingml/2006/main" noChangeAspect="1"/>
@@ -2251,7 +2319,7 @@
                   <pic:spPr bwMode="auto">
                     <a:xfrm>
                       <a:off x="0" y="0"/>
-                      <a:ext cx="5715000" cy="2491740"/>
+                      <a:ext cx="4733571" cy="2063837"/>
                     </a:xfrm>
                     <a:prstGeom prst="rect">
                       <a:avLst/>
@@ -2268,6 +2336,26 @@
         </w:drawing>
       </w:r>
     </w:p>
+    <w:p>
+      <w:pPr>
+        <w:pStyle w:val="Caption"/>
+        <w:jc w:val="center"/>
+      </w:pPr>
+      <w:r>
+        <w:t xml:space="preserve">Figure </w:t>
+      </w:r>
+      <w:fldSimple w:instr=" SEQ Figure \* ARABIC ">
+        <w:r>
+          <w:rPr>
+            <w:noProof/>
+          </w:rPr>
+          <w:t>6</w:t>
+        </w:r>
+      </w:fldSimple>
+      <w:r>
+        <w:t>: Online available Users</w:t>
+      </w:r>
+    </w:p>
     <w:p/>
     <w:p>
       <w:r>
@@ -2280,15 +2368,18 @@
       </w:r>
     </w:p>
     <w:p>
+      <w:pPr>
+        <w:keepNext/>
+        <w:jc w:val="center"/>
+      </w:pPr>
       <w:r>
         <w:rPr>
           <w:noProof/>
         </w:rPr>
-        <w:lastRenderedPageBreak/>
         <w:drawing>
-          <wp:inline distT="0" distB="0" distL="0" distR="0" wp14:anchorId="5DD16932" wp14:editId="0996CD99">
-            <wp:extent cx="2026920" cy="1559904"/>
-            <wp:effectExtent l="0" t="0" r="0" b="2540"/>
+          <wp:inline distT="0" distB="0" distL="0" distR="0" wp14:anchorId="5DD16932" wp14:editId="31930318">
+            <wp:extent cx="3348990" cy="1940767"/>
+            <wp:effectExtent l="0" t="0" r="3810" b="2540"/>
             <wp:docPr id="771333750" name="Picture 9"/>
             <wp:cNvGraphicFramePr>
               <a:graphicFrameLocks xmlns:a="http://schemas.openxmlformats.org/drawingml/2006/main" noChangeAspect="1"/>
@@ -2318,7 +2409,7 @@
                   <pic:spPr bwMode="auto">
                     <a:xfrm>
                       <a:off x="0" y="0"/>
-                      <a:ext cx="2056573" cy="1582725"/>
+                      <a:ext cx="3447356" cy="1997771"/>
                     </a:xfrm>
                     <a:prstGeom prst="rect">
                       <a:avLst/>
@@ -2334,14 +2425,40 @@
           </wp:inline>
         </w:drawing>
       </w:r>
+    </w:p>
+    <w:p>
+      <w:pPr>
+        <w:pStyle w:val="Caption"/>
+        <w:jc w:val="center"/>
+      </w:pPr>
+      <w:r>
+        <w:t xml:space="preserve">Figure </w:t>
+      </w:r>
+      <w:fldSimple w:instr=" SEQ Figure \* ARABIC ">
+        <w:r>
+          <w:rPr>
+            <w:noProof/>
+          </w:rPr>
+          <w:t>7</w:t>
+        </w:r>
+      </w:fldSimple>
+      <w:r>
+        <w:t>: One particular 'Waiting Time Slogan'</w:t>
+      </w:r>
+    </w:p>
+    <w:p>
+      <w:pPr>
+        <w:keepNext/>
+        <w:jc w:val="center"/>
+      </w:pPr>
       <w:r>
         <w:rPr>
           <w:noProof/>
         </w:rPr>
         <w:drawing>
-          <wp:inline distT="0" distB="0" distL="0" distR="0" wp14:anchorId="15D688D8" wp14:editId="207CAE72">
-            <wp:extent cx="2103120" cy="1542064"/>
-            <wp:effectExtent l="0" t="0" r="0" b="1270"/>
+          <wp:inline distT="0" distB="0" distL="0" distR="0" wp14:anchorId="15D688D8" wp14:editId="2E562C97">
+            <wp:extent cx="3349625" cy="1978090"/>
+            <wp:effectExtent l="0" t="0" r="3175" b="3175"/>
             <wp:docPr id="428764753" name="Picture 10"/>
             <wp:cNvGraphicFramePr>
               <a:graphicFrameLocks xmlns:a="http://schemas.openxmlformats.org/drawingml/2006/main" noChangeAspect="1"/>
@@ -2371,7 +2488,7 @@
                   <pic:spPr bwMode="auto">
                     <a:xfrm>
                       <a:off x="0" y="0"/>
-                      <a:ext cx="2117502" cy="1552609"/>
+                      <a:ext cx="3419011" cy="2019065"/>
                     </a:xfrm>
                     <a:prstGeom prst="rect">
                       <a:avLst/>
@@ -2389,8 +2506,23 @@
       </w:r>
     </w:p>
     <w:p>
-      <w:r>
-        <w:t>One particular “waiting                    Generated Icebreakers for                                                                                                                   time slogan”                                         this profile</w:t>
+      <w:pPr>
+        <w:pStyle w:val="Caption"/>
+        <w:jc w:val="center"/>
+      </w:pPr>
+      <w:r>
+        <w:t xml:space="preserve">Figure </w:t>
+      </w:r>
+      <w:fldSimple w:instr=" SEQ Figure \* ARABIC ">
+        <w:r>
+          <w:rPr>
+            <w:noProof/>
+          </w:rPr>
+          <w:t>8</w:t>
+        </w:r>
+      </w:fldSimple>
+      <w:r>
+        <w:t>: Generated Icebreakers for this Profile</w:t>
       </w:r>
     </w:p>
     <w:p/>
@@ -2400,10 +2532,15 @@
       </w:r>
     </w:p>
     <w:p>
+      <w:pPr>
+        <w:keepNext/>
+        <w:jc w:val="center"/>
+      </w:pPr>
       <w:r>
         <w:rPr>
           <w:noProof/>
         </w:rPr>
+        <w:lastRenderedPageBreak/>
         <w:drawing>
           <wp:inline distT="0" distB="0" distL="0" distR="0" wp14:anchorId="604A8461" wp14:editId="45326542">
             <wp:extent cx="3497580" cy="2255753"/>
@@ -2455,433 +2592,969 @@
       </w:r>
     </w:p>
     <w:p>
-      <w:r>
-        <w:t xml:space="preserve">This is what the user sees afterwards, here all of his chats are displayed. When he selects a particular chat (like here with test3) he can see all exchanged messages along with timestamps for each message. The messages on the right hand side are the ones the user wrote him/herself the messages on the left hand side are the messages of the other participant. </w:t>
+      <w:pPr>
+        <w:pStyle w:val="Caption"/>
+        <w:jc w:val="center"/>
+      </w:pPr>
+      <w:r>
+        <w:t xml:space="preserve">Figure </w:t>
+      </w:r>
+      <w:fldSimple w:instr=" SEQ Figure \* ARABIC ">
+        <w:r>
+          <w:rPr>
+            <w:noProof/>
+          </w:rPr>
+          <w:t>9</w:t>
+        </w:r>
+      </w:fldSimple>
+      <w:r>
+        <w:t>: Chat Screen with E2EE</w:t>
+      </w:r>
+    </w:p>
+    <w:p>
+      <w:r>
+        <w:t xml:space="preserve">This is what the user sees afterwards, here all of his chats are displayed. When he selects a particular chat (like here with test3) he can see all exchanged messages along with timestamps for each message. The messages on the </w:t>
+      </w:r>
+      <w:proofErr w:type="gramStart"/>
+      <w:r>
+        <w:t>right hand</w:t>
+      </w:r>
+      <w:proofErr w:type="gramEnd"/>
+      <w:r>
+        <w:t xml:space="preserve"> side are the ones the user wrote him/herself the messages on the left hand side are the messages of the other participant. </w:t>
+      </w:r>
+    </w:p>
+    <w:p>
+      <w:pPr>
+        <w:pStyle w:val="Heading2"/>
+      </w:pPr>
+      <w:bookmarkStart w:id="4" w:name="_Toc189596645"/>
+      <w:r>
+        <w:t>High level implementation of the main components</w:t>
+      </w:r>
+      <w:bookmarkEnd w:id="4"/>
+    </w:p>
+    <w:p>
+      <w:pPr>
+        <w:pStyle w:val="Heading3"/>
+      </w:pPr>
+      <w:bookmarkStart w:id="5" w:name="_Toc189596646"/>
+      <w:r>
+        <w:t>AI feature</w:t>
+      </w:r>
+      <w:bookmarkEnd w:id="5"/>
+    </w:p>
+    <w:p>
+      <w:r>
+        <w:t>The feature is a fine-tuned version of the pretrained gpt2-medium model.</w:t>
+      </w:r>
+      <w:r>
+        <w:t xml:space="preserve"> In the following it will be described step-by-step</w:t>
+      </w:r>
+      <w:r>
+        <w:t xml:space="preserve"> how generative AIs work and how we can leverage that for our</w:t>
+      </w:r>
+      <w:r>
+        <w:t xml:space="preserve"> own</w:t>
+      </w:r>
+      <w:r>
+        <w:t xml:space="preserve"> purposes</w:t>
+      </w:r>
+      <w:r>
+        <w:t>.</w:t>
+      </w:r>
+      <w:r>
+        <w:t xml:space="preserve"> </w:t>
+      </w:r>
+    </w:p>
+    <w:p>
+      <w:r>
+        <w:rPr>
+          <w:b/>
+          <w:bCs/>
+        </w:rPr>
+        <w:t xml:space="preserve">Machine learning and neural networks                                                                                                                 </w:t>
+      </w:r>
+      <w:r>
+        <w:t xml:space="preserve">Most of the modern AI technology revolves around so called “neural networks”. The idea is that the </w:t>
+      </w:r>
+      <w:r>
+        <w:t xml:space="preserve">initial </w:t>
+      </w:r>
+      <w:r>
+        <w:t>input is split into much smaller features. For example, a picture may be split into pixels. These features are then multiplied by so called “weight</w:t>
+      </w:r>
+      <w:r>
+        <w:t>s</w:t>
+      </w:r>
+      <w:r>
+        <w:t xml:space="preserve">”, at first the values for these weights are random, this process can also be described as a matrix multiplication. Because many inputs (for example multiple pictures each with 1000 pixels for instance) are multiplied by a variety of weights. (The height of the input matrix may be the number of pictures and the width the number of pixels). </w:t>
+      </w:r>
+      <w:r>
+        <w:t>Each output from the matrix multiplication (weights × inputs) is called a pre-activation. A bias term is added to each pre-activation, acting as a learnable offset that adjusts the neuron’s sensitivity. The result is then passed through a non-linear activation function (e.g., ReLU), which returns 0 for negative inputs and the input itself for positive values. This final output is called the neuron’s activation, loosely inspired by biological neurons that ‘fire’ when their input crosses a threshold.</w:t>
+      </w:r>
+      <w:r>
+        <w:t xml:space="preserve"> This described process is then repeated x times. At last, there is an output, also called a “prediction”, (for example there may be 10 outputs representing the numbers 0-9</w:t>
+      </w:r>
+      <w:r>
+        <w:t>,</w:t>
+      </w:r>
+      <w:r>
+        <w:t xml:space="preserve"> the neuron with the highest number at the </w:t>
+      </w:r>
+      <w:r>
+        <w:lastRenderedPageBreak/>
+        <w:t xml:space="preserve">end represents the predicted number by the neural network). As expected at first this expected output will not make any sense but that is why we need to train the AI. In the training process we know the desired output for each </w:t>
+      </w:r>
+      <w:r>
+        <w:t xml:space="preserve">input. We then compare each predicted output with the actual output. We can use functions like mean squared error, to estimate how bad the prediction actually is and then build an estimate of all predictions. But since the prediction depends on the weights which can be changed, </w:t>
+      </w:r>
+      <w:r>
+        <w:t>the</w:t>
+      </w:r>
+      <w:r>
+        <w:t xml:space="preserve"> weights can be seen as variables and the average</w:t>
+      </w:r>
+      <w:r>
+        <w:t>, the</w:t>
+      </w:r>
+      <w:r>
+        <w:t xml:space="preserve"> so called “loss” is the outcome of a function with these variables. Since now the whole system can be described as multi-dimensional function, we can also find a minimum for it (could also be a local minimum). But in this context a minimum would correspond to a system which makes the</w:t>
+      </w:r>
+      <w:r>
+        <w:t xml:space="preserve"> (mostly)</w:t>
+      </w:r>
+      <w:r>
+        <w:t xml:space="preserve"> correct prediction, this is our desired outcome. But how do we find this minimum, in </w:t>
+      </w:r>
+      <w:r>
+        <w:t xml:space="preserve">calculus we learned that functions have derivatives which describe the slope of the function, and a multi-dimensional function has a </w:t>
+      </w:r>
+      <w:r>
+        <w:t xml:space="preserve"> </w:t>
+      </w:r>
+      <w:r>
+        <w:t>gradient, the derivatives with respect to all variables, this gradient points into the direction of the steepest slope, if we were to go into the opposite direction of said gradient we can find a minimum. This is what backpropagation is all about. We calculate the derivative</w:t>
+      </w:r>
+      <w:r>
+        <w:t>s</w:t>
+      </w:r>
+      <w:r>
+        <w:t xml:space="preserve"> for all the weights and subtract that from the current weights. This is the basis for basically all modern AI models. </w:t>
+      </w:r>
+      <w:r>
+        <w:t xml:space="preserve">   </w:t>
+      </w:r>
+    </w:p>
+    <w:p>
+      <w:r>
+        <w:rPr>
+          <w:b/>
+          <w:bCs/>
+        </w:rPr>
+        <w:t>Generative AI Models</w:t>
+      </w:r>
+      <w:r>
+        <w:t xml:space="preserve">                                                                                                                                                 </w:t>
+      </w:r>
+      <w:r>
+        <w:t>New models took this idea and refined it for their needs</w:t>
+      </w:r>
+      <w:r>
+        <w:t xml:space="preserve">, as computational power rose, the models could also become more complex and nuanced, the </w:t>
+      </w:r>
+      <w:r>
+        <w:t>so-called</w:t>
+      </w:r>
+      <w:r>
+        <w:t xml:space="preserve"> transformer model used by ChatGPT was born</w:t>
+      </w:r>
+      <w:r>
+        <w:t xml:space="preserve">. How does that work? ChatGPT takes an input of words, it then maps these words </w:t>
+      </w:r>
+      <w:r>
+        <w:t>or</w:t>
+      </w:r>
+      <w:r>
+        <w:t xml:space="preserve"> tokens (tokens do not necessarily have to be words) into vectors. These vectors go through many layers of layers of multiplications and a</w:t>
+      </w:r>
+      <w:r>
+        <w:t>t</w:t>
+      </w:r>
+      <w:r>
+        <w:t xml:space="preserve"> last these vectors are used to predict a </w:t>
+      </w:r>
+      <w:r>
+        <w:t>subsequent vector; this is the quintessence of generative AI models like ChatGPT. This new sentence will then form the next input to then predict the yet next vector, this is repeated until a response is formed. Especially notable is the “Attention” model</w:t>
+      </w:r>
+      <w:r>
+        <w:rPr>
+          <w:rStyle w:val="FootnoteReference"/>
+        </w:rPr>
+        <w:footnoteReference w:id="2"/>
+      </w:r>
+      <w:r>
+        <w:t xml:space="preserve">, used in between mapping the tokens into vectors and then using the vectors to predict the next. </w:t>
+      </w:r>
+      <w:r>
+        <w:t>To put it simply each of the sentence’s token’s embeddings (the vectors) is mapped into query, key and value vectors using matrices. Then the dot product of all key and query vector</w:t>
+      </w:r>
+      <w:r>
+        <w:t>s</w:t>
+      </w:r>
+      <w:r>
+        <w:t xml:space="preserve"> is computed</w:t>
+      </w:r>
+      <w:r>
+        <w:t xml:space="preserve"> and then divided by the square root of the dimension size of the vectors (for scaling)</w:t>
+      </w:r>
+      <w:r>
+        <w:t xml:space="preserve">, this is put into softmax (a function scaling all values between 0 and 1) to find out the </w:t>
+      </w:r>
+      <w:r>
+        <w:t>probability distribution of the results.</w:t>
+      </w:r>
+      <w:r>
+        <w:t xml:space="preserve"> (</w:t>
+      </w:r>
+      <w:r>
+        <w:t>a high probability means a strong relevance between tokens</w:t>
+      </w:r>
+      <w:r>
+        <w:t xml:space="preserve">). This in turn is multiplied by the value vectors; by learning how closely each of the embedding vectors are, the AI can learn the structure of the sentences. If the AI models is fed with a lot of sentences and information, it could thus, learn its structure and reproduce it. This is the </w:t>
+      </w:r>
+      <w:r>
+        <w:lastRenderedPageBreak/>
+        <w:t xml:space="preserve">magic behind how ChatGPT is able to predict the next word for an input. </w:t>
+      </w:r>
+      <w:r>
+        <w:t xml:space="preserve">(A few important aspects to mention are generative AI models often use Gelu instead of Relu and a cross-entropy loss instead of the mean squared error; masked self-attention is also important so that no “future” tokens are used when predicting the next token during training. Lastly, </w:t>
+      </w:r>
+      <w:r>
+        <w:t xml:space="preserve">the model </w:t>
+      </w:r>
+      <w:r>
+        <w:t>uses positional embeddings so that vectors have their initial position in the sentence encoded).</w:t>
+      </w:r>
+      <w:r>
+        <w:t xml:space="preserve"> </w:t>
+      </w:r>
+    </w:p>
+    <w:p>
+      <w:r>
+        <w:rPr>
+          <w:b/>
+          <w:bCs/>
+        </w:rPr>
+        <w:t>O</w:t>
+      </w:r>
+      <w:r>
+        <w:rPr>
+          <w:b/>
+          <w:bCs/>
+        </w:rPr>
+        <w:t xml:space="preserve">ur </w:t>
+      </w:r>
+      <w:r>
+        <w:rPr>
+          <w:b/>
+          <w:bCs/>
+        </w:rPr>
+        <w:t xml:space="preserve">fine-tuned </w:t>
+      </w:r>
+      <w:r>
+        <w:rPr>
+          <w:b/>
+          <w:bCs/>
+        </w:rPr>
+        <w:t>model</w:t>
+      </w:r>
+      <w:r>
+        <w:t xml:space="preserve"> </w:t>
+      </w:r>
+      <w:r>
+        <w:t xml:space="preserve"> </w:t>
+      </w:r>
+      <w:r>
+        <w:t xml:space="preserve">                                                                                                                                                                                           </w:t>
+      </w:r>
+      <w:r>
+        <w:t xml:space="preserve">With this knowledge our use of the gpt2-medium model can be explained. We wanted the model to learn the structure of user profiles and corresponding “icebreakers”, thus, we had to create 200-300 of these examples. (For professional purposes a lot more a needed). These are then fed into the </w:t>
+      </w:r>
+      <w:r>
+        <w:t xml:space="preserve">gpt2-medium model to learn the relationship between the profiles and the icebreakers. We used a pretrained model, because, without a pretrained model, gpt2-medium would have no knowledge of grammar or sentence structure and a lot more than 200-300 examples would have been needed to train the model. Now that we understood how the model works it also makes sense why feeding the model the following structure for learning would not bring any result: “Profile A- Icebreaker 1; Profile A- Icebreaker 2...”. For someone not understanding how the attention mechanism works this may seem </w:t>
+      </w:r>
+      <w:r>
+        <w:t>like</w:t>
+      </w:r>
+      <w:r>
+        <w:t xml:space="preserve"> a way of teaching gpt2-medium the different possibilities for icebreakers for a given user profile. But now we know that this will no work as the model will learn contradicting relationships between the tokens and would not be able to produce valid output. Thus, a better structure would be “Profile A- Icebreaker 1- Icebreaker 2.... Profile B- Icebreaker 1....”. With this structure the model will learn all icebreakers corresponding to one user profile. This learned knowledge is then captured in its updated weights, these are used to then predict several icebreakers for new profiles written by users of our app. This works pretty </w:t>
+      </w:r>
+      <w:r>
+        <w:t>well;</w:t>
+      </w:r>
+      <w:r>
+        <w:t xml:space="preserve"> the limitations of our fine-tuned model are discussed in the section “Challenges we have faced”. </w:t>
+      </w:r>
+    </w:p>
+    <w:p>
+      <w:pPr>
+        <w:pStyle w:val="Heading3"/>
+      </w:pPr>
+      <w:bookmarkStart w:id="6" w:name="_Toc189596647"/>
+      <w:r>
+        <w:t>End-to-end encryption</w:t>
+      </w:r>
+      <w:bookmarkEnd w:id="6"/>
+    </w:p>
+    <w:p>
+      <w:r>
+        <w:t xml:space="preserve">During the discussion, as to how this app shall look like, we derived that it is extremely important that each chat is end-to-end encrypted. The first reason is, that users may not want the server or the provider of the app to know the contents of their conversations </w:t>
+      </w:r>
+      <w:r>
+        <w:t>and secondly the messages are saved on servers, if they are stored as plaintext, an attacker hijacking the servers may find out all contents of each conversation. Therefore, we needed a way to prevent this. Upon creating an account, the user creates a passphrase and a magic number. The passphrase alongside the magic number is put into a hash function and only the hash value alongside the magic number (also called salt) is saved on the server. A hash function is used so that hash(p,m) = x is easy but the reverse is computationally infeasible. Then in the frontend a new public/private key pair is generated. The private key is encrypted with passphrase to the power of magic number modulo 10^12+33.</w:t>
+      </w:r>
+      <w:r>
+        <w:t xml:space="preserve"> (A modulo value large enough, so that </w:t>
+      </w:r>
+      <w:r>
+        <w:lastRenderedPageBreak/>
+        <w:t>brute force attacks are infeasible).</w:t>
+      </w:r>
+      <w:r>
+        <w:t xml:space="preserve"> The keypair is then uploaded to the server. When starting a new chat, the </w:t>
+      </w:r>
+      <w:r>
+        <w:t>frontend</w:t>
+      </w:r>
+      <w:r>
+        <w:t xml:space="preserve"> retrieves the public key of the recipient (which is not encrypted) and generates a symmetric key, </w:t>
+      </w:r>
+      <w:r>
+        <w:t xml:space="preserve">then it </w:t>
+      </w:r>
+      <w:r>
+        <w:t>encrypts the first message with the symmetric key and then in turn encrypts the symmetric key twice. Once with his public key and once with the public key of the recipient.</w:t>
+      </w:r>
+      <w:r>
+        <w:t xml:space="preserve"> These encrypted symmetric keys are uploaded to the server.</w:t>
+      </w:r>
+      <w:r>
+        <w:t xml:space="preserve"> When</w:t>
+      </w:r>
+      <w:r>
+        <w:t xml:space="preserve"> the recipient logs into the website he/she has to type in the passphrase, the output hash is compared to the one stored on the server if they match, he/she is permitted to enter. His/her encrypted private key is fetched from the server, in the frontend the passphrase is used to decrypt it. Now he/she can go to the new chat. For this, the symmetric key (encrypted with this user’s public key) is fetched, the decrypted private key is used to decrypt the symmetric key, then the symmetric key is used to decrypt the new message. This lengthy process is only needed in the beginning, from the moment the user fetched the symmetric key for this chat, the key is saved in the local cache and used for encrypting/decrypting all messages during the session. (Referring to the period where the user uses our website</w:t>
+      </w:r>
+      <w:r>
+        <w:t xml:space="preserve">; </w:t>
+      </w:r>
+      <w:r>
+        <w:t xml:space="preserve">a session terminates, if a user is inactive or logs out). </w:t>
+      </w:r>
+    </w:p>
+    <w:p>
+      <w:pPr>
+        <w:pStyle w:val="Heading3"/>
+      </w:pPr>
+      <w:bookmarkStart w:id="7" w:name="_Toc189596648"/>
+      <w:r>
+        <w:t>Real-time chatting</w:t>
+      </w:r>
+      <w:bookmarkEnd w:id="7"/>
+    </w:p>
+    <w:p>
+      <w:r>
+        <w:t>The idea behind the chat feature was to create a seamless experience where there’s no lag during conversations, and users don’t have to click any button to refresh the chat. When someone sends a message, the recipient should see it instantly, without doing anything. This made it clear that a traditional request-response architecture wouldn’t work.</w:t>
+      </w:r>
+      <w:r>
+        <w:t xml:space="preserve"> </w:t>
+      </w:r>
+    </w:p>
+    <w:p>
+      <w:r>
+        <w:t xml:space="preserve">We started exploring other options and came across the publish-subscribe architecture. In this setup, an event automatically sends notifications to everyone subscribed to it. However, since we were working across two different platforms, implementing this wasn’t straightforward. After some research, we found a great solution </w:t>
+      </w:r>
+      <w:r>
+        <w:t>using WebSocket</w:t>
+      </w:r>
+      <w:r>
+        <w:t>.</w:t>
+      </w:r>
+    </w:p>
+    <w:p>
+      <w:r>
+        <w:t>Here’s how it works: every time a user starts a chat with someone, a queue is created specifically for th</w:t>
+      </w:r>
+      <w:r>
+        <w:t>e user</w:t>
+      </w:r>
+      <w:r>
+        <w:t>, and the user is subscribed to it. The queues follow a standard structure, like user/queue/{username}/messages. This consistency allows the server to automatically create queues even if they don’t already exist.</w:t>
+      </w:r>
+    </w:p>
+    <w:p>
+      <w:r>
+        <w:t xml:space="preserve">When a message is sent, it goes to the server, which then publishes it to the relevant queue </w:t>
+      </w:r>
+      <w:r>
+        <w:t xml:space="preserve">of recipient </w:t>
+      </w:r>
+      <w:r>
+        <w:t xml:space="preserve">without </w:t>
+      </w:r>
+      <w:r>
+        <w:t xml:space="preserve">him </w:t>
+      </w:r>
+      <w:r>
+        <w:t>needing to make a request. This way, the server acts as a middleman, simply forwarding the messages in real time while also saving them for future use.</w:t>
+      </w:r>
+    </w:p>
+    <w:p>
+      <w:r>
+        <w:t>This approach gave us a real-time chat system that works smoothly and could even support notifications in the future. Unfortunately, we had to skip adding notifications this time due to time constraints.</w:t>
+      </w:r>
+    </w:p>
+    <w:p>
+      <w:pPr>
+        <w:pStyle w:val="Heading3"/>
+      </w:pPr>
+      <w:bookmarkStart w:id="8" w:name="_Toc189596649"/>
+      <w:r>
+        <w:lastRenderedPageBreak/>
+        <w:t>Login and authentication</w:t>
+      </w:r>
+      <w:bookmarkEnd w:id="8"/>
+    </w:p>
+    <w:p>
+      <w:r>
+        <w:t>The microservices architecture was adopted throughout the development of our entire project. When implementing authentication and authorization, we had two options:</w:t>
+      </w:r>
+    </w:p>
+    <w:p>
+      <w:r>
+        <w:rPr>
+          <w:b/>
+          <w:bCs/>
+        </w:rPr>
+        <w:t>1.</w:t>
+      </w:r>
+      <w:r>
+        <w:rPr>
+          <w:b/>
+          <w:bCs/>
+        </w:rPr>
+        <w:t xml:space="preserve"> </w:t>
+      </w:r>
+      <w:r>
+        <w:rPr>
+          <w:b/>
+          <w:bCs/>
+        </w:rPr>
+        <w:t>Develop a custom authentication service from scratch and package it as a microservice</w:t>
+      </w:r>
+      <w:r>
+        <w:t>.</w:t>
+      </w:r>
+    </w:p>
+    <w:p>
+      <w:pPr>
+        <w:rPr>
+          <w:b/>
+          <w:bCs/>
+        </w:rPr>
+      </w:pPr>
+      <w:r>
+        <w:rPr>
+          <w:b/>
+          <w:bCs/>
+        </w:rPr>
+        <w:t>2.</w:t>
+      </w:r>
+      <w:r>
+        <w:rPr>
+          <w:b/>
+          <w:bCs/>
+        </w:rPr>
+        <w:t xml:space="preserve">  </w:t>
+      </w:r>
+      <w:r>
+        <w:rPr>
+          <w:b/>
+          <w:bCs/>
+        </w:rPr>
+        <w:t>Leverage an open-source authentication microservice to handle these tasks efficiently.</w:t>
+      </w:r>
+    </w:p>
+    <w:p>
+      <w:r>
+        <w:t xml:space="preserve">After evaluating our options, we decided to integrate </w:t>
+      </w:r>
+      <w:proofErr w:type="spellStart"/>
+      <w:r>
+        <w:t>Keycloak</w:t>
+      </w:r>
+      <w:proofErr w:type="spellEnd"/>
+      <w:r>
+        <w:t xml:space="preserve">, an open-source identity and access management solution. We containerized </w:t>
+      </w:r>
+      <w:proofErr w:type="spellStart"/>
+      <w:r>
+        <w:t>Keycloak</w:t>
+      </w:r>
+      <w:proofErr w:type="spellEnd"/>
+      <w:r>
+        <w:t xml:space="preserve"> using Docker, configuring it to listen on port 8081.</w:t>
+      </w:r>
+    </w:p>
+    <w:p>
+      <w:pPr>
+        <w:pStyle w:val="Heading4"/>
+      </w:pPr>
+      <w:r>
+        <w:t>Implementation Overview</w:t>
+      </w:r>
+    </w:p>
+    <w:p>
+      <w:r>
+        <w:t>The core functionality we implemented involves checking for an authentication token in every outgoing request to the backend. If a request lacks a valid token, the user is automatically redirected to the login page.</w:t>
+      </w:r>
+    </w:p>
+    <w:p>
+      <w:r>
+        <w:t>To handle this process efficiently, we used an interceptor in our code. If a user is logged in, the interceptor appends an authentication token to each request, ensuring the structure looks like:</w:t>
+      </w:r>
+    </w:p>
+    <w:p>
+      <w:pPr>
+        <w:pStyle w:val="p1"/>
+        <w:pBdr>
+          <w:top w:val="single" w:sz="4" w:space="1" w:color="auto"/>
+          <w:left w:val="single" w:sz="4" w:space="4" w:color="auto"/>
+          <w:bottom w:val="single" w:sz="4" w:space="1" w:color="auto"/>
+          <w:right w:val="single" w:sz="4" w:space="4" w:color="auto"/>
+          <w:between w:val="single" w:sz="4" w:space="1" w:color="auto"/>
+          <w:bar w:val="single" w:sz="4" w:color="auto"/>
+        </w:pBdr>
+        <w:jc w:val="center"/>
+        <w:rPr>
+          <w:b/>
+          <w:bCs/>
+          <w:sz w:val="28"/>
+          <w:szCs w:val="28"/>
+        </w:rPr>
+      </w:pPr>
+      <w:r>
+        <w:rPr>
+          <w:b/>
+          <w:bCs/>
+          <w:sz w:val="28"/>
+          <w:szCs w:val="28"/>
+        </w:rPr>
+        <w:t>request?</w:t>
+      </w:r>
+      <w:r>
+        <w:rPr>
+          <w:b/>
+          <w:bCs/>
+          <w:sz w:val="28"/>
+          <w:szCs w:val="28"/>
+        </w:rPr>
+        <w:t xml:space="preserve"> Auth = token</w:t>
+      </w:r>
+    </w:p>
+    <w:p>
+      <w:pPr>
+        <w:rPr>
+          <w:rFonts w:ascii="Times New Roman" w:eastAsia="Times New Roman" w:hAnsi="Times New Roman" w:cs="Times New Roman"/>
+          <w:kern w:val="0"/>
+          <w14:ligatures w14:val="none"/>
+        </w:rPr>
+      </w:pPr>
+      <w:r>
+        <w:rPr>
+          <w:rFonts w:ascii="Times New Roman" w:eastAsia="Times New Roman" w:hAnsi="Times New Roman" w:cs="Times New Roman"/>
+          <w:kern w:val="0"/>
+          <w14:ligatures w14:val="none"/>
+        </w:rPr>
+        <w:t xml:space="preserve">The backend then retrieves this token and forwards it to the </w:t>
+      </w:r>
+      <w:proofErr w:type="spellStart"/>
+      <w:r>
+        <w:rPr>
+          <w:rFonts w:ascii="Times New Roman" w:eastAsia="Times New Roman" w:hAnsi="Times New Roman" w:cs="Times New Roman"/>
+          <w:kern w:val="0"/>
+          <w14:ligatures w14:val="none"/>
+        </w:rPr>
+        <w:t>Keycloak</w:t>
+      </w:r>
+      <w:proofErr w:type="spellEnd"/>
+      <w:r>
+        <w:rPr>
+          <w:rFonts w:ascii="Times New Roman" w:eastAsia="Times New Roman" w:hAnsi="Times New Roman" w:cs="Times New Roman"/>
+          <w:kern w:val="0"/>
+          <w14:ligatures w14:val="none"/>
+        </w:rPr>
+        <w:t xml:space="preserve"> microservice for validation. If the token is verified as legitimate, </w:t>
+      </w:r>
+      <w:proofErr w:type="spellStart"/>
+      <w:r>
+        <w:rPr>
+          <w:rFonts w:ascii="Times New Roman" w:eastAsia="Times New Roman" w:hAnsi="Times New Roman" w:cs="Times New Roman"/>
+          <w:kern w:val="0"/>
+          <w14:ligatures w14:val="none"/>
+        </w:rPr>
+        <w:t>Keycloak</w:t>
+      </w:r>
+      <w:proofErr w:type="spellEnd"/>
+      <w:r>
+        <w:rPr>
+          <w:rFonts w:ascii="Times New Roman" w:eastAsia="Times New Roman" w:hAnsi="Times New Roman" w:cs="Times New Roman"/>
+          <w:kern w:val="0"/>
+          <w14:ligatures w14:val="none"/>
+        </w:rPr>
+        <w:t xml:space="preserve"> sends a green flag to the backend, which then processes the request and returns the appropriate response to the frontend.</w:t>
+      </w:r>
+    </w:p>
+    <w:p>
+      <w:pPr>
+        <w:rPr>
+          <w:rFonts w:ascii="Times New Roman" w:eastAsia="Times New Roman" w:hAnsi="Times New Roman" w:cs="Times New Roman"/>
+          <w:kern w:val="0"/>
+          <w14:ligatures w14:val="none"/>
+        </w:rPr>
+      </w:pPr>
+      <w:r>
+        <w:rPr>
+          <w:rFonts w:ascii="Times New Roman" w:eastAsia="Times New Roman" w:hAnsi="Times New Roman" w:cs="Times New Roman"/>
+          <w:kern w:val="0"/>
+          <w14:ligatures w14:val="none"/>
+        </w:rPr>
+        <w:t xml:space="preserve"> </w:t>
+      </w:r>
+    </w:p>
+    <w:p>
+      <w:pPr>
+        <w:pStyle w:val="Heading4"/>
+        <w:rPr>
+          <w:rFonts w:eastAsia="Times New Roman"/>
+        </w:rPr>
+      </w:pPr>
+      <w:r>
+        <w:rPr>
+          <w:rFonts w:eastAsia="Times New Roman"/>
+        </w:rPr>
+        <w:t xml:space="preserve">Overview of </w:t>
+      </w:r>
+      <w:r>
+        <w:rPr>
+          <w:rFonts w:eastAsia="Times New Roman"/>
+        </w:rPr>
+        <w:t xml:space="preserve">Authentication </w:t>
+      </w:r>
+      <w:r>
+        <w:rPr>
+          <w:rFonts w:eastAsia="Times New Roman"/>
+        </w:rPr>
+        <w:t>Architecture</w:t>
+      </w:r>
+    </w:p>
+    <w:p>
+      <w:pPr>
+        <w:pStyle w:val="Heading4"/>
+        <w:jc w:val="center"/>
+      </w:pPr>
+      <w:r>
+        <w:rPr>
+          <w:noProof/>
+        </w:rPr>
+        <w:drawing>
+          <wp:inline distT="0" distB="0" distL="0" distR="0" wp14:anchorId="0464CD0A" wp14:editId="415E7C01">
+            <wp:extent cx="4250661" cy="2480441"/>
+            <wp:effectExtent l="0" t="0" r="0" b="0"/>
+            <wp:docPr id="1273475925" name="Picture 2" descr="A computer screen shot of a diagram&#10;&#10;AI-generated content may be incorrect."/>
+            <wp:cNvGraphicFramePr>
+              <a:graphicFrameLocks xmlns:a="http://schemas.openxmlformats.org/drawingml/2006/main" noChangeAspect="1"/>
+            </wp:cNvGraphicFramePr>
+            <a:graphic xmlns:a="http://schemas.openxmlformats.org/drawingml/2006/main">
+              <a:graphicData uri="http://schemas.openxmlformats.org/drawingml/2006/picture">
+                <pic:pic xmlns:pic="http://schemas.openxmlformats.org/drawingml/2006/picture">
+                  <pic:nvPicPr>
+                    <pic:cNvPr id="1273475925" name="Picture 2" descr="A computer screen shot of a diagram&#10;&#10;AI-generated content may be incorrect."/>
+                    <pic:cNvPicPr/>
+                  </pic:nvPicPr>
+                  <pic:blipFill rotWithShape="1">
+                    <a:blip r:embed="rId17" cstate="print">
+                      <a:extLst>
+                        <a:ext uri="{28A0092B-C50C-407E-A947-70E740481C1C}">
+                          <a14:useLocalDpi xmlns:a14="http://schemas.microsoft.com/office/drawing/2010/main" val="0"/>
+                        </a:ext>
+                      </a:extLst>
+                    </a:blip>
+                    <a:srcRect l="18733" t="14883" r="18945" b="20463"/>
+                    <a:stretch/>
+                  </pic:blipFill>
+                  <pic:spPr bwMode="auto">
+                    <a:xfrm>
+                      <a:off x="0" y="0"/>
+                      <a:ext cx="4416392" cy="2577152"/>
+                    </a:xfrm>
+                    <a:prstGeom prst="rect">
+                      <a:avLst/>
+                    </a:prstGeom>
+                    <a:ln>
+                      <a:noFill/>
+                    </a:ln>
+                    <a:extLst>
+                      <a:ext uri="{53640926-AAD7-44D8-BBD7-CCE9431645EC}">
+                        <a14:shadowObscured xmlns:a14="http://schemas.microsoft.com/office/drawing/2010/main"/>
+                      </a:ext>
+                    </a:extLst>
+                  </pic:spPr>
+                </pic:pic>
+              </a:graphicData>
+            </a:graphic>
+          </wp:inline>
+        </w:drawing>
+      </w:r>
+    </w:p>
+    <w:p>
+      <w:pPr>
+        <w:pStyle w:val="Caption"/>
+        <w:jc w:val="center"/>
+      </w:pPr>
+      <w:r>
+        <w:t xml:space="preserve">Figure </w:t>
+      </w:r>
+      <w:fldSimple w:instr=" SEQ Figure \* ARABIC ">
+        <w:r>
+          <w:rPr>
+            <w:noProof/>
+          </w:rPr>
+          <w:t>10</w:t>
+        </w:r>
+      </w:fldSimple>
+      <w:r>
+        <w:t xml:space="preserve">: </w:t>
+      </w:r>
+      <w:r>
+        <w:t xml:space="preserve">Figure 10: System Architecture for Authentication and Authorization Using </w:t>
+      </w:r>
+      <w:proofErr w:type="spellStart"/>
+      <w:r>
+        <w:t>Keycloak</w:t>
+      </w:r>
+      <w:proofErr w:type="spellEnd"/>
+    </w:p>
+    <w:p/>
+    <w:p>
+      <w:pPr>
+        <w:pStyle w:val="Heading3"/>
+      </w:pPr>
+      <w:bookmarkStart w:id="9" w:name="_Toc189596650"/>
+      <w:r>
+        <w:t>Search users</w:t>
+      </w:r>
+      <w:bookmarkEnd w:id="9"/>
+      <w:r>
+        <w:t xml:space="preserve"> </w:t>
       </w:r>
     </w:p>
     <w:p/>
     <w:p/>
+    <w:p>
+      <w:pPr>
+        <w:pStyle w:val="Heading3"/>
+      </w:pPr>
+      <w:bookmarkStart w:id="10" w:name="_Toc189596651"/>
+      <w:r>
+        <w:t>“Available” user overview</w:t>
+      </w:r>
+      <w:bookmarkEnd w:id="10"/>
+      <w:r>
+        <w:t xml:space="preserve"> </w:t>
+      </w:r>
+    </w:p>
+    <w:p>
+      <w:r>
+        <w:t>For the See All Users component, we have been following the five main principles of Object-Oriented Programming (OOP). The key features we adhered to are modularity, non-repetitiveness, and extensibility, while ensuring that modifications are minimized.</w:t>
+      </w:r>
+    </w:p>
+    <w:p>
+      <w:r>
+        <w:t xml:space="preserve">The backend is responsible for providing a list of all users, excluding the currently logged-in user. Specifically, it returns only those online users whom the logged-in user has not yet chatted with. A crucial principle we followed was not requesting any unnecessary data from the backend, ensuring efficiency and optimized </w:t>
+      </w:r>
+      <w:r>
+        <w:t>performance.</w:t>
+      </w:r>
+    </w:p>
+    <w:p>
+      <w:r>
+        <w:t>To achieve this, we used a Data Transfer Object (DTO) structure for displaying users:</w:t>
+      </w:r>
+    </w:p>
+    <w:p>
+      <w:pPr>
+        <w:jc w:val="center"/>
+        <w:rPr>
+          <w:b/>
+          <w:bCs/>
+        </w:rPr>
+      </w:pPr>
+      <w:proofErr w:type="spellStart"/>
+      <w:r>
+        <w:rPr>
+          <w:b/>
+          <w:bCs/>
+        </w:rPr>
+        <w:t>AvailableUserDTO</w:t>
+      </w:r>
+      <w:proofErr w:type="spellEnd"/>
+      <w:r>
+        <w:rPr>
+          <w:b/>
+          <w:bCs/>
+        </w:rPr>
+        <w:t>=</w:t>
+      </w:r>
+      <w:proofErr w:type="gramStart"/>
+      <w:r>
+        <w:rPr>
+          <w:b/>
+          <w:bCs/>
+        </w:rPr>
+        <w:t xml:space="preserve"> </w:t>
+      </w:r>
+      <w:r>
+        <w:rPr>
+          <w:b/>
+          <w:bCs/>
+        </w:rPr>
+        <w:t xml:space="preserve"> </w:t>
+      </w:r>
+      <w:r>
+        <w:rPr>
+          <w:b/>
+          <w:bCs/>
+        </w:rPr>
+        <w:t xml:space="preserve"> [</w:t>
+      </w:r>
+      <w:proofErr w:type="gramEnd"/>
+      <w:r>
+        <w:rPr>
+          <w:b/>
+          <w:bCs/>
+        </w:rPr>
+        <w:t>id;</w:t>
+      </w:r>
+      <w:r>
+        <w:rPr>
+          <w:b/>
+          <w:bCs/>
+        </w:rPr>
+        <w:t xml:space="preserve"> username </w:t>
+      </w:r>
+      <w:r>
+        <w:rPr>
+          <w:b/>
+          <w:bCs/>
+        </w:rPr>
+        <w:t>;</w:t>
+      </w:r>
+      <w:r>
+        <w:rPr>
+          <w:b/>
+          <w:bCs/>
+        </w:rPr>
+        <w:t xml:space="preserve"> </w:t>
+      </w:r>
+      <w:proofErr w:type="spellStart"/>
+      <w:r>
+        <w:rPr>
+          <w:b/>
+          <w:bCs/>
+        </w:rPr>
+        <w:t>profilePhoto</w:t>
+      </w:r>
+      <w:proofErr w:type="spellEnd"/>
+      <w:r>
+        <w:rPr>
+          <w:b/>
+          <w:bCs/>
+        </w:rPr>
+        <w:t xml:space="preserve"> </w:t>
+      </w:r>
+      <w:r>
+        <w:rPr>
+          <w:b/>
+          <w:bCs/>
+        </w:rPr>
+        <w:t>;</w:t>
+      </w:r>
+      <w:r>
+        <w:rPr>
+          <w:b/>
+          <w:bCs/>
+        </w:rPr>
+        <w:t xml:space="preserve"> </w:t>
+      </w:r>
+      <w:r>
+        <w:rPr>
+          <w:b/>
+          <w:bCs/>
+        </w:rPr>
+        <w:t>bio;</w:t>
+      </w:r>
+      <w:r>
+        <w:rPr>
+          <w:b/>
+          <w:bCs/>
+        </w:rPr>
+        <w:t xml:space="preserve"> </w:t>
+      </w:r>
+      <w:r>
+        <w:rPr>
+          <w:b/>
+          <w:bCs/>
+        </w:rPr>
+        <w:t>status</w:t>
+      </w:r>
+      <w:r>
+        <w:rPr>
+          <w:b/>
+          <w:bCs/>
+        </w:rPr>
+        <w:t xml:space="preserve"> ]</w:t>
+      </w:r>
+    </w:p>
+    <w:p>
+      <w:r>
+        <w:t>This DTO contains only the essential information needed for the frontend, avoiding unnecessary data transmissio</w:t>
+      </w:r>
+      <w:r>
+        <w:t>n. Then, ea</w:t>
+      </w:r>
+      <w:r>
+        <w:t>ch user’s details are compiled into a card component, which is then dynamically rendered on the screen using a loop. This approach eliminates the need to manually create individual user cards, saving both development time and effort while maintaining scalability.</w:t>
+      </w:r>
+    </w:p>
     <w:p/>
     <w:p/>
-    <w:p/>
-    <w:p/>
-    <w:p/>
+    <w:p>
+      <w:pPr>
+        <w:pStyle w:val="Heading1"/>
+      </w:pPr>
+      <w:bookmarkStart w:id="11" w:name="_Toc189596652"/>
+      <w:r>
+        <w:lastRenderedPageBreak/>
+        <w:t>Architecture</w:t>
+      </w:r>
+      <w:bookmarkEnd w:id="11"/>
+    </w:p>
     <w:p>
       <w:pPr>
         <w:pStyle w:val="Heading2"/>
       </w:pPr>
-      <w:bookmarkStart w:id="4" w:name="_Toc189313939"/>
-      <w:r>
-        <w:lastRenderedPageBreak/>
-        <w:t>High level implementation of the main components</w:t>
-      </w:r>
-      <w:bookmarkEnd w:id="4"/>
-    </w:p>
-    <w:p>
-      <w:pPr>
-        <w:pStyle w:val="Heading3"/>
-      </w:pPr>
-      <w:bookmarkStart w:id="5" w:name="_Toc189313940"/>
-      <w:r>
-        <w:t>AI feature</w:t>
-      </w:r>
-      <w:bookmarkEnd w:id="5"/>
-    </w:p>
-    <w:p>
-      <w:r>
-        <w:t>The feature is a fine-tuned version of the pretrained gpt2-medium model.</w:t>
-      </w:r>
-      <w:r>
-        <w:t xml:space="preserve"> In the following it will be described step-by-step</w:t>
-      </w:r>
-      <w:r>
-        <w:t xml:space="preserve"> how generative AIs work and how we can leverage that for our</w:t>
-      </w:r>
-      <w:r>
-        <w:t xml:space="preserve"> own</w:t>
-      </w:r>
-      <w:r>
-        <w:t xml:space="preserve"> purposes</w:t>
-      </w:r>
-      <w:r>
-        <w:t>.</w:t>
-      </w:r>
-      <w:r>
-        <w:t xml:space="preserve"> </w:t>
-      </w:r>
-    </w:p>
-    <w:p>
-      <w:r>
-        <w:rPr>
-          <w:b/>
-          <w:bCs/>
-        </w:rPr>
-        <w:t xml:space="preserve">Machine learning and neural networks                                                                                                                 </w:t>
-      </w:r>
-      <w:r>
-        <w:t xml:space="preserve">Most of the modern AI technology revolves around so called “neural networks”. The idea is that the </w:t>
-      </w:r>
-      <w:r>
-        <w:t xml:space="preserve">initial </w:t>
-      </w:r>
-      <w:r>
-        <w:t>input is split into much smaller features. For example, a picture may be split into pixels. These features are then multiplied by so called “weight</w:t>
-      </w:r>
-      <w:r>
-        <w:t>s</w:t>
-      </w:r>
-      <w:r>
-        <w:t xml:space="preserve">”, at first the values for these weights are random, this process can also be described as a matrix multiplication. Because many inputs (for example multiple pictures each with 1000 pixels for instance) are multiplied by a variety of weights. (The height of the input matrix may be the number of pictures and the width the number of pixels). </w:t>
-      </w:r>
-      <w:r>
-        <w:t xml:space="preserve">Each output from the matrix multiplication (weights × inputs) is called a pre-activation. A bias term is added to each pre-activation, acting as a learnable offset that adjusts the neuron’s sensitivity. The result is then passed through a non-linear activation function (e.g., </w:t>
-      </w:r>
-      <w:proofErr w:type="spellStart"/>
-      <w:r>
-        <w:t>ReLU</w:t>
-      </w:r>
-      <w:proofErr w:type="spellEnd"/>
-      <w:r>
-        <w:t>), which returns 0 for negative inputs and the input itself for positive values. This final output is called the neuron’s activation, loosely inspired by biological neurons that ‘fire’ when their input crosses a threshold.</w:t>
-      </w:r>
-      <w:r>
-        <w:t xml:space="preserve"> This described process is then repeated x times. At last, there is an output, also called a “prediction”, (for example there may be 10 outputs representing the numbers 0-9</w:t>
-      </w:r>
-      <w:r>
-        <w:t>,</w:t>
-      </w:r>
-      <w:r>
-        <w:t xml:space="preserve"> the neuron with the highest number at the end represents the predicted number by the neural network). As expected at first this expected output will not make any sense but that is why we need to train the AI. In the training process we know the desired output for each </w:t>
-      </w:r>
-      <w:r>
-        <w:t xml:space="preserve">input. We then compare each predicted output with the actual output. We can use functions like mean squared error, to estimate how bad the prediction actually is and then build an estimate of all predictions. But since the prediction depends on the weights which can be changed, </w:t>
-      </w:r>
-      <w:r>
-        <w:t>the</w:t>
-      </w:r>
-      <w:r>
-        <w:t xml:space="preserve"> weights can be seen as variables and the average</w:t>
-      </w:r>
-      <w:r>
-        <w:t>, the</w:t>
-      </w:r>
-      <w:r>
-        <w:t xml:space="preserve"> so called “loss” is the outcome of a function with these variables. Since now the whole system can be described as multi-dimensional function, we can also find a minimum for it (could also be a local minimum). But in this context a minimum would correspond to a system which makes the</w:t>
-      </w:r>
-      <w:r>
-        <w:t xml:space="preserve"> (mostly)</w:t>
-      </w:r>
-      <w:r>
-        <w:t xml:space="preserve"> correct prediction, this is our desired outcome. But how do we find this minimum, in </w:t>
-      </w:r>
-      <w:r>
-        <w:t xml:space="preserve">calculus we learned that functions have derivatives which describe the slope of the function, and a multi-dimensional function has a </w:t>
-      </w:r>
-      <w:r>
-        <w:t xml:space="preserve"> </w:t>
-      </w:r>
-      <w:r>
-        <w:t>gradient, the derivatives with respect to all variables, this gradient points into the direction of the steepest slope, if we were to go into the opposite direction of said gradient we can find a minimum. This is what backpropagation is all about. We calculate the derivative</w:t>
-      </w:r>
-      <w:r>
-        <w:t>s</w:t>
-      </w:r>
-      <w:r>
-        <w:t xml:space="preserve"> for all the weights and subtract that from the current weights. This is the basis for basically all modern AI models. </w:t>
-      </w:r>
-      <w:r>
-        <w:t xml:space="preserve">   </w:t>
-      </w:r>
-    </w:p>
-    <w:p>
-      <w:r>
-        <w:rPr>
-          <w:b/>
-          <w:bCs/>
-        </w:rPr>
-        <w:lastRenderedPageBreak/>
-        <w:t>Generative AI Models</w:t>
-      </w:r>
-      <w:r>
-        <w:t xml:space="preserve">                                                                                                                                                 </w:t>
-      </w:r>
-      <w:r>
-        <w:t>New models took this idea and refined it for their needs</w:t>
-      </w:r>
-      <w:r>
-        <w:t xml:space="preserve">, as computational power rose, the models could also become more complex and nuanced, the </w:t>
-      </w:r>
-      <w:r>
-        <w:t>so-called</w:t>
-      </w:r>
-      <w:r>
-        <w:t xml:space="preserve"> transformer model used by ChatGPT was born</w:t>
-      </w:r>
-      <w:r>
-        <w:t xml:space="preserve">. How does that work? ChatGPT takes an input of words, it then maps these words </w:t>
-      </w:r>
-      <w:r>
-        <w:t>or</w:t>
-      </w:r>
-      <w:r>
-        <w:t xml:space="preserve"> tokens (tokens do not necessarily have to be words) into vectors. These vectors go through many layers of layers of multiplications and a</w:t>
-      </w:r>
-      <w:r>
-        <w:t>t</w:t>
-      </w:r>
-      <w:r>
-        <w:t xml:space="preserve"> last these vectors are used to predict a </w:t>
-      </w:r>
-      <w:r>
-        <w:t>subsequent vector; this is the quintessence of generative AI models like ChatGPT. This new sentence will then form the next input to then predict the yet next vector, this is repeated until a response is formed. Especially notable is the “Attention” model</w:t>
-      </w:r>
-      <w:r>
-        <w:rPr>
-          <w:rStyle w:val="FootnoteReference"/>
-        </w:rPr>
-        <w:footnoteReference w:id="2"/>
-      </w:r>
-      <w:r>
-        <w:t xml:space="preserve">, used in between mapping the tokens into vectors and then using the vectors to predict the next. </w:t>
-      </w:r>
-      <w:r>
-        <w:t>To put it simply each of the sentence’s token’s embeddings (the vectors) is mapped into query, key and value vectors using matrices. Then the dot product of all key and query vector</w:t>
-      </w:r>
-      <w:r>
-        <w:t>s</w:t>
-      </w:r>
-      <w:r>
-        <w:t xml:space="preserve"> is computed</w:t>
-      </w:r>
-      <w:r>
-        <w:t xml:space="preserve"> and then divided by the square root of the dimension size of the vectors (for scaling)</w:t>
-      </w:r>
-      <w:r>
-        <w:t xml:space="preserve">, this is put into </w:t>
-      </w:r>
-      <w:proofErr w:type="spellStart"/>
-      <w:r>
-        <w:t>softmax</w:t>
-      </w:r>
-      <w:proofErr w:type="spellEnd"/>
-      <w:r>
-        <w:t xml:space="preserve"> (a function scaling all values between 0 and 1) to find out the </w:t>
-      </w:r>
-      <w:r>
-        <w:t>probability distribution of the results.</w:t>
-      </w:r>
-      <w:r>
-        <w:t xml:space="preserve"> (</w:t>
-      </w:r>
-      <w:r>
-        <w:t>a high probability means a strong relevance between tokens</w:t>
-      </w:r>
-      <w:r>
-        <w:t xml:space="preserve">). This in turn is multiplied by the value vectors; by learning how closely each of the embedding vectors are, the AI can learn the structure of the sentences. If the AI models is fed with a lot of sentences and information, it could thus, learn its structure and reproduce it. This is the magic behind how ChatGPT is able to predict the next word for an input. </w:t>
-      </w:r>
-      <w:r>
-        <w:t xml:space="preserve">(A few important aspects to mention are generative AI models often use Gelu instead of </w:t>
-      </w:r>
-      <w:proofErr w:type="spellStart"/>
-      <w:r>
-        <w:t>Relu</w:t>
-      </w:r>
-      <w:proofErr w:type="spellEnd"/>
-      <w:r>
-        <w:t xml:space="preserve"> and a cross-entropy loss instead of the mean squared error; masked self-attention is also important so that no “future” tokens are used when predicting the next token during training. Lastly, </w:t>
-      </w:r>
-      <w:r>
-        <w:t xml:space="preserve">the model </w:t>
-      </w:r>
-      <w:r>
-        <w:t>uses positional embeddings so that vectors have their initial position in the sentence encoded).</w:t>
-      </w:r>
-      <w:r>
-        <w:t xml:space="preserve"> </w:t>
-      </w:r>
-    </w:p>
-    <w:p>
-      <w:r>
-        <w:rPr>
-          <w:b/>
-          <w:bCs/>
-        </w:rPr>
-        <w:t>O</w:t>
-      </w:r>
-      <w:r>
-        <w:rPr>
-          <w:b/>
-          <w:bCs/>
-        </w:rPr>
-        <w:t xml:space="preserve">ur </w:t>
-      </w:r>
-      <w:r>
-        <w:rPr>
-          <w:b/>
-          <w:bCs/>
-        </w:rPr>
-        <w:t xml:space="preserve">fine-tuned </w:t>
-      </w:r>
-      <w:r>
-        <w:rPr>
-          <w:b/>
-          <w:bCs/>
-        </w:rPr>
-        <w:t>model</w:t>
-      </w:r>
-      <w:r>
-        <w:t xml:space="preserve"> </w:t>
-      </w:r>
-      <w:r>
-        <w:t xml:space="preserve"> </w:t>
-      </w:r>
-      <w:r>
-        <w:t xml:space="preserve">                                                                                                                                                                                           </w:t>
-      </w:r>
-      <w:r>
-        <w:t xml:space="preserve">With this knowledge our use of the gpt2-medium model can be explained. We wanted the model to learn the structure of user profiles and corresponding “icebreakers”, thus, we had to create 200-300 of these examples. (For professional purposes a lot more a needed). These are then fed into the </w:t>
-      </w:r>
-      <w:r>
-        <w:t xml:space="preserve">gpt2-medium model to learn the relationship between the profiles and the icebreakers. We used a pretrained model, because, without a pretrained model, gpt2-medium would have no knowledge of grammar or sentence structure and a lot more than 200-300 examples would have been needed to train the model. Now that we understood how the model works it also makes sense why feeding the model the following structure for learning would not bring any result: “Profile A- Icebreaker 1; Profile A- Icebreaker 2...”. For someone not understanding how the attention mechanism works this may seem </w:t>
-      </w:r>
-      <w:r>
-        <w:t>like</w:t>
-      </w:r>
-      <w:r>
-        <w:t xml:space="preserve"> a way of teaching gpt2-medium the </w:t>
-      </w:r>
-      <w:r>
-        <w:lastRenderedPageBreak/>
-        <w:t xml:space="preserve">different possibilities for icebreakers for a given user profile. But now we know that this will no work as the model will learn contradicting relationships between the tokens and would not be able to produce valid output. Thus, a better structure would be “Profile A- Icebreaker 1- Icebreaker 2.... Profile B- Icebreaker 1....”. With this structure the model will learn all icebreakers corresponding to one user profile. This learned knowledge is then captured in its updated weights, these are used to then predict several icebreakers for new profiles written by users of our app. This works pretty </w:t>
-      </w:r>
-      <w:r>
-        <w:t>well;</w:t>
-      </w:r>
-      <w:r>
-        <w:t xml:space="preserve"> the limitations of our fine-tuned model are discussed in the section “Challenges we have faced”. </w:t>
-      </w:r>
-    </w:p>
-    <w:p>
-      <w:pPr>
-        <w:pStyle w:val="Heading3"/>
-      </w:pPr>
-      <w:bookmarkStart w:id="6" w:name="_Toc189313941"/>
-      <w:r>
-        <w:t>End-to-end encryption</w:t>
-      </w:r>
-      <w:bookmarkEnd w:id="6"/>
-    </w:p>
-    <w:p>
-      <w:r>
-        <w:t xml:space="preserve">During the discussion, as to how this app shall look like, we derived that it is extremely important that each chat is end-to-end encrypted. The first reason is, that users may not want the server or the provider of the app to know the contents of their conversations </w:t>
-      </w:r>
-      <w:r>
-        <w:t>and secondly the messages are saved on servers, if they are stored as plaintext, an attacker hijacking the servers may find out all contents of each conversation. Therefore, we needed a way to prevent this. Upon creating an account, the user creates a passphrase and a magic number. The passphrase alongside the magic number is put into a hash function and only the hash value alongside the magic number (also called salt) is saved on the server. A hash function is used so that hash(</w:t>
-      </w:r>
-      <w:proofErr w:type="spellStart"/>
-      <w:r>
-        <w:t>p,m</w:t>
-      </w:r>
-      <w:proofErr w:type="spellEnd"/>
-      <w:r>
-        <w:t>) = x is easy but the reverse is computationally infeasible. Then in the frontend a new public/private key pair is generated. The private key is encrypted with passphrase to the power of magic number modulo 10^12+33.</w:t>
-      </w:r>
-      <w:r>
-        <w:t xml:space="preserve"> (A modulo value large enough, so that brute force attacks are infeasible).</w:t>
-      </w:r>
-      <w:r>
-        <w:t xml:space="preserve"> The keypair is then uploaded to the server. When starting a new chat, the </w:t>
-      </w:r>
-      <w:r>
-        <w:t>frontend</w:t>
-      </w:r>
-      <w:r>
-        <w:t xml:space="preserve"> retrieves the public key of the recipient (which is not encrypted) and generates a symmetric key, </w:t>
-      </w:r>
-      <w:r>
-        <w:t xml:space="preserve">then it </w:t>
-      </w:r>
-      <w:r>
-        <w:t>encrypts the first message with the symmetric key and then in turn encrypts the symmetric key twice. Once with his public key and once with the public key of the recipient.</w:t>
-      </w:r>
-      <w:r>
-        <w:t xml:space="preserve"> These encrypted symmetric keys are uploaded to the server.</w:t>
-      </w:r>
-      <w:r>
-        <w:t xml:space="preserve"> When</w:t>
-      </w:r>
-      <w:r>
-        <w:t xml:space="preserve"> the recipient logs into the website he/she has to type in the passphrase, the output hash is compared to the one stored on the server if they match, he/she is permitted to enter. His/her encrypted private key is fetched from the server, in the frontend the passphrase is used to decrypt it. Now he/she can go to the new chat. For this, the symmetric key (encrypted with this user’s public key) is fetched, the decrypted private key is used to decrypt the symmetric key, then the symmetric key is used to decrypt the new message. This lengthy process is only needed in the beginning, from the moment the user fetched the symmetric key for this chat, the key is saved in the local cache and used for encrypting/decrypting all messages during the session. (Referring to the period where the user uses our website</w:t>
-      </w:r>
-      <w:r>
-        <w:t xml:space="preserve">; </w:t>
-      </w:r>
-      <w:r>
-        <w:t xml:space="preserve">a session terminates, if a user is inactive or logs out). </w:t>
-      </w:r>
-    </w:p>
-    <w:p>
-      <w:pPr>
-        <w:pStyle w:val="Heading3"/>
-      </w:pPr>
-      <w:bookmarkStart w:id="7" w:name="_Toc189313942"/>
-      <w:r>
-        <w:lastRenderedPageBreak/>
-        <w:t>Real-time chatting</w:t>
-      </w:r>
-      <w:bookmarkEnd w:id="7"/>
-    </w:p>
-    <w:p>
-      <w:pPr>
-        <w:pStyle w:val="Heading3"/>
-      </w:pPr>
-      <w:bookmarkStart w:id="8" w:name="_Toc189313943"/>
-      <w:r>
-        <w:t>Login and authentication</w:t>
-      </w:r>
-      <w:bookmarkEnd w:id="8"/>
-    </w:p>
-    <w:p>
-      <w:pPr>
-        <w:pStyle w:val="Heading3"/>
-      </w:pPr>
-      <w:bookmarkStart w:id="9" w:name="_Toc189313944"/>
-      <w:r>
-        <w:t>Search users</w:t>
-      </w:r>
-      <w:bookmarkEnd w:id="9"/>
-      <w:r>
-        <w:t xml:space="preserve"> </w:t>
-      </w:r>
-    </w:p>
-    <w:p>
-      <w:pPr>
-        <w:pStyle w:val="Heading3"/>
-      </w:pPr>
-      <w:bookmarkStart w:id="10" w:name="_Toc189313945"/>
-      <w:r>
-        <w:t>“Available” user overview</w:t>
-      </w:r>
-      <w:bookmarkEnd w:id="10"/>
-      <w:r>
-        <w:t xml:space="preserve"> </w:t>
-      </w:r>
-    </w:p>
-    <w:p>
-      <w:pPr>
-        <w:pStyle w:val="Heading1"/>
-      </w:pPr>
-      <w:bookmarkStart w:id="11" w:name="_Toc189313946"/>
-      <w:r>
-        <w:t>Architecture</w:t>
-      </w:r>
-      <w:bookmarkEnd w:id="11"/>
-    </w:p>
-    <w:p>
-      <w:pPr>
-        <w:pStyle w:val="Heading2"/>
-      </w:pPr>
-      <w:bookmarkStart w:id="12" w:name="_Toc189313947"/>
+      <w:bookmarkStart w:id="12" w:name="_Toc189596653"/>
       <w:r>
         <w:t>General overview</w:t>
       </w:r>
@@ -2915,7 +3588,7 @@
                     </pic:cNvPicPr>
                   </pic:nvPicPr>
                   <pic:blipFill>
-                    <a:blip r:embed="rId17">
+                    <a:blip r:embed="rId18">
                       <a:extLst>
                         <a:ext uri="{28A0092B-C50C-407E-A947-70E740481C1C}">
                           <a14:useLocalDpi xmlns:a14="http://schemas.microsoft.com/office/drawing/2010/main" val="0"/>
@@ -2961,7 +3634,7 @@
       <w:pPr>
         <w:pStyle w:val="Heading2"/>
       </w:pPr>
-      <w:bookmarkStart w:id="13" w:name="_Toc189313948"/>
+      <w:bookmarkStart w:id="13" w:name="_Toc189596654"/>
       <w:r>
         <w:lastRenderedPageBreak/>
         <w:t>AI functionality</w:t>
@@ -2969,6 +3642,9 @@
       <w:bookmarkEnd w:id="13"/>
     </w:p>
     <w:p>
+      <w:pPr>
+        <w:keepNext/>
+      </w:pPr>
       <w:r>
         <w:rPr>
           <w:noProof/>
@@ -2991,7 +3667,7 @@
                     </pic:cNvPicPr>
                   </pic:nvPicPr>
                   <pic:blipFill>
-                    <a:blip r:embed="rId18">
+                    <a:blip r:embed="rId19">
                       <a:extLst>
                         <a:ext uri="{28A0092B-C50C-407E-A947-70E740481C1C}">
                           <a14:useLocalDpi xmlns:a14="http://schemas.microsoft.com/office/drawing/2010/main" val="0"/>
@@ -3023,18 +3699,35 @@
         </w:drawing>
       </w:r>
     </w:p>
+    <w:p>
+      <w:pPr>
+        <w:pStyle w:val="Caption"/>
+      </w:pPr>
+      <w:r>
+        <w:t xml:space="preserve">Figure </w:t>
+      </w:r>
+      <w:fldSimple w:instr=" SEQ Figure \* ARABIC ">
+        <w:r>
+          <w:rPr>
+            <w:noProof/>
+          </w:rPr>
+          <w:t>11</w:t>
+        </w:r>
+      </w:fldSimple>
+      <w:r>
+        <w:t xml:space="preserve">: </w:t>
+      </w:r>
+      <w:r>
+        <w:t>This sequence diagram illustrates how the different components interact when new Icebreakers for a profile shall be generated.</w:t>
+      </w:r>
+    </w:p>
     <w:p/>
-    <w:p>
-      <w:r>
-        <w:t>This sequence diagram illustrates how the different components interact when new Icebreakers for a profile shall be generated.</w:t>
-      </w:r>
-    </w:p>
     <w:p/>
     <w:p>
       <w:pPr>
         <w:pStyle w:val="Heading2"/>
       </w:pPr>
-      <w:bookmarkStart w:id="14" w:name="_Toc189313949"/>
+      <w:bookmarkStart w:id="14" w:name="_Toc189596655"/>
       <w:r>
         <w:lastRenderedPageBreak/>
         <w:t>End-to-end encryption</w:t>
@@ -3064,7 +3757,7 @@
                     </pic:cNvPicPr>
                   </pic:nvPicPr>
                   <pic:blipFill>
-                    <a:blip r:embed="rId19" cstate="print">
+                    <a:blip r:embed="rId20" cstate="print">
                       <a:extLst>
                         <a:ext uri="{28A0092B-C50C-407E-A947-70E740481C1C}">
                           <a14:useLocalDpi xmlns:a14="http://schemas.microsoft.com/office/drawing/2010/main" val="0"/>
@@ -3098,58 +3791,10 @@
     </w:p>
     <w:p>
       <w:r>
-        <w:t xml:space="preserve">This sequence diagram illustrates how end-to-end encryption is realized, through illustrating the flow when a new user registers and sends a new message to another (existing) user. Important abbreviations: hash – hashing algorithm, pk – passkey, </w:t>
-      </w:r>
-      <w:proofErr w:type="spellStart"/>
-      <w:r>
-        <w:t>mn</w:t>
-      </w:r>
-      <w:proofErr w:type="spellEnd"/>
-      <w:r>
-        <w:t xml:space="preserve"> – magic number, enc – encryption algorithm, </w:t>
-      </w:r>
-      <w:proofErr w:type="spellStart"/>
-      <w:r>
-        <w:t>enc_variable</w:t>
-      </w:r>
-      <w:proofErr w:type="spellEnd"/>
-      <w:r>
-        <w:t xml:space="preserve"> - encrypted variable, </w:t>
-      </w:r>
-      <w:proofErr w:type="spellStart"/>
-      <w:r>
-        <w:t>pubkey</w:t>
-      </w:r>
-      <w:proofErr w:type="spellEnd"/>
-      <w:r>
-        <w:t xml:space="preserve"> – public key, </w:t>
-      </w:r>
-      <w:proofErr w:type="spellStart"/>
-      <w:r>
-        <w:t>privkey</w:t>
-      </w:r>
-      <w:proofErr w:type="spellEnd"/>
-      <w:r>
-        <w:t xml:space="preserve"> – private key, </w:t>
-      </w:r>
-      <w:proofErr w:type="spellStart"/>
-      <w:r>
-        <w:t>symkey</w:t>
-      </w:r>
-      <w:proofErr w:type="spellEnd"/>
-      <w:r>
-        <w:t xml:space="preserve"> – symmetric key, msg – message</w:t>
-      </w:r>
-      <w:r>
-        <w:t xml:space="preserve">, </w:t>
-      </w:r>
-      <w:proofErr w:type="spellStart"/>
-      <w:r>
-        <w:t>db</w:t>
-      </w:r>
-      <w:proofErr w:type="spellEnd"/>
-      <w:r>
-        <w:t xml:space="preserve"> - database</w:t>
+        <w:t>This sequence diagram illustrates how end-to-end encryption is realized, through illustrating the flow when a new user registers and sends a new message to another (existing) user. Important abbreviations: hash – hashing algorithm, pk – passkey, mn – magic number, enc – encryption algorithm, enc_variable - encrypted variable, pubkey – public key, privkey – private key, symkey – symmetric key, msg – message</w:t>
+      </w:r>
+      <w:r>
+        <w:t>, db - database</w:t>
       </w:r>
       <w:r>
         <w:t xml:space="preserve">. </w:t>
@@ -3179,7 +3824,7 @@
                     </pic:cNvPicPr>
                   </pic:nvPicPr>
                   <pic:blipFill>
-                    <a:blip r:embed="rId20" cstate="print">
+                    <a:blip r:embed="rId21" cstate="print">
                       <a:extLst>
                         <a:ext uri="{28A0092B-C50C-407E-A947-70E740481C1C}">
                           <a14:useLocalDpi xmlns:a14="http://schemas.microsoft.com/office/drawing/2010/main" val="0"/>
@@ -3213,75 +3858,10 @@
     </w:p>
     <w:p>
       <w:r>
-        <w:t xml:space="preserve">This sequence diagram illustrates how the other user logs in and receives the new message from the new user. </w:t>
-      </w:r>
-      <w:r>
-        <w:t xml:space="preserve">Important abbreviations: hash – hashing algorithm, pk – passkey, </w:t>
-      </w:r>
-      <w:proofErr w:type="spellStart"/>
-      <w:r>
-        <w:t>mn</w:t>
-      </w:r>
-      <w:proofErr w:type="spellEnd"/>
-      <w:r>
-        <w:t xml:space="preserve"> – magic number, </w:t>
-      </w:r>
-      <w:proofErr w:type="spellStart"/>
-      <w:r>
-        <w:t>decr</w:t>
-      </w:r>
-      <w:proofErr w:type="spellEnd"/>
-      <w:r>
-        <w:t xml:space="preserve"> – </w:t>
-      </w:r>
-      <w:r>
-        <w:t>decryption</w:t>
-      </w:r>
-      <w:r>
-        <w:t xml:space="preserve"> algorithm, </w:t>
-      </w:r>
-      <w:proofErr w:type="spellStart"/>
-      <w:r>
-        <w:t>enc_variable</w:t>
-      </w:r>
-      <w:proofErr w:type="spellEnd"/>
-      <w:r>
-        <w:t xml:space="preserve"> - encrypted variable, </w:t>
-      </w:r>
-      <w:proofErr w:type="spellStart"/>
-      <w:r>
-        <w:t>pubkey</w:t>
-      </w:r>
-      <w:proofErr w:type="spellEnd"/>
-      <w:r>
-        <w:t xml:space="preserve"> – public key, </w:t>
-      </w:r>
-      <w:proofErr w:type="spellStart"/>
-      <w:r>
-        <w:t>privkey</w:t>
-      </w:r>
-      <w:proofErr w:type="spellEnd"/>
-      <w:r>
-        <w:t xml:space="preserve"> – private key, </w:t>
-      </w:r>
-      <w:proofErr w:type="spellStart"/>
-      <w:r>
-        <w:t>symkey</w:t>
-      </w:r>
-      <w:proofErr w:type="spellEnd"/>
-      <w:r>
-        <w:t xml:space="preserve"> – symmetric key, msg – message</w:t>
-      </w:r>
-      <w:r>
-        <w:t xml:space="preserve">, </w:t>
-      </w:r>
-      <w:proofErr w:type="spellStart"/>
-      <w:r>
-        <w:t>db</w:t>
-      </w:r>
-      <w:proofErr w:type="spellEnd"/>
-      <w:r>
-        <w:t xml:space="preserve"> - database</w:t>
+        <w:t>This sequence diagram illustrates how the other user logs in and receives the new message from the new user. Important abbreviations: hash – hashing algorithm, pk – passkey, mn – magic number, decr – decryption algorithm, enc_variable - encrypted variable, pubkey – public key, privkey – private key, symkey – symmetric key, msg – message</w:t>
+      </w:r>
+      <w:r>
+        <w:t>, db - database</w:t>
       </w:r>
       <w:r>
         <w:t>.</w:t>
@@ -3291,7 +3871,7 @@
       <w:pPr>
         <w:pStyle w:val="Heading2"/>
       </w:pPr>
-      <w:bookmarkStart w:id="15" w:name="_Toc189313950"/>
+      <w:bookmarkStart w:id="15" w:name="_Toc189596656"/>
       <w:r>
         <w:lastRenderedPageBreak/>
         <w:t>Chat functionality</w:t>
@@ -3300,36 +3880,95 @@
     </w:p>
     <w:p>
       <w:pPr>
+        <w:keepNext/>
+        <w:jc w:val="center"/>
+      </w:pPr>
+      <w:r>
+        <w:rPr>
+          <w:noProof/>
+        </w:rPr>
+        <w:drawing>
+          <wp:inline distT="0" distB="0" distL="0" distR="0" wp14:anchorId="7AADB10D" wp14:editId="122C1CED">
+            <wp:extent cx="5941488" cy="3174124"/>
+            <wp:effectExtent l="0" t="0" r="2540" b="1270"/>
+            <wp:docPr id="2053021678" name="Picture 3" descr="A diagram of a network&#10;&#10;AI-generated content may be incorrect."/>
+            <wp:cNvGraphicFramePr>
+              <a:graphicFrameLocks xmlns:a="http://schemas.openxmlformats.org/drawingml/2006/main" noChangeAspect="1"/>
+            </wp:cNvGraphicFramePr>
+            <a:graphic xmlns:a="http://schemas.openxmlformats.org/drawingml/2006/main">
+              <a:graphicData uri="http://schemas.openxmlformats.org/drawingml/2006/picture">
+                <pic:pic xmlns:pic="http://schemas.openxmlformats.org/drawingml/2006/picture">
+                  <pic:nvPicPr>
+                    <pic:cNvPr id="2053021678" name="Picture 3" descr="A diagram of a network&#10;&#10;AI-generated content may be incorrect."/>
+                    <pic:cNvPicPr/>
+                  </pic:nvPicPr>
+                  <pic:blipFill>
+                    <a:blip r:embed="rId22" cstate="print">
+                      <a:extLst>
+                        <a:ext uri="{28A0092B-C50C-407E-A947-70E740481C1C}">
+                          <a14:useLocalDpi xmlns:a14="http://schemas.microsoft.com/office/drawing/2010/main" val="0"/>
+                        </a:ext>
+                      </a:extLst>
+                    </a:blip>
+                    <a:stretch>
+                      <a:fillRect/>
+                    </a:stretch>
+                  </pic:blipFill>
+                  <pic:spPr>
+                    <a:xfrm>
+                      <a:off x="0" y="0"/>
+                      <a:ext cx="6020840" cy="3216516"/>
+                    </a:xfrm>
+                    <a:prstGeom prst="rect">
+                      <a:avLst/>
+                    </a:prstGeom>
+                  </pic:spPr>
+                </pic:pic>
+              </a:graphicData>
+            </a:graphic>
+          </wp:inline>
+        </w:drawing>
+      </w:r>
+    </w:p>
+    <w:p>
+      <w:pPr>
+        <w:pStyle w:val="Caption"/>
+        <w:jc w:val="center"/>
+      </w:pPr>
+      <w:r>
+        <w:t xml:space="preserve">Figure </w:t>
+      </w:r>
+      <w:fldSimple w:instr=" SEQ Figure \* ARABIC ">
+        <w:r>
+          <w:rPr>
+            <w:noProof/>
+          </w:rPr>
+          <w:t>12</w:t>
+        </w:r>
+      </w:fldSimple>
+      <w:r>
+        <w:t>: Real Time Chatting - Architecture</w:t>
+      </w:r>
+    </w:p>
+    <w:p>
+      <w:pPr>
+        <w:pStyle w:val="Heading1"/>
+      </w:pPr>
+      <w:bookmarkStart w:id="16" w:name="_Toc189596657"/>
+      <w:r>
+        <w:t>Challenges we have faced</w:t>
+      </w:r>
+      <w:bookmarkEnd w:id="16"/>
+    </w:p>
+    <w:p>
+      <w:pPr>
         <w:pStyle w:val="Heading2"/>
       </w:pPr>
-      <w:bookmarkStart w:id="16" w:name="_Toc189313951"/>
-      <w:r>
-        <w:t>Login functionality</w:t>
-      </w:r>
-      <w:bookmarkEnd w:id="16"/>
-      <w:r>
-        <w:t xml:space="preserve">  </w:t>
-      </w:r>
-    </w:p>
-    <w:p>
-      <w:pPr>
-        <w:pStyle w:val="Heading1"/>
-      </w:pPr>
-      <w:bookmarkStart w:id="17" w:name="_Toc189313952"/>
-      <w:r>
-        <w:t>Challenges we have faced</w:t>
+      <w:bookmarkStart w:id="17" w:name="_Toc189596658"/>
+      <w:r>
+        <w:t>AI feature</w:t>
       </w:r>
       <w:bookmarkEnd w:id="17"/>
-    </w:p>
-    <w:p>
-      <w:pPr>
-        <w:pStyle w:val="Heading2"/>
-      </w:pPr>
-      <w:bookmarkStart w:id="18" w:name="_Toc189313953"/>
-      <w:r>
-        <w:t>AI feature</w:t>
-      </w:r>
-      <w:bookmarkEnd w:id="18"/>
     </w:p>
     <w:p>
       <w:r>
@@ -3440,7 +4079,11 @@
         <w:t>,</w:t>
       </w:r>
       <w:r>
-        <w:t xml:space="preserve"> all Icebreakers follow this structure. Thus, the generated Icebreakers do the same, the real problem comes from when the structure of the profile is deviated from. We first trained the gpt2-small model, here minor changes in the profile structure often meant illogical Icebreakers. With the gpt2-medium model this is a little better, even if the provided profile is significantly different from the learnt structure, the model is still able to generate mostly “good” Icebreakers. But the lack of datasets and the fact that all datasets follow a similar structure for the profiles still means, that when giving the model a profile that completely deviates from the learned structure the generated Icebreakers can not be considered “good”. Here we want to demonstrate an example for a generates Icebreaker with the fine-tuned gpt2-medium model. Profile:</w:t>
+        <w:t xml:space="preserve"> all Icebreakers follow this structure. Thus, the generated Icebreakers do the same, the real problem comes from when the structure of the profile is deviated from. We first trained the gpt2-small </w:t>
+      </w:r>
+      <w:r>
+        <w:lastRenderedPageBreak/>
+        <w:t>model, here minor changes in the profile structure often meant illogical Icebreakers. With the gpt2-medium model this is a little better, even if the provided profile is significantly different from the learnt structure, the model is still able to generate mostly “good” Icebreakers. But the lack of datasets and the fact that all datasets follow a similar structure for the profiles still means, that when giving the model a profile that completely deviates from the learned structure the generated Icebreakers can not be considered “good”. Here we want to demonstrate an example for a generates Icebreaker with the fine-tuned gpt2-medium model. Profile:</w:t>
       </w:r>
       <w:r>
         <w:t>”</w:t>
@@ -3452,15 +4095,7 @@
         <w:t>” One of the generated Icebreakers: “</w:t>
       </w:r>
       <w:r>
-        <w:t xml:space="preserve">Astrophysics is mind-blowing! Do you have a </w:t>
-      </w:r>
-      <w:proofErr w:type="spellStart"/>
-      <w:r>
-        <w:t>favorite</w:t>
-      </w:r>
-      <w:proofErr w:type="spellEnd"/>
-      <w:r>
-        <w:t xml:space="preserve"> celestial phenomenon?</w:t>
+        <w:t>Astrophysics is mind-blowing! Do you have a favorite celestial phenomenon?</w:t>
       </w:r>
       <w:r>
         <w:t xml:space="preserve">” </w:t>
@@ -3505,11 +4140,7 @@
         <w:t>with</w:t>
       </w:r>
       <w:r>
-        <w:t xml:space="preserve"> these we could select </w:t>
-      </w:r>
-      <w:r>
-        <w:lastRenderedPageBreak/>
-        <w:t xml:space="preserve">a GPU which had approximately 40 GB of VRAM. With this we could train the model, after assessing that we </w:t>
+        <w:t xml:space="preserve"> these we could select a GPU which had approximately 40 GB of VRAM. With this we could train the model, after assessing that we </w:t>
       </w:r>
       <w:r>
         <w:t xml:space="preserve">had </w:t>
@@ -3531,49 +4162,37 @@
       <w:pPr>
         <w:pStyle w:val="Heading1"/>
       </w:pPr>
-      <w:bookmarkStart w:id="19" w:name="_Toc189313954"/>
+      <w:bookmarkStart w:id="18" w:name="_Toc189596659"/>
       <w:r>
         <w:t>Who has done what</w:t>
       </w:r>
+      <w:bookmarkEnd w:id="18"/>
+    </w:p>
+    <w:p>
+      <w:r>
+        <w:t xml:space="preserve">Utkarsh Fulara was responsible for the login and authentication, for the chat overview component and for the real time chatting feature. Bilal Alali was responsible for the search feature, the profile overview component and for creating data for our AI feature. Andrej Sum-Shik was responsible for conceptualising the AI, training the AI and integrating the AI into the Website. Furthermore, he was also responsible for the end-to-end encryption of the messages. All members worked on creating architectures for the application. Especially conceptualising the database where login and chat data is stored. </w:t>
+      </w:r>
+    </w:p>
+    <w:p>
+      <w:pPr>
+        <w:pStyle w:val="Heading1"/>
+      </w:pPr>
+      <w:bookmarkStart w:id="19" w:name="_Toc189596660"/>
+      <w:r>
+        <w:t>Conclusion</w:t>
+      </w:r>
       <w:bookmarkEnd w:id="19"/>
     </w:p>
     <w:p>
       <w:r>
-        <w:t xml:space="preserve">Utkarsh Fulara was responsible for the login and authentication, for the chat overview component and for the real time chatting feature. Bilal Alali was responsible for the search feature, the profile overview component and for creating data for our AI feature. Andrej Sum-Shik was responsible for conceptualising the AI, training the AI and integrating the AI into the Website. Furthermore, he was also responsible for the end-to-end encryption of the messages. All members worked on creating architectures for the application. Especially conceptualising the database where login and chat data is stored. </w:t>
-      </w:r>
-    </w:p>
-    <w:p>
-      <w:pPr>
-        <w:pStyle w:val="Heading1"/>
-      </w:pPr>
-      <w:bookmarkStart w:id="20" w:name="_Toc189313955"/>
-      <w:r>
-        <w:t>Conclusion</w:t>
-      </w:r>
-      <w:bookmarkEnd w:id="20"/>
-    </w:p>
-    <w:p>
-      <w:r>
         <w:t>This was our favourite project of our young career so far, mainly because we were given the freedom to create what we want and the fact that we could work on one of the most important topics in computer science of this day. Through this project we were able to understand neural networks which are th</w:t>
       </w:r>
       <w:r>
-        <w:t xml:space="preserve">e basis for all modern AI. Furthermore, we were able to work with and understand the complex models of todays age which extend the classic neural networks, namely generative AI models like ChatGPT. We had a lot of fun understanding how AIs like ChatGPT work and how we can fine-tune these models to our demands. Furthermore, we were able to sophisticate and enlarge our knowledge of creating complex websites, which incorporate a java driven backend (in our case </w:t>
-      </w:r>
-      <w:proofErr w:type="spellStart"/>
-      <w:r>
-        <w:t>springboot</w:t>
-      </w:r>
-      <w:proofErr w:type="spellEnd"/>
-      <w:r>
-        <w:t xml:space="preserve">), a </w:t>
-      </w:r>
-      <w:proofErr w:type="spellStart"/>
-      <w:r>
-        <w:t>javascript</w:t>
-      </w:r>
-      <w:proofErr w:type="spellEnd"/>
-      <w:r>
-        <w:t xml:space="preserve"> driven frontend (in our case angular) and database structure (in our case PostgreSQL). Especially conceptualizing and implementing the chat functionality demanded a lot of our knowledge acquired in courses like: Distributed Systems or Computer Networks. Thus, we could bring a lot of the learned concepts into practice. The same can be said for the end-to-end encryption. Here the knowledge acquired in the IT Security lecture</w:t>
+        <w:t xml:space="preserve">e basis for all modern AI. Furthermore, we were able to work with and understand the complex models of todays age which extend </w:t>
+      </w:r>
+      <w:r>
+        <w:lastRenderedPageBreak/>
+        <w:t>the classic neural networks, namely generative AI models like ChatGPT. We had a lot of fun understanding how AIs like ChatGPT work and how we can fine-tune these models to our demands. Furthermore, we were able to sophisticate and enlarge our knowledge of creating complex websites, which incorporate a java driven backend (in our case springboot), a javascript driven frontend (in our case angular) and database structure (in our case PostgreSQL). Especially conceptualizing and implementing the chat functionality demanded a lot of our knowledge acquired in courses like: Distributed Systems or Computer Networks. Thus, we could bring a lot of the learned concepts into practice. The same can be said for the end-to-end encryption. Here the knowledge acquired in the IT Security lecture</w:t>
       </w:r>
       <w:r>
         <w:t>s</w:t>
@@ -3588,11 +4207,7 @@
         <w:t xml:space="preserve"> of vital importance to realize our ideas. </w:t>
       </w:r>
       <w:r>
-        <w:t xml:space="preserve">As the mentioned courses were among some of our favourites in our journey in this university, we were able to sophisticate our interests and get a first idea of what to do after acquiring our bachelor’s degree. (If all goes well all of us are finishing this year or at the beginning of next year). In conclusion on behalf of the entire team: Utkarsh Fulara, Bilal </w:t>
-      </w:r>
-      <w:r>
-        <w:lastRenderedPageBreak/>
-        <w:t>Alali and Andrej Sum-Shik we would like to thank Prof. Dr. Ing. Markus Miettinen for giving us this wonderful opportunity. We are very satisfied with this course and are looking forward to the presentation where we can present our work to all the other students.</w:t>
+        <w:t>As the mentioned courses were among some of our favourites in our journey in this university, we were able to sophisticate our interests and get a first idea of what to do after acquiring our bachelor’s degree. (If all goes well all of us are finishing this year or at the beginning of next year). In conclusion on behalf of the entire team: Utkarsh Fulara, Bilal Alali and Andrej Sum-Shik we would like to thank Prof. Dr. Ing. Markus Miettinen for giving us this wonderful opportunity. We are very satisfied with this course and are looking forward to the presentation where we can present our work to all the other students.</w:t>
       </w:r>
     </w:p>
     <w:p/>
@@ -3670,93 +4285,51 @@
       <w:r>
         <w:t>Vuong, Q., La, V., Nguyen, M., Jin, R., La, M. &amp; Le, T. (2023b). How AI’s Self-Prolongation Influences People’s Perceptions of Its Autonomous Mind: The Case of U.S. Residents. </w:t>
       </w:r>
-      <w:proofErr w:type="spellStart"/>
       <w:r>
         <w:rPr>
           <w:i/>
           <w:iCs/>
         </w:rPr>
-        <w:t>Behavioral</w:t>
-      </w:r>
-      <w:proofErr w:type="spellEnd"/>
+        <w:t>Behavioral Sciences</w:t>
+      </w:r>
+      <w:r>
+        <w:t>, </w:t>
+      </w:r>
       <w:r>
         <w:rPr>
           <w:i/>
           <w:iCs/>
         </w:rPr>
-        <w:t xml:space="preserve"> Sciences</w:t>
-      </w:r>
-      <w:r>
-        <w:t>, </w:t>
+        <w:t>13</w:t>
+      </w:r>
+      <w:r>
+        <w:t>(6), 470. https://doi.org/10.3390/bs13060470</w:t>
+      </w:r>
+    </w:p>
+  </w:footnote>
+  <w:footnote w:id="2">
+    <w:p>
+      <w:pPr>
+        <w:pStyle w:val="FootnoteText"/>
+      </w:pPr>
+      <w:r>
+        <w:rPr>
+          <w:rStyle w:val="FootnoteReference"/>
+        </w:rPr>
+        <w:footnoteRef/>
+      </w:r>
+      <w:r>
+        <w:t xml:space="preserve"> </w:t>
+      </w:r>
+      <w:r>
+        <w:t>Vaswani, A., Shazeer, N., Parmar, N., Uszkoreit, J., Jones, L., Gomez, A. N., Kaiser, L. &amp; Polosukhin, I. (2017). Attention is All you Need. </w:t>
       </w:r>
       <w:r>
         <w:rPr>
           <w:i/>
           <w:iCs/>
         </w:rPr>
-        <w:t>13</w:t>
-      </w:r>
-      <w:r>
-        <w:t>(6), 470. https://doi.org/10.3390/bs13060470</w:t>
-      </w:r>
-    </w:p>
-  </w:footnote>
-  <w:footnote w:id="2">
-    <w:p>
-      <w:pPr>
-        <w:pStyle w:val="FootnoteText"/>
-      </w:pPr>
-      <w:r>
-        <w:rPr>
-          <w:rStyle w:val="FootnoteReference"/>
-        </w:rPr>
-        <w:footnoteRef/>
-      </w:r>
-      <w:r>
-        <w:t xml:space="preserve"> </w:t>
-      </w:r>
-      <w:r>
-        <w:t xml:space="preserve">Vaswani, A., </w:t>
-      </w:r>
-      <w:proofErr w:type="spellStart"/>
-      <w:r>
-        <w:t>Shazeer</w:t>
-      </w:r>
-      <w:proofErr w:type="spellEnd"/>
-      <w:r>
-        <w:t xml:space="preserve">, N., Parmar, N., </w:t>
-      </w:r>
-      <w:proofErr w:type="spellStart"/>
-      <w:r>
-        <w:t>Uszkoreit</w:t>
-      </w:r>
-      <w:proofErr w:type="spellEnd"/>
-      <w:r>
-        <w:t xml:space="preserve">, J., Jones, L., Gomez, A. N., Kaiser, L. &amp; </w:t>
-      </w:r>
-      <w:proofErr w:type="spellStart"/>
-      <w:r>
-        <w:t>Polosukhin</w:t>
-      </w:r>
-      <w:proofErr w:type="spellEnd"/>
-      <w:r>
-        <w:t>, I. (2017). Attention is All you Need. </w:t>
-      </w:r>
-      <w:proofErr w:type="spellStart"/>
-      <w:r>
-        <w:rPr>
-          <w:i/>
-          <w:iCs/>
-        </w:rPr>
-        <w:t>arXiv</w:t>
-      </w:r>
-      <w:proofErr w:type="spellEnd"/>
-      <w:r>
-        <w:rPr>
-          <w:i/>
-          <w:iCs/>
-        </w:rPr>
-        <w:t xml:space="preserve"> (Cornell University)</w:t>
+        <w:t>arXiv (Cornell University)</w:t>
       </w:r>
       <w:r>
         <w:t>, </w:t>
@@ -3905,7 +4478,7 @@
         <w:kern w:val="2"/>
         <w:sz w:val="24"/>
         <w:szCs w:val="24"/>
-        <w:lang w:val="en-DE" w:eastAsia="en-US" w:bidi="ar-SA"/>
+        <w:lang w:val="en-US" w:eastAsia="en-US" w:bidi="ar-SA"/>
         <w14:ligatures w14:val="standardContextual"/>
       </w:rPr>
     </w:rPrDefault>
@@ -4368,7 +4941,6 @@
     <w:next w:val="Normal"/>
     <w:link w:val="Heading4Char"/>
     <w:uiPriority w:val="9"/>
-    <w:semiHidden/>
     <w:unhideWhenUsed/>
     <w:qFormat/>
     <w:rsid w:val="009D2885"/>
@@ -4565,7 +5137,6 @@
     <w:basedOn w:val="DefaultParagraphFont"/>
     <w:link w:val="Heading4"/>
     <w:uiPriority w:val="9"/>
-    <w:semiHidden/>
     <w:rsid w:val="009D2885"/>
     <w:rPr>
       <w:rFonts w:eastAsiaTheme="majorEastAsia" w:cstheme="majorBidi"/>
@@ -4864,7 +5435,6 @@
       <w:kern w:val="0"/>
       <w:sz w:val="32"/>
       <w:szCs w:val="32"/>
-      <w:lang w:val="en-US"/>
       <w14:ligatures w14:val="none"/>
     </w:rPr>
   </w:style>
@@ -4955,6 +5525,100 @@
       <w:sz w:val="20"/>
       <w:szCs w:val="20"/>
     </w:rPr>
+  </w:style>
+  <w:style w:type="paragraph" w:styleId="Caption">
+    <w:name w:val="caption"/>
+    <w:basedOn w:val="Normal"/>
+    <w:next w:val="Normal"/>
+    <w:uiPriority w:val="35"/>
+    <w:unhideWhenUsed/>
+    <w:qFormat/>
+    <w:rsid w:val="002A3055"/>
+    <w:pPr>
+      <w:spacing w:after="200" w:line="240" w:lineRule="auto"/>
+    </w:pPr>
+    <w:rPr>
+      <w:i/>
+      <w:iCs/>
+      <w:color w:val="0E2841" w:themeColor="text2"/>
+      <w:sz w:val="18"/>
+      <w:szCs w:val="18"/>
+    </w:rPr>
+  </w:style>
+  <w:style w:type="paragraph" w:customStyle="1" w:styleId="p1">
+    <w:name w:val="p1"/>
+    <w:basedOn w:val="Normal"/>
+    <w:rsid w:val="009072F9"/>
+    <w:pPr>
+      <w:spacing w:before="100" w:beforeAutospacing="1" w:after="100" w:afterAutospacing="1" w:line="240" w:lineRule="auto"/>
+    </w:pPr>
+    <w:rPr>
+      <w:rFonts w:ascii="Times New Roman" w:eastAsia="Times New Roman" w:hAnsi="Times New Roman" w:cs="Times New Roman"/>
+      <w:kern w:val="0"/>
+      <w14:ligatures w14:val="none"/>
+    </w:rPr>
+  </w:style>
+  <w:style w:type="character" w:customStyle="1" w:styleId="s1">
+    <w:name w:val="s1"/>
+    <w:basedOn w:val="DefaultParagraphFont"/>
+    <w:rsid w:val="009072F9"/>
+  </w:style>
+  <w:style w:type="paragraph" w:customStyle="1" w:styleId="p2">
+    <w:name w:val="p2"/>
+    <w:basedOn w:val="Normal"/>
+    <w:rsid w:val="009072F9"/>
+    <w:pPr>
+      <w:spacing w:before="100" w:beforeAutospacing="1" w:after="100" w:afterAutospacing="1" w:line="240" w:lineRule="auto"/>
+    </w:pPr>
+    <w:rPr>
+      <w:rFonts w:ascii="Times New Roman" w:eastAsia="Times New Roman" w:hAnsi="Times New Roman" w:cs="Times New Roman"/>
+      <w:kern w:val="0"/>
+      <w14:ligatures w14:val="none"/>
+    </w:rPr>
+  </w:style>
+  <w:style w:type="paragraph" w:styleId="Header">
+    <w:name w:val="header"/>
+    <w:basedOn w:val="Normal"/>
+    <w:link w:val="HeaderChar"/>
+    <w:uiPriority w:val="99"/>
+    <w:unhideWhenUsed/>
+    <w:rsid w:val="00F57DAF"/>
+    <w:pPr>
+      <w:tabs>
+        <w:tab w:val="center" w:pos="4680"/>
+        <w:tab w:val="right" w:pos="9360"/>
+      </w:tabs>
+      <w:spacing w:after="0" w:line="240" w:lineRule="auto"/>
+    </w:pPr>
+  </w:style>
+  <w:style w:type="character" w:customStyle="1" w:styleId="HeaderChar">
+    <w:name w:val="Header Char"/>
+    <w:basedOn w:val="DefaultParagraphFont"/>
+    <w:link w:val="Header"/>
+    <w:uiPriority w:val="99"/>
+    <w:rsid w:val="00F57DAF"/>
+  </w:style>
+  <w:style w:type="paragraph" w:styleId="Footer">
+    <w:name w:val="footer"/>
+    <w:basedOn w:val="Normal"/>
+    <w:link w:val="FooterChar"/>
+    <w:uiPriority w:val="99"/>
+    <w:unhideWhenUsed/>
+    <w:rsid w:val="00F57DAF"/>
+    <w:pPr>
+      <w:tabs>
+        <w:tab w:val="center" w:pos="4680"/>
+        <w:tab w:val="right" w:pos="9360"/>
+      </w:tabs>
+      <w:spacing w:after="0" w:line="240" w:lineRule="auto"/>
+    </w:pPr>
+  </w:style>
+  <w:style w:type="character" w:customStyle="1" w:styleId="FooterChar">
+    <w:name w:val="Footer Char"/>
+    <w:basedOn w:val="DefaultParagraphFont"/>
+    <w:link w:val="Footer"/>
+    <w:uiPriority w:val="99"/>
+    <w:rsid w:val="00F57DAF"/>
   </w:style>
 </w:styles>
 </file>

</xml_diff>

<commit_message>
Edited the Search User Functionality Implementation
</commit_message>
<xml_diff>
--- a/IcebreakerReport.docx
+++ b/IcebreakerReport.docx
@@ -1478,16 +1478,72 @@
     </w:p>
     <w:p>
       <w:r>
-        <w:t>Nowadays the term AI is discussed in nearly every corner of this world. The Term AI refers to artificial intelligence. But what that actually means is hard to tell, as we humans do not have a decisive definition of the term intelligence. Mainly because our own intellect is still a mystery to us. The term artificial seems a lot more straightforward, as it refers to something that is man</w:t>
+        <w:t xml:space="preserve">Nowadays the term AI is discussed in nearly every corner of this world. The Term AI refers to artificial intelligence. But what that </w:t>
+      </w:r>
+      <w:proofErr w:type="gramStart"/>
+      <w:r>
+        <w:t>actually means</w:t>
+      </w:r>
+      <w:proofErr w:type="gramEnd"/>
+      <w:r>
+        <w:t xml:space="preserve"> is hard to tell, as we humans do not have a decisive definition of the term intelligence. Mainly because our own intellect is still a mystery to us. The term artificial seems a lot more straightforward, as it refers to something that is man</w:t>
       </w:r>
       <w:r>
         <w:t>-</w:t>
       </w:r>
       <w:r>
-        <w:t>made and not naturally produced. (Although as every component in every machine is made out of particles, you cannot definitely prove that there is not a planet in the universe where this particular machine was made by nature). To still derive a general definition artificial intelligence refers to a man-made machine which exhibits cognitive skills similar to that of a human. In recent years AI has made further progress and was able to sophisticate itself in everyday life, that is to escape from the purely scientific world and acquiring general relevance in the world of all human beings. ChatGPT made a significant contribution to this change, as it allowed every human being to come into contact with the scientific and mathematical world of AI, without having to understand any of the complex structure behind it. For most of us ChatGPT has become an irreplaceable companion that helps us in our everyday tasks. Especially for university students this technology became a brand-new way of learning and understanding complex concepts in every branch of research</w:t>
-      </w:r>
-      <w:r>
-        <w:t>. But as popular as AI is, it is also a highly controversial topic. Many fear the rise of AI, as it has the potential to become a lot smarter than us. Although, there a valid reasons for this fear, a bigger problem right now stems from the fact that most people discussing this topic do not actually understand how AIs like ChatGPT work</w:t>
+        <w:t xml:space="preserve">made and not naturally produced. (Although as every component in every machine is </w:t>
+      </w:r>
+      <w:proofErr w:type="gramStart"/>
+      <w:r>
+        <w:t>made out of</w:t>
+      </w:r>
+      <w:proofErr w:type="gramEnd"/>
+      <w:r>
+        <w:t xml:space="preserve"> particles, you cannot definitely prove that there is not a planet in the universe where this particular machine was made by nature). To still derive a general definition artificial intelligence refers to a man-made machine which exhibits cognitive skills </w:t>
+      </w:r>
+      <w:proofErr w:type="gramStart"/>
+      <w:r>
+        <w:t>similar to</w:t>
+      </w:r>
+      <w:proofErr w:type="gramEnd"/>
+      <w:r>
+        <w:t xml:space="preserve"> that of a human. In recent years AI has made further progress and was able to sophisticate itself in everyday life, that is to escape from the purely scientific world and acquiring general relevance in the world of all human beings. ChatGPT made a significant contribution to this change, as it allowed every human being to </w:t>
+      </w:r>
+      <w:proofErr w:type="gramStart"/>
+      <w:r>
+        <w:t>come into contact with</w:t>
+      </w:r>
+      <w:proofErr w:type="gramEnd"/>
+      <w:r>
+        <w:t xml:space="preserve"> the scientific and mathematical world of AI, without having to understand any of the complex structure behind it. For most of us ChatGPT has become an irreplaceable companion that helps us in our everyday tasks. Especially for university </w:t>
+      </w:r>
+      <w:proofErr w:type="gramStart"/>
+      <w:r>
+        <w:t>students</w:t>
+      </w:r>
+      <w:proofErr w:type="gramEnd"/>
+      <w:r>
+        <w:t xml:space="preserve"> this technology became a brand-new way of learning and understanding complex concepts in every branch of research</w:t>
+      </w:r>
+      <w:r>
+        <w:t xml:space="preserve">. But as popular as AI is, it is also a highly controversial topic. Many fear the rise of AI, as it has the potential to become a lot smarter than us. </w:t>
+      </w:r>
+      <w:proofErr w:type="gramStart"/>
+      <w:r>
+        <w:t>Although,</w:t>
+      </w:r>
+      <w:proofErr w:type="gramEnd"/>
+      <w:r>
+        <w:t xml:space="preserve"> there a </w:t>
+      </w:r>
+      <w:proofErr w:type="gramStart"/>
+      <w:r>
+        <w:t>valid reasons</w:t>
+      </w:r>
+      <w:proofErr w:type="gramEnd"/>
+      <w:r>
+        <w:t xml:space="preserve"> for this fear, a bigger problem right now stems from the fact that most people discussing this topic do not actually understand how AIs like ChatGPT work</w:t>
       </w:r>
       <w:r>
         <w:rPr>
@@ -1508,7 +1564,15 @@
         <w:t>d</w:t>
       </w:r>
       <w:r>
-        <w:t xml:space="preserve"> will be discussed in this report. Furthermore, this report serves as a first dive into the strange and scientific world of AI, that we as team began diving into since the start of this semester (October 2024). </w:t>
+        <w:t xml:space="preserve"> will be discussed in this report. Furthermore, this report serves as a first dive into the strange and scientific world of AI, that we as </w:t>
+      </w:r>
+      <w:proofErr w:type="gramStart"/>
+      <w:r>
+        <w:t>team</w:t>
+      </w:r>
+      <w:proofErr w:type="gramEnd"/>
+      <w:r>
+        <w:t xml:space="preserve"> began diving into since the start of this semester (October 2024). </w:t>
       </w:r>
     </w:p>
     <w:p/>
@@ -1535,10 +1599,34 @@
         <w:t xml:space="preserve"> </w:t>
       </w:r>
       <w:r>
-        <w:t xml:space="preserve">she can select another user: Bilal. Then our AI analyses the description that Bilal wrote about himself and suggests Laura a few potential first messages she can send to Bilal. For instance: Bilal wrote about himself that he likes boxing, so a potential first message may be: “Boxing is so nerve-wrecking. Who is your favourite Boxer?” Laura selects this Icebreaker and sends it as a first message. A new chat now exists between Laura and Bilal. Here they can spend as much time texting each other as they want and best of all, only they know </w:t>
-      </w:r>
-      <w:r>
-        <w:t xml:space="preserve">the content of their conversation. Because we value user privacy, we want this chatting feature to be end-to-end encrypted, this means only Laura and Bilal have the means to decrypt the exchanged messages. </w:t>
+        <w:t xml:space="preserve">she can select another user: Bilal. Then our AI analyses the description that Bilal wrote about himself and </w:t>
+      </w:r>
+      <w:proofErr w:type="gramStart"/>
+      <w:r>
+        <w:t>suggests</w:t>
+      </w:r>
+      <w:proofErr w:type="gramEnd"/>
+      <w:r>
+        <w:t xml:space="preserve"> Laura a few </w:t>
+      </w:r>
+      <w:proofErr w:type="gramStart"/>
+      <w:r>
+        <w:t>potential</w:t>
+      </w:r>
+      <w:proofErr w:type="gramEnd"/>
+      <w:r>
+        <w:t xml:space="preserve"> first messages she can send to Bilal. For instance: Bilal wrote about himself that he likes boxing, so a potential first message may be: “Boxing is so nerve-wrecking. Who is your favourite Boxer?” Laura selects this Icebreaker and sends it as a first message. A new chat now exists between Laura and Bilal. Here they can spend as much time texting each other as they want and best of all, only they know </w:t>
+      </w:r>
+      <w:r>
+        <w:t xml:space="preserve">the content of their conversation. Because we value user privacy, we want this chatting feature to be </w:t>
+      </w:r>
+      <w:proofErr w:type="gramStart"/>
+      <w:r>
+        <w:t>end-to-end encrypted</w:t>
+      </w:r>
+      <w:proofErr w:type="gramEnd"/>
+      <w:r>
+        <w:t xml:space="preserve">, this means only Laura and Bilal have the means to decrypt the exchanged messages. </w:t>
       </w:r>
     </w:p>
     <w:p>
@@ -1796,7 +1884,15 @@
         <w:t xml:space="preserve"> </w:t>
       </w:r>
       <w:r>
-        <w:t xml:space="preserve">Users can logout manually </w:t>
+        <w:t xml:space="preserve">Users can </w:t>
+      </w:r>
+      <w:proofErr w:type="gramStart"/>
+      <w:r>
+        <w:t>logout</w:t>
+      </w:r>
+      <w:proofErr w:type="gramEnd"/>
+      <w:r>
+        <w:t xml:space="preserve"> manually </w:t>
       </w:r>
     </w:p>
     <w:p>
@@ -1824,11 +1920,16 @@
     </w:p>
     <w:p>
       <w:r>
-        <w:t>When accessing the website users first meet</w:t>
+        <w:t xml:space="preserve">When accessing the website users first </w:t>
+      </w:r>
+      <w:proofErr w:type="gramStart"/>
+      <w:r>
+        <w:t>meet</w:t>
       </w:r>
       <w:r>
         <w:t>s</w:t>
       </w:r>
+      <w:proofErr w:type="gramEnd"/>
       <w:r>
         <w:t xml:space="preserve"> a login screen, here they can choose to create a new account or sign in with an existing one. Users can also choose which language the prefer: German or English. </w:t>
       </w:r>
@@ -1909,21 +2010,21 @@
         </w:r>
       </w:fldSimple>
       <w:r>
-        <w:t xml:space="preserve">: </w:t>
-      </w:r>
-      <w:proofErr w:type="spellStart"/>
-      <w:r>
-        <w:t>Keycloak</w:t>
-      </w:r>
-      <w:proofErr w:type="spellEnd"/>
-      <w:r>
-        <w:t xml:space="preserve"> Login Terminal</w:t>
+        <w:t>: Keycloak Login Terminal</w:t>
       </w:r>
     </w:p>
     <w:p/>
     <w:p>
       <w:r>
-        <w:t>When the login was successful new users have to create a passphrase and a magic number</w:t>
+        <w:t xml:space="preserve">When the login was successful new users </w:t>
+      </w:r>
+      <w:proofErr w:type="gramStart"/>
+      <w:r>
+        <w:t>have to</w:t>
+      </w:r>
+      <w:proofErr w:type="gramEnd"/>
+      <w:r>
+        <w:t xml:space="preserve"> create a passphrase and a magic number</w:t>
       </w:r>
       <w:r>
         <w:t>,</w:t>
@@ -2274,7 +2375,15 @@
     <w:p/>
     <w:p>
       <w:r>
-        <w:t xml:space="preserve">After that the user is greeted with following screen </w:t>
+        <w:t xml:space="preserve">After that the user is greeted with </w:t>
+      </w:r>
+      <w:proofErr w:type="gramStart"/>
+      <w:r>
+        <w:t>following</w:t>
+      </w:r>
+      <w:proofErr w:type="gramEnd"/>
+      <w:r>
+        <w:t xml:space="preserve"> screen </w:t>
       </w:r>
     </w:p>
     <w:p>
@@ -2287,7 +2396,7 @@
           <w:noProof/>
         </w:rPr>
         <w:drawing>
-          <wp:inline distT="0" distB="0" distL="0" distR="0" wp14:anchorId="7FBADC50" wp14:editId="3BCAA872">
+          <wp:inline distT="0" distB="0" distL="0" distR="0" wp14:anchorId="7FBADC50" wp14:editId="79415D78">
             <wp:extent cx="4711959" cy="2054414"/>
             <wp:effectExtent l="0" t="0" r="0" b="3175"/>
             <wp:docPr id="80259576" name="Picture 8"/>
@@ -2364,7 +2473,23 @@
     </w:p>
     <w:p>
       <w:r>
-        <w:t xml:space="preserve">When clicking on a user profile the user can send a first message to this person, there the icebreakers are also generated, this takes some time, so in the mean time the user sees various messages as to distract him/her from the passing time. </w:t>
+        <w:t xml:space="preserve">When clicking on a user profile the user can send a first message to this person, there the icebreakers are also generated, this takes some time, so in the </w:t>
+      </w:r>
+      <w:proofErr w:type="gramStart"/>
+      <w:r>
+        <w:t>mean time</w:t>
+      </w:r>
+      <w:proofErr w:type="gramEnd"/>
+      <w:r>
+        <w:t xml:space="preserve"> the user sees various </w:t>
+      </w:r>
+      <w:proofErr w:type="gramStart"/>
+      <w:r>
+        <w:t>messages as</w:t>
+      </w:r>
+      <w:proofErr w:type="gramEnd"/>
+      <w:r>
+        <w:t xml:space="preserve"> to distract him/her from the passing time. </w:t>
       </w:r>
     </w:p>
     <w:p>
@@ -2528,7 +2653,15 @@
     <w:p/>
     <w:p>
       <w:r>
-        <w:t xml:space="preserve">When a user sends a first message a chat is created this chat can be views, when the user clicks on chat overview. </w:t>
+        <w:t xml:space="preserve">When a user sends </w:t>
+      </w:r>
+      <w:proofErr w:type="gramStart"/>
+      <w:r>
+        <w:t>a first</w:t>
+      </w:r>
+      <w:proofErr w:type="gramEnd"/>
+      <w:r>
+        <w:t xml:space="preserve"> message a chat is created this chat can be views, when the user clicks on chat overview. </w:t>
       </w:r>
     </w:p>
     <w:p>
@@ -2613,10 +2746,18 @@
     </w:p>
     <w:p>
       <w:r>
-        <w:t xml:space="preserve">This is what the user sees afterwards, here all of his chats are displayed. When he selects a particular chat (like here with test3) he can see all exchanged messages along with timestamps for each message. The messages on the </w:t>
+        <w:t xml:space="preserve">This is what the user sees afterwards, here </w:t>
       </w:r>
       <w:proofErr w:type="gramStart"/>
       <w:r>
+        <w:t>all of</w:t>
+      </w:r>
+      <w:proofErr w:type="gramEnd"/>
+      <w:r>
+        <w:t xml:space="preserve"> his chats are displayed. When he selects a particular chat (like here with test3) he can see all exchanged messages along with timestamps for each message. The messages on the </w:t>
+      </w:r>
+      <w:proofErr w:type="gramStart"/>
+      <w:r>
         <w:t>right hand</w:t>
       </w:r>
       <w:proofErr w:type="gramEnd"/>
@@ -2649,7 +2790,15 @@
         <w:t>The feature is a fine-tuned version of the pretrained gpt2-medium model.</w:t>
       </w:r>
       <w:r>
-        <w:t xml:space="preserve"> In the following it will be described step-by-step</w:t>
+        <w:t xml:space="preserve"> In the following it will </w:t>
+      </w:r>
+      <w:proofErr w:type="gramStart"/>
+      <w:r>
+        <w:t>be described</w:t>
+      </w:r>
+      <w:proofErr w:type="gramEnd"/>
+      <w:r>
+        <w:t xml:space="preserve"> step-by-step</w:t>
       </w:r>
       <w:r>
         <w:t xml:space="preserve"> how generative AIs work and how we can leverage that for our</w:t>
@@ -2694,7 +2843,15 @@
         <w:t>Each output from the matrix multiplication (weights × inputs) is called a pre-activation. A bias term is added to each pre-activation, acting as a learnable offset that adjusts the neuron’s sensitivity. The result is then passed through a non-linear activation function (e.g., ReLU), which returns 0 for negative inputs and the input itself for positive values. This final output is called the neuron’s activation, loosely inspired by biological neurons that ‘fire’ when their input crosses a threshold.</w:t>
       </w:r>
       <w:r>
-        <w:t xml:space="preserve"> This described process is then repeated x times. At last, there is an output, also called a “prediction”, (for example there may be 10 outputs representing the numbers 0-9</w:t>
+        <w:t xml:space="preserve"> </w:t>
+      </w:r>
+      <w:proofErr w:type="gramStart"/>
+      <w:r>
+        <w:t>This described</w:t>
+      </w:r>
+      <w:proofErr w:type="gramEnd"/>
+      <w:r>
+        <w:t xml:space="preserve"> process is then repeated x times. At last, there is an output, also called a “prediction”, (for example there may be 10 outputs representing the numbers 0-9</w:t>
       </w:r>
       <w:r>
         <w:t>,</w:t>
@@ -2707,7 +2864,23 @@
         <w:t xml:space="preserve">end represents the predicted number by the neural network). As expected at first this expected output will not make any sense but that is why we need to train the AI. In the training process we know the desired output for each </w:t>
       </w:r>
       <w:r>
-        <w:t xml:space="preserve">input. We then compare each predicted output with the actual output. We can use functions like mean squared error, to estimate how bad the prediction actually is and then build an estimate of all predictions. But since the prediction depends on the weights which can be changed, </w:t>
+        <w:t xml:space="preserve">input. We then compare each predicted output with the actual output. We can use functions </w:t>
+      </w:r>
+      <w:proofErr w:type="gramStart"/>
+      <w:r>
+        <w:t>like mean</w:t>
+      </w:r>
+      <w:proofErr w:type="gramEnd"/>
+      <w:r>
+        <w:t xml:space="preserve"> squared error, to estimate how bad the prediction </w:t>
+      </w:r>
+      <w:proofErr w:type="gramStart"/>
+      <w:r>
+        <w:t>actually is</w:t>
+      </w:r>
+      <w:proofErr w:type="gramEnd"/>
+      <w:r>
+        <w:t xml:space="preserve"> and then build an estimate of all predictions. But since the prediction depends on the weights which can be changed, </w:t>
       </w:r>
       <w:r>
         <w:t>the</w:t>
@@ -2821,11 +2994,27 @@
         <w:t>a high probability means a strong relevance between tokens</w:t>
       </w:r>
       <w:r>
-        <w:t xml:space="preserve">). This in turn is multiplied by the value vectors; by learning how closely each of the embedding vectors are, the AI can learn the structure of the sentences. If the AI models is fed with a lot of sentences and information, it could thus, learn its structure and reproduce it. This is the </w:t>
+        <w:t xml:space="preserve">). This in turn is multiplied by the value vectors; by learning how closely each of the embedding vectors are, the AI can learn the structure of the sentences. If the AI models </w:t>
+      </w:r>
+      <w:proofErr w:type="gramStart"/>
+      <w:r>
+        <w:t>is</w:t>
+      </w:r>
+      <w:proofErr w:type="gramEnd"/>
+      <w:r>
+        <w:t xml:space="preserve"> fed with a lot of sentences and information, it could thus, learn its structure and reproduce it. This is the </w:t>
       </w:r>
       <w:r>
         <w:lastRenderedPageBreak/>
-        <w:t xml:space="preserve">magic behind how ChatGPT is able to predict the next word for an input. </w:t>
+        <w:t xml:space="preserve">magic behind how ChatGPT </w:t>
+      </w:r>
+      <w:proofErr w:type="gramStart"/>
+      <w:r>
+        <w:t>is able to</w:t>
+      </w:r>
+      <w:proofErr w:type="gramEnd"/>
+      <w:r>
+        <w:t xml:space="preserve"> predict the next word for an input. </w:t>
       </w:r>
       <w:r>
         <w:t xml:space="preserve">(A few important aspects to mention are generative AI models often use Gelu instead of Relu and a cross-entropy loss instead of the mean squared error; masked self-attention is also important so that no “future” tokens are used when predicting the next token during training. Lastly, </w:t>
@@ -2878,8 +3067,13 @@
       <w:r>
         <w:t xml:space="preserve">                                                                                                                                                                                           </w:t>
       </w:r>
-      <w:r>
-        <w:t xml:space="preserve">With this knowledge our use of the gpt2-medium model can be explained. We wanted the model to learn the structure of user profiles and corresponding “icebreakers”, thus, we had to create 200-300 of these examples. (For professional purposes a lot more a needed). These are then fed into the </w:t>
+      <w:proofErr w:type="gramStart"/>
+      <w:r>
+        <w:t>With</w:t>
+      </w:r>
+      <w:proofErr w:type="gramEnd"/>
+      <w:r>
+        <w:t xml:space="preserve"> this knowledge our use of the gpt2-medium model can be explained. We wanted the model to learn the structure of user profiles and corresponding “icebreakers”, thus, we had to create 200-300 of these examples. (For professional purposes a lot more a needed). These are then fed into the </w:t>
       </w:r>
       <w:r>
         <w:t xml:space="preserve">gpt2-medium model to learn the relationship between the profiles and the icebreakers. We used a pretrained model, because, without a pretrained model, gpt2-medium would have no knowledge of grammar or sentence structure and a lot more than 200-300 examples would have been needed to train the model. Now that we understood how the model works it also makes sense why feeding the model the following structure for learning would not bring any result: “Profile A- Icebreaker 1; Profile A- Icebreaker 2...”. For someone not understanding how the attention mechanism works this may seem </w:t>
@@ -2888,10 +3082,26 @@
         <w:t>like</w:t>
       </w:r>
       <w:r>
-        <w:t xml:space="preserve"> a way of teaching gpt2-medium the different possibilities for icebreakers for a given user profile. But now we know that this will no work as the model will learn contradicting relationships between the tokens and would not be able to produce valid output. Thus, a better structure would be “Profile A- Icebreaker 1- Icebreaker 2.... Profile B- Icebreaker 1....”. With this structure the model will learn all icebreakers corresponding to one user profile. This learned knowledge is then captured in its updated weights, these are used to then predict several icebreakers for new profiles written by users of our app. This works pretty </w:t>
-      </w:r>
-      <w:r>
-        <w:t>well;</w:t>
+        <w:t xml:space="preserve"> a way of teaching gpt2-medium the different possibilities for icebreakers for a given user profile. But now we know that this will </w:t>
+      </w:r>
+      <w:proofErr w:type="gramStart"/>
+      <w:r>
+        <w:t>no</w:t>
+      </w:r>
+      <w:proofErr w:type="gramEnd"/>
+      <w:r>
+        <w:t xml:space="preserve"> work as the model will learn contradicting relationships between the tokens and would not be able to produce valid output. Thus, a better structure would be “Profile A- Icebreaker 1- Icebreaker 2.... Profile B- Icebreaker 1....”. With this structure the model will learn all icebreakers corresponding to one user profile. This learned knowledge is then captured in its updated weights, these are used to then predict several icebreakers for new profiles written by users of our app. This works </w:t>
+      </w:r>
+      <w:proofErr w:type="gramStart"/>
+      <w:r>
+        <w:t xml:space="preserve">pretty </w:t>
+      </w:r>
+      <w:r>
+        <w:t>well</w:t>
+      </w:r>
+      <w:proofErr w:type="gramEnd"/>
+      <w:r>
+        <w:t>;</w:t>
       </w:r>
       <w:r>
         <w:t xml:space="preserve"> the limitations of our fine-tuned model are discussed in the section “Challenges we have faced”. </w:t>
@@ -2909,10 +3119,34 @@
     </w:p>
     <w:p>
       <w:r>
-        <w:t xml:space="preserve">During the discussion, as to how this app shall look like, we derived that it is extremely important that each chat is end-to-end encrypted. The first reason is, that users may not want the server or the provider of the app to know the contents of their conversations </w:t>
-      </w:r>
-      <w:r>
-        <w:t>and secondly the messages are saved on servers, if they are stored as plaintext, an attacker hijacking the servers may find out all contents of each conversation. Therefore, we needed a way to prevent this. Upon creating an account, the user creates a passphrase and a magic number. The passphrase alongside the magic number is put into a hash function and only the hash value alongside the magic number (also called salt) is saved on the server. A hash function is used so that hash(p,m) = x is easy but the reverse is computationally infeasible. Then in the frontend a new public/private key pair is generated. The private key is encrypted with passphrase to the power of magic number modulo 10^12+33.</w:t>
+        <w:t xml:space="preserve">During the discussion, as to how this app shall look like, we derived that it is extremely important that each chat is end-to-end encrypted. The first reason </w:t>
+      </w:r>
+      <w:proofErr w:type="gramStart"/>
+      <w:r>
+        <w:t>is,</w:t>
+      </w:r>
+      <w:proofErr w:type="gramEnd"/>
+      <w:r>
+        <w:t xml:space="preserve"> that users may not want the server or the provider of the app to know the contents of their conversations </w:t>
+      </w:r>
+      <w:r>
+        <w:t>and secondly the messages are saved on servers, if they are stored as plaintext, an attacker hijacking the servers may find out all contents of each conversation. Therefore, we needed a way to prevent this. Upon creating an account, the user creates a passphrase and a magic number. The passphrase alongside the magic number is put into a hash function and only the hash value alongside the magic number (also called salt) is saved on the server. A hash function is used so that hash(</w:t>
+      </w:r>
+      <w:proofErr w:type="gramStart"/>
+      <w:r>
+        <w:t>p,m</w:t>
+      </w:r>
+      <w:proofErr w:type="gramEnd"/>
+      <w:r>
+        <w:t xml:space="preserve">) = x is easy but the reverse is computationally infeasible. Then in the </w:t>
+      </w:r>
+      <w:proofErr w:type="gramStart"/>
+      <w:r>
+        <w:t>frontend</w:t>
+      </w:r>
+      <w:proofErr w:type="gramEnd"/>
+      <w:r>
+        <w:t xml:space="preserve"> a new public/private key pair is generated. The private key is encrypted with passphrase to the power of magic number modulo 10^12+33.</w:t>
       </w:r>
       <w:r>
         <w:t xml:space="preserve"> (A modulo value large enough, so that </w:t>
@@ -2943,13 +3177,37 @@
         <w:t xml:space="preserve"> When</w:t>
       </w:r>
       <w:r>
-        <w:t xml:space="preserve"> the recipient logs into the website he/she has to type in the passphrase, the output hash is compared to the one stored on the server if they match, he/she is permitted to enter. His/her encrypted private key is fetched from the server, in the frontend the passphrase is used to decrypt it. Now he/she can go to the new chat. For this, the symmetric key (encrypted with this user’s public key) is fetched, the decrypted private key is used to decrypt the symmetric key, then the symmetric key is used to decrypt the new message. This lengthy process is only needed in the beginning, from the moment the user fetched the symmetric key for this chat, the key is saved in the local cache and used for encrypting/decrypting all messages during the session. (Referring to the period where the user uses our website</w:t>
+        <w:t xml:space="preserve"> the recipient logs into the website he/she </w:t>
+      </w:r>
+      <w:proofErr w:type="gramStart"/>
+      <w:r>
+        <w:t>has to</w:t>
+      </w:r>
+      <w:proofErr w:type="gramEnd"/>
+      <w:r>
+        <w:t xml:space="preserve"> type in the passphrase, the output hash is compared to the one stored on the server if they match, he/she is permitted to enter. His/her encrypted private key is fetched from the server, in the </w:t>
+      </w:r>
+      <w:proofErr w:type="gramStart"/>
+      <w:r>
+        <w:t>frontend</w:t>
+      </w:r>
+      <w:proofErr w:type="gramEnd"/>
+      <w:r>
+        <w:t xml:space="preserve"> the passphrase is used to decrypt it. Now he/she can go to the new chat. For this, the symmetric key (encrypted with this user’s public key) is fetched, the decrypted private key is used to decrypt the symmetric key, then the symmetric key is used to decrypt the new message. This lengthy process is only needed in the beginning, from the moment the user fetched the symmetric key for this chat, the key is saved in the local cache and used for encrypting/decrypting all messages during the session. (Referring to the period where the user uses our website</w:t>
       </w:r>
       <w:r>
         <w:t xml:space="preserve">; </w:t>
       </w:r>
       <w:r>
-        <w:t xml:space="preserve">a session terminates, if a user is inactive or logs out). </w:t>
+        <w:t xml:space="preserve">a session </w:t>
+      </w:r>
+      <w:proofErr w:type="gramStart"/>
+      <w:r>
+        <w:t>terminates,</w:t>
+      </w:r>
+      <w:proofErr w:type="gramEnd"/>
+      <w:r>
+        <w:t xml:space="preserve"> if a user is inactive or logs out). </w:t>
       </w:r>
     </w:p>
     <w:p>
@@ -2964,15 +3222,20 @@
     </w:p>
     <w:p>
       <w:r>
-        <w:t>The idea behind the chat feature was to create a seamless experience where there’s no lag during conversations, and users don’t have to click any button to refresh the chat. When someone sends a message, the recipient should see it instantly, without doing anything. This made it clear that a traditional request-response architecture wouldn’t work.</w:t>
-      </w:r>
-      <w:r>
-        <w:t xml:space="preserve"> </w:t>
-      </w:r>
-    </w:p>
-    <w:p>
-      <w:r>
-        <w:t xml:space="preserve">We started exploring other options and came across the publish-subscribe architecture. In this setup, an event automatically sends notifications to everyone subscribed to it. However, since we were working across two different platforms, implementing this wasn’t straightforward. After some research, we found a great solution </w:t>
+        <w:t xml:space="preserve">The idea behind the chat feature was to create a seamless experience where there’s no lag during conversations, and users don’t have to click any button to refresh the chat. When someone sends a message, the recipient should see it instantly, without doing anything. This made it clear that a traditional request-response architecture wouldn’t work. </w:t>
+      </w:r>
+    </w:p>
+    <w:p>
+      <w:r>
+        <w:t xml:space="preserve">We started exploring other options and came across the publish-subscribe architecture. In this setup, an event automatically sends notifications to </w:t>
+      </w:r>
+      <w:proofErr w:type="gramStart"/>
+      <w:r>
+        <w:t>everyone</w:t>
+      </w:r>
+      <w:proofErr w:type="gramEnd"/>
+      <w:r>
+        <w:t xml:space="preserve"> subscribed to it. However, since we were working across two different platforms, implementing this wasn’t straightforward. After some research, we found a great solution </w:t>
       </w:r>
       <w:r>
         <w:t>using WebSocket</w:t>
@@ -2989,7 +3252,15 @@
         <w:t>e user</w:t>
       </w:r>
       <w:r>
-        <w:t>, and the user is subscribed to it. The queues follow a standard structure, like user/queue/{username}/messages. This consistency allows the server to automatically create queues even if they don’t already exist.</w:t>
+        <w:t>, and the user is subscribed to it. The queues follow a standard structure, like user/</w:t>
+      </w:r>
+      <w:proofErr w:type="gramStart"/>
+      <w:r>
+        <w:t>queue/{</w:t>
+      </w:r>
+      <w:proofErr w:type="gramEnd"/>
+      <w:r>
+        <w:t>username}/messages. This consistency allows the server to automatically create queues even if they don’t already exist.</w:t>
       </w:r>
     </w:p>
     <w:p>
@@ -3036,74 +3307,46 @@
           <w:b/>
           <w:bCs/>
         </w:rPr>
-        <w:t>1.</w:t>
-      </w:r>
-      <w:r>
+        <w:t>1. Develop a custom authentication service from scratch and package it as a microservice</w:t>
+      </w:r>
+      <w:r>
+        <w:t>.</w:t>
+      </w:r>
+    </w:p>
+    <w:p>
+      <w:pPr>
         <w:rPr>
           <w:b/>
           <w:bCs/>
         </w:rPr>
-        <w:t xml:space="preserve"> </w:t>
-      </w:r>
+      </w:pPr>
       <w:r>
         <w:rPr>
           <w:b/>
           <w:bCs/>
         </w:rPr>
-        <w:t>Develop a custom authentication service from scratch and package it as a microservice</w:t>
-      </w:r>
-      <w:r>
-        <w:t>.</w:t>
-      </w:r>
-    </w:p>
-    <w:p>
-      <w:pPr>
+        <w:t>2</w:t>
+      </w:r>
+      <w:proofErr w:type="gramStart"/>
+      <w:r>
         <w:rPr>
           <w:b/>
           <w:bCs/>
         </w:rPr>
-      </w:pPr>
+        <w:t>.  Leverage</w:t>
+      </w:r>
+      <w:proofErr w:type="gramEnd"/>
       <w:r>
         <w:rPr>
           <w:b/>
           <w:bCs/>
         </w:rPr>
-        <w:t>2.</w:t>
-      </w:r>
-      <w:r>
-        <w:rPr>
-          <w:b/>
-          <w:bCs/>
-        </w:rPr>
-        <w:t xml:space="preserve">  </w:t>
-      </w:r>
-      <w:r>
-        <w:rPr>
-          <w:b/>
-          <w:bCs/>
-        </w:rPr>
-        <w:t>Leverage an open-source authentication microservice to handle these tasks efficiently.</w:t>
-      </w:r>
-    </w:p>
-    <w:p>
-      <w:r>
-        <w:t xml:space="preserve">After evaluating our options, we decided to integrate </w:t>
-      </w:r>
-      <w:proofErr w:type="spellStart"/>
-      <w:r>
-        <w:t>Keycloak</w:t>
-      </w:r>
-      <w:proofErr w:type="spellEnd"/>
-      <w:r>
-        <w:t xml:space="preserve">, an open-source identity and access management solution. We containerized </w:t>
-      </w:r>
-      <w:proofErr w:type="spellStart"/>
-      <w:r>
-        <w:t>Keycloak</w:t>
-      </w:r>
-      <w:proofErr w:type="spellEnd"/>
-      <w:r>
-        <w:t xml:space="preserve"> using Docker, configuring it to listen on port 8081.</w:t>
+        <w:t xml:space="preserve"> an open-source authentication microservice to handle these tasks efficiently.</w:t>
+      </w:r>
+    </w:p>
+    <w:p>
+      <w:r>
+        <w:t>After evaluating our options, we decided to integrate Keycloak, an open-source identity and access management solution. We containerized Keycloak using Docker, configuring it to listen on port 8081.</w:t>
       </w:r>
     </w:p>
     <w:p>
@@ -3116,7 +3359,15 @@
     </w:p>
     <w:p>
       <w:r>
-        <w:t>The core functionality we implemented involves checking for an authentication token in every outgoing request to the backend. If a request lacks a valid token, the user is automatically redirected to the login page.</w:t>
+        <w:t xml:space="preserve">The core functionality we implemented involves checking for an authentication </w:t>
+      </w:r>
+      <w:proofErr w:type="gramStart"/>
+      <w:r>
+        <w:t>token</w:t>
+      </w:r>
+      <w:proofErr w:type="gramEnd"/>
+      <w:r>
+        <w:t xml:space="preserve"> in every outgoing request to the backend. If a request lacks a valid token, the user is automatically redirected to the login page.</w:t>
       </w:r>
     </w:p>
     <w:p>
@@ -3176,43 +3427,7 @@
           <w:kern w:val="0"/>
           <w14:ligatures w14:val="none"/>
         </w:rPr>
-        <w:t xml:space="preserve">The backend then retrieves this token and forwards it to the </w:t>
-      </w:r>
-      <w:proofErr w:type="spellStart"/>
-      <w:r>
-        <w:rPr>
-          <w:rFonts w:ascii="Times New Roman" w:eastAsia="Times New Roman" w:hAnsi="Times New Roman" w:cs="Times New Roman"/>
-          <w:kern w:val="0"/>
-          <w14:ligatures w14:val="none"/>
-        </w:rPr>
-        <w:t>Keycloak</w:t>
-      </w:r>
-      <w:proofErr w:type="spellEnd"/>
-      <w:r>
-        <w:rPr>
-          <w:rFonts w:ascii="Times New Roman" w:eastAsia="Times New Roman" w:hAnsi="Times New Roman" w:cs="Times New Roman"/>
-          <w:kern w:val="0"/>
-          <w14:ligatures w14:val="none"/>
-        </w:rPr>
-        <w:t xml:space="preserve"> microservice for validation. If the token is verified as legitimate, </w:t>
-      </w:r>
-      <w:proofErr w:type="spellStart"/>
-      <w:r>
-        <w:rPr>
-          <w:rFonts w:ascii="Times New Roman" w:eastAsia="Times New Roman" w:hAnsi="Times New Roman" w:cs="Times New Roman"/>
-          <w:kern w:val="0"/>
-          <w14:ligatures w14:val="none"/>
-        </w:rPr>
-        <w:t>Keycloak</w:t>
-      </w:r>
-      <w:proofErr w:type="spellEnd"/>
-      <w:r>
-        <w:rPr>
-          <w:rFonts w:ascii="Times New Roman" w:eastAsia="Times New Roman" w:hAnsi="Times New Roman" w:cs="Times New Roman"/>
-          <w:kern w:val="0"/>
-          <w14:ligatures w14:val="none"/>
-        </w:rPr>
-        <w:t xml:space="preserve"> sends a green flag to the backend, which then processes the request and returns the appropriate response to the frontend.</w:t>
+        <w:t>The backend then retrieves this token and forwards it to the Keycloak microservice for validation. If the token is verified as legitimate, Keycloak sends a green flag to the backend, which then processes the request and returns the appropriate response to the frontend.</w:t>
       </w:r>
     </w:p>
     <w:p>
@@ -3337,13 +3552,8 @@
         <w:t xml:space="preserve">: </w:t>
       </w:r>
       <w:r>
-        <w:t xml:space="preserve">Figure 10: System Architecture for Authentication and Authorization Using </w:t>
-      </w:r>
-      <w:proofErr w:type="spellStart"/>
-      <w:r>
-        <w:t>Keycloak</w:t>
-      </w:r>
-      <w:proofErr w:type="spellEnd"/>
+        <w:t>Figure 10: System Architecture for Authentication and Authorization Using Keycloak</w:t>
+      </w:r>
     </w:p>
     <w:p/>
     <w:p>
@@ -3359,70 +3569,182 @@
         <w:t xml:space="preserve"> </w:t>
       </w:r>
     </w:p>
-    <w:p/>
-    <w:p/>
-    <w:p>
-      <w:pPr>
-        <w:pStyle w:val="Heading3"/>
-      </w:pPr>
-      <w:bookmarkStart w:id="10" w:name="_Toc189596651"/>
-      <w:r>
-        <w:t>“Available” user overview</w:t>
-      </w:r>
-      <w:bookmarkEnd w:id="10"/>
-      <w:r>
-        <w:t xml:space="preserve"> </w:t>
-      </w:r>
-    </w:p>
-    <w:p>
-      <w:r>
-        <w:t>For the See All Users component, we have been following the five main principles of Object-Oriented Programming (OOP). The key features we adhered to are modularity, non-repetitiveness, and extensibility, while ensuring that modifications are minimized.</w:t>
-      </w:r>
-    </w:p>
-    <w:p>
-      <w:r>
-        <w:t xml:space="preserve">The backend is responsible for providing a list of all users, excluding the currently logged-in user. Specifically, it returns only those online users whom the logged-in user has not yet chatted with. A crucial principle we followed was not requesting any unnecessary data from the backend, ensuring efficiency and optimized </w:t>
-      </w:r>
-      <w:r>
-        <w:t>performance.</w:t>
-      </w:r>
-    </w:p>
-    <w:p>
-      <w:r>
-        <w:t>To achieve this, we used a Data Transfer Object (DTO) structure for displaying users:</w:t>
-      </w:r>
-    </w:p>
-    <w:p>
-      <w:pPr>
-        <w:jc w:val="center"/>
+    <w:p>
+      <w:r>
+        <w:t>We aimed to enhance the</w:t>
+      </w:r>
+      <w:r>
         <w:rPr>
           <w:b/>
           <w:bCs/>
         </w:rPr>
-      </w:pPr>
-      <w:proofErr w:type="spellStart"/>
+        <w:t xml:space="preserve"> </w:t>
+      </w:r>
+      <w:r>
+        <w:t>user experience by allowing users to quickly find and connect with other online users.</w:t>
+      </w:r>
+      <w:r>
+        <w:t xml:space="preserve"> </w:t>
+      </w:r>
+      <w:r>
+        <w:t>This feature was designed with the same principles of Object-Oriented Programming (OOP) that guided the development of the "Available Users" overview, focusing on modularity, reusability, and efficiency.</w:t>
+      </w:r>
+    </w:p>
+    <w:p>
+      <w:r>
+        <w:t>The search functionality interacts with the backend to filter users based on the search query entered by the logged-in user.</w:t>
+      </w:r>
+    </w:p>
+    <w:p>
+      <w:r>
+        <w:t>When a user enters a name into the search bar, the frontend transmits a request to the backend, which processes the query and returns a list of users whose usernames match the search criteria.</w:t>
+      </w:r>
+      <w:r>
+        <w:t xml:space="preserve"> </w:t>
+      </w:r>
+    </w:p>
+    <w:p>
+      <w:pPr>
+        <w:spacing w:after="0" w:line="240" w:lineRule="auto"/>
+        <w:rPr>
+          <w:rFonts w:ascii="Times New Roman" w:eastAsia="Times New Roman" w:hAnsi="Times New Roman" w:cs="Times New Roman"/>
+          <w:color w:val="E3EAF2"/>
+          <w:kern w:val="0"/>
+          <w:sz w:val="22"/>
+          <w:szCs w:val="22"/>
+          <w:bdr w:val="single" w:sz="2" w:space="0" w:color="auto" w:frame="1"/>
+          <w:shd w:val="clear" w:color="auto" w:fill="09090B"/>
+          <w:lang w:eastAsia="de-DE"/>
+          <w14:ligatures w14:val="none"/>
+        </w:rPr>
+      </w:pPr>
+      <w:r>
+        <w:rPr>
+          <w:rFonts w:ascii="Times New Roman" w:eastAsia="Times New Roman" w:hAnsi="Times New Roman" w:cs="Times New Roman"/>
+          <w:color w:val="E3EAF2"/>
+          <w:kern w:val="0"/>
+          <w:sz w:val="22"/>
+          <w:szCs w:val="22"/>
+          <w:bdr w:val="single" w:sz="2" w:space="0" w:color="auto" w:frame="1"/>
+          <w:shd w:val="clear" w:color="auto" w:fill="09090B"/>
+          <w:lang w:eastAsia="de-DE"/>
+          <w14:ligatures w14:val="none"/>
+        </w:rPr>
+        <w:t>@</w:t>
+      </w:r>
+      <w:proofErr w:type="gramStart"/>
+      <w:r>
+        <w:rPr>
+          <w:rFonts w:ascii="Times New Roman" w:eastAsia="Times New Roman" w:hAnsi="Times New Roman" w:cs="Times New Roman"/>
+          <w:color w:val="E3EAF2"/>
+          <w:kern w:val="0"/>
+          <w:sz w:val="22"/>
+          <w:szCs w:val="22"/>
+          <w:bdr w:val="single" w:sz="2" w:space="0" w:color="auto" w:frame="1"/>
+          <w:shd w:val="clear" w:color="auto" w:fill="09090B"/>
+          <w:lang w:eastAsia="de-DE"/>
+          <w14:ligatures w14:val="none"/>
+        </w:rPr>
+        <w:t>Query(</w:t>
+      </w:r>
+      <w:proofErr w:type="gramEnd"/>
+      <w:r>
+        <w:rPr>
+          <w:rFonts w:ascii="Times New Roman" w:eastAsia="Times New Roman" w:hAnsi="Times New Roman" w:cs="Times New Roman"/>
+          <w:color w:val="91D076"/>
+          <w:kern w:val="0"/>
+          <w:sz w:val="22"/>
+          <w:szCs w:val="22"/>
+          <w:bdr w:val="single" w:sz="2" w:space="0" w:color="auto" w:frame="1"/>
+          <w:shd w:val="clear" w:color="auto" w:fill="09090B"/>
+          <w:lang w:eastAsia="de-DE"/>
+          <w14:ligatures w14:val="none"/>
+        </w:rPr>
+        <w:t>"SELECT p FROM PublicUser ProfileEntity p WHERE p.username LIKE %:username% AND p.keycloakUser Id &lt;&gt; :currentUser Id"</w:t>
+      </w:r>
+      <w:r>
+        <w:rPr>
+          <w:rFonts w:ascii="Times New Roman" w:eastAsia="Times New Roman" w:hAnsi="Times New Roman" w:cs="Times New Roman"/>
+          <w:color w:val="E3EAF2"/>
+          <w:kern w:val="0"/>
+          <w:sz w:val="22"/>
+          <w:szCs w:val="22"/>
+          <w:bdr w:val="single" w:sz="2" w:space="0" w:color="auto" w:frame="1"/>
+          <w:shd w:val="clear" w:color="auto" w:fill="09090B"/>
+          <w:lang w:eastAsia="de-DE"/>
+          <w14:ligatures w14:val="none"/>
+        </w:rPr>
+        <w:t>)</w:t>
+      </w:r>
+    </w:p>
+    <w:p>
+      <w:r>
+        <w:rPr>
+          <w:rFonts w:ascii="Times New Roman" w:eastAsia="Times New Roman" w:hAnsi="Times New Roman" w:cs="Times New Roman"/>
+          <w:color w:val="E3EAF2"/>
+          <w:kern w:val="0"/>
+          <w:sz w:val="22"/>
+          <w:szCs w:val="22"/>
+          <w:shd w:val="clear" w:color="auto" w:fill="09090B"/>
+          <w:lang w:eastAsia="de-DE"/>
+          <w14:ligatures w14:val="none"/>
+        </w:rPr>
+        <w:t>```"</w:t>
+      </w:r>
+      <w:r>
+        <w:t xml:space="preserve"> </w:t>
+      </w:r>
+    </w:p>
+    <w:p>
+      <w:r>
+        <w:t xml:space="preserve">Importantly, the backend </w:t>
+      </w:r>
+      <w:r>
+        <w:t xml:space="preserve">not </w:t>
+      </w:r>
+      <w:r>
+        <w:t>only returns users who are currently online and who</w:t>
+      </w:r>
       <w:r>
         <w:rPr>
           <w:b/>
           <w:bCs/>
         </w:rPr>
-        <w:t>AvailableUserDTO</w:t>
-      </w:r>
-      <w:proofErr w:type="spellEnd"/>
+        <w:t xml:space="preserve"> </w:t>
+      </w:r>
+      <w:r>
+        <w:t xml:space="preserve">have not previously engaged in a chat with the logged-in user, </w:t>
+      </w:r>
+      <w:r>
+        <w:t xml:space="preserve">it returns every user who has been saved in the DB, </w:t>
+      </w:r>
+      <w:r>
+        <w:t>ensuring that the results are relevant and actionable.</w:t>
+      </w:r>
+    </w:p>
+    <w:p>
+      <w:r>
+        <w:t>To ensure optimal</w:t>
+      </w:r>
       <w:r>
         <w:rPr>
           <w:b/>
           <w:bCs/>
         </w:rPr>
-        <w:t>=</w:t>
-      </w:r>
-      <w:proofErr w:type="gramStart"/>
+        <w:t xml:space="preserve"> </w:t>
+      </w:r>
+      <w:r>
+        <w:t>performance, we implemented a mechanism to avoid unnecessary data retrieval. The backend utilizes a dedicated search method that leverages the existing user data structure</w:t>
+      </w:r>
       <w:r>
         <w:rPr>
           <w:b/>
           <w:bCs/>
         </w:rPr>
-        <w:t xml:space="preserve"> </w:t>
+        <w:t>.</w:t>
+      </w:r>
+      <w:r>
+        <w:t xml:space="preserve"> This ensures</w:t>
       </w:r>
       <w:r>
         <w:rPr>
@@ -3432,98 +3754,89 @@
         <w:t xml:space="preserve"> </w:t>
       </w:r>
       <w:r>
+        <w:t>that only the relevant user information is transmitted. This approach minimizes the load on the server and enhances the responsiveness of the application.</w:t>
+      </w:r>
+    </w:p>
+    <w:p>
+      <w:r>
+        <w:t>The search results are displayed using a similar Data Transfer Object (DTO) structure as the "Available Users" feature</w:t>
+      </w:r>
+      <w:r>
+        <w:t xml:space="preserve">. </w:t>
+      </w:r>
+    </w:p>
+    <w:p>
+      <w:r>
+        <w:t xml:space="preserve">The search results are dynamically rendered in a user-friendly card format, </w:t>
+      </w:r>
+      <w:proofErr w:type="gramStart"/>
+      <w:r>
+        <w:t>similar to</w:t>
+      </w:r>
+      <w:proofErr w:type="gramEnd"/>
+      <w:r>
+        <w:t xml:space="preserve"> the available users' display. Each card presents the user's profile picture, username, and status, allowing users to quickly identify potential contacts.</w:t>
+      </w:r>
+    </w:p>
+    <w:p>
+      <w:pPr>
+        <w:pStyle w:val="Heading3"/>
+      </w:pPr>
+      <w:bookmarkStart w:id="10" w:name="_Toc189596651"/>
+      <w:r>
+        <w:t>“Available” user overview</w:t>
+      </w:r>
+      <w:bookmarkEnd w:id="10"/>
+      <w:r>
+        <w:t xml:space="preserve"> </w:t>
+      </w:r>
+    </w:p>
+    <w:p>
+      <w:r>
+        <w:t>For the See All Users component, we have been following the five main principles of Object-Oriented Programming (OOP). The key features we adhered to are modularity, non-repetitiveness, and extensibility, while ensuring that modifications are minimized.</w:t>
+      </w:r>
+    </w:p>
+    <w:p>
+      <w:r>
+        <w:t>The backend is responsible for providing a list of all users, excluding the currently logged-in user. Specifically, it returns only those online users whom the logged-in user has not yet chatted with. A crucial principle we followed was not requesting any unnecessary data from the backend, ensuring efficiency and optimized performance.</w:t>
+      </w:r>
+    </w:p>
+    <w:p>
+      <w:r>
+        <w:lastRenderedPageBreak/>
+        <w:t>To achieve this, we used a Data Transfer Object (DTO) structure for displaying users:</w:t>
+      </w:r>
+    </w:p>
+    <w:p>
+      <w:pPr>
+        <w:jc w:val="center"/>
         <w:rPr>
           <w:b/>
           <w:bCs/>
         </w:rPr>
-        <w:t xml:space="preserve"> [</w:t>
-      </w:r>
-      <w:proofErr w:type="gramEnd"/>
+      </w:pPr>
       <w:r>
         <w:rPr>
           <w:b/>
           <w:bCs/>
         </w:rPr>
-        <w:t>id;</w:t>
-      </w:r>
+        <w:t>AvailableUserDTO=</w:t>
+      </w:r>
+      <w:proofErr w:type="gramStart"/>
       <w:r>
         <w:rPr>
           <w:b/>
           <w:bCs/>
         </w:rPr>
-        <w:t xml:space="preserve"> username </w:t>
-      </w:r>
+        <w:t xml:space="preserve">   [</w:t>
+      </w:r>
+      <w:proofErr w:type="gramEnd"/>
       <w:r>
         <w:rPr>
           <w:b/>
           <w:bCs/>
         </w:rPr>
-        <w:t>;</w:t>
-      </w:r>
-      <w:r>
-        <w:rPr>
-          <w:b/>
-          <w:bCs/>
-        </w:rPr>
-        <w:t xml:space="preserve"> </w:t>
-      </w:r>
-      <w:proofErr w:type="spellStart"/>
-      <w:r>
-        <w:rPr>
-          <w:b/>
-          <w:bCs/>
-        </w:rPr>
-        <w:t>profilePhoto</w:t>
-      </w:r>
-      <w:proofErr w:type="spellEnd"/>
-      <w:r>
-        <w:rPr>
-          <w:b/>
-          <w:bCs/>
-        </w:rPr>
-        <w:t xml:space="preserve"> </w:t>
-      </w:r>
-      <w:r>
-        <w:rPr>
-          <w:b/>
-          <w:bCs/>
-        </w:rPr>
-        <w:t>;</w:t>
-      </w:r>
-      <w:r>
-        <w:rPr>
-          <w:b/>
-          <w:bCs/>
-        </w:rPr>
-        <w:t xml:space="preserve"> </w:t>
-      </w:r>
-      <w:r>
-        <w:rPr>
-          <w:b/>
-          <w:bCs/>
-        </w:rPr>
-        <w:t>bio;</w:t>
-      </w:r>
-      <w:r>
-        <w:rPr>
-          <w:b/>
-          <w:bCs/>
-        </w:rPr>
-        <w:t xml:space="preserve"> </w:t>
-      </w:r>
-      <w:r>
-        <w:rPr>
-          <w:b/>
-          <w:bCs/>
-        </w:rPr>
-        <w:t>status</w:t>
-      </w:r>
-      <w:r>
-        <w:rPr>
-          <w:b/>
-          <w:bCs/>
-        </w:rPr>
-        <w:t xml:space="preserve"> ]</w:t>
+        <w:t>id; username ; profilePhoto ; bio; status ]</w:t>
       </w:r>
     </w:p>
     <w:p>
@@ -3534,18 +3847,40 @@
         <w:t>n. Then, ea</w:t>
       </w:r>
       <w:r>
-        <w:t>ch user’s details are compiled into a card component, which is then dynamically rendered on the screen using a loop. This approach eliminates the need to manually create individual user cards, saving both development time and effort while maintaining scalability.</w:t>
-      </w:r>
-    </w:p>
-    <w:p/>
-    <w:p/>
+        <w:t xml:space="preserve">ch user’s details are compiled into a card component, which is then dynamically rendered on the screen using a loop. </w:t>
+      </w:r>
+    </w:p>
+    <w:p>
+      <w:r>
+        <w:t>W</w:t>
+      </w:r>
+      <w:r>
+        <w:t xml:space="preserve">e </w:t>
+      </w:r>
+      <w:r>
+        <w:t xml:space="preserve">also </w:t>
+      </w:r>
+      <w:r>
+        <w:t>implement</w:t>
+      </w:r>
+      <w:r>
+        <w:t>ed</w:t>
+      </w:r>
+      <w:r>
+        <w:t xml:space="preserve"> pagination by fetching and displaying a maximum of 10 users at a time. This allows users to navigate through the list of available users easily, using "Previous" and "Next" buttons to view the next or previous set of available users. This approach enhances the user experience by preventing overwhelming amounts of information from being displayed at once and allows for smoother navigation through the available user profiles.</w:t>
+      </w:r>
+    </w:p>
+    <w:p>
+      <w:r>
+        <w:t>This approach eliminates the need to manually create individual user cards, saving both development time and effort while maintaining scalability.</w:t>
+      </w:r>
+    </w:p>
     <w:p>
       <w:pPr>
         <w:pStyle w:val="Heading1"/>
       </w:pPr>
       <w:bookmarkStart w:id="11" w:name="_Toc189596652"/>
       <w:r>
-        <w:lastRenderedPageBreak/>
         <w:t>Architecture</w:t>
       </w:r>
       <w:bookmarkEnd w:id="11"/>
@@ -3620,7 +3955,19 @@
         </w:drawing>
       </w:r>
       <w:r>
-        <w:t xml:space="preserve">This a general overview of our project, here the general ideas with the core components are illustrated. (Most of the shown steps are an over-simplification of the actual processes). </w:t>
+        <w:t xml:space="preserve">This </w:t>
+      </w:r>
+      <w:proofErr w:type="gramStart"/>
+      <w:r>
+        <w:t>a general</w:t>
+      </w:r>
+      <w:proofErr w:type="gramEnd"/>
+      <w:r>
+        <w:t xml:space="preserve"> overview of our project, here the general ideas with the core components are illustrated. (Most of the shown steps are an over-simplification of the actual </w:t>
+      </w:r>
+      <w:r>
+        <w:lastRenderedPageBreak/>
+        <w:t xml:space="preserve">processes). </w:t>
       </w:r>
       <w:r>
         <w:rPr>
@@ -3636,7 +3983,6 @@
       </w:pPr>
       <w:bookmarkStart w:id="13" w:name="_Toc189596654"/>
       <w:r>
-        <w:lastRenderedPageBreak/>
         <w:t>AI functionality</w:t>
       </w:r>
       <w:bookmarkEnd w:id="13"/>
@@ -3858,7 +4204,15 @@
     </w:p>
     <w:p>
       <w:r>
-        <w:t>This sequence diagram illustrates how the other user logs in and receives the new message from the new user. Important abbreviations: hash – hashing algorithm, pk – passkey, mn – magic number, decr – decryption algorithm, enc_variable - encrypted variable, pubkey – public key, privkey – private key, symkey – symmetric key, msg – message</w:t>
+        <w:t xml:space="preserve">This sequence diagram illustrates how the other user logs in and receives </w:t>
+      </w:r>
+      <w:proofErr w:type="gramStart"/>
+      <w:r>
+        <w:t>the</w:t>
+      </w:r>
+      <w:proofErr w:type="gramEnd"/>
+      <w:r>
+        <w:t xml:space="preserve"> new message from the new user. Important abbreviations: hash – hashing algorithm, pk – passkey, mn – magic number, decr – decryption algorithm, enc_variable - encrypted variable, pubkey – public key, privkey – private key, symkey – symmetric key, msg – message</w:t>
       </w:r>
       <w:r>
         <w:t>, db - database</w:t>
@@ -4070,7 +4424,15 @@
         <w:t xml:space="preserve"> listed. An Icebreaker for this profile would be: “</w:t>
       </w:r>
       <w:r>
-        <w:t>Singing is really nice. What kind of songs do you really like singing the most?</w:t>
+        <w:t xml:space="preserve">Singing is </w:t>
+      </w:r>
+      <w:proofErr w:type="gramStart"/>
+      <w:r>
+        <w:t>really nice</w:t>
+      </w:r>
+      <w:proofErr w:type="gramEnd"/>
+      <w:r>
+        <w:t>. What kind of songs do you really like singing the most?</w:t>
       </w:r>
       <w:r>
         <w:t>” Each Icebreaker has two sentences, one sentence reaffirming the interest of the person and the other asking a question about it. We believe such a structure makes the most sense for first messages but also due to limitation in the number of datasets that we have</w:t>
@@ -4170,7 +4532,23 @@
     </w:p>
     <w:p>
       <w:r>
-        <w:t xml:space="preserve">Utkarsh Fulara was responsible for the login and authentication, for the chat overview component and for the real time chatting feature. Bilal Alali was responsible for the search feature, the profile overview component and for creating data for our AI feature. Andrej Sum-Shik was responsible for conceptualising the AI, training the AI and integrating the AI into the Website. Furthermore, he was also responsible for the end-to-end encryption of the messages. All members worked on creating architectures for the application. Especially conceptualising the database where login and chat data is stored. </w:t>
+        <w:t xml:space="preserve">Utkarsh Fulara was responsible for the login and authentication, for the chat overview component and for the real time chatting feature. Bilal Alali was responsible for the search feature, the profile overview component and for creating data for our AI feature. Andrej Sum-Shik was responsible for conceptualising </w:t>
+      </w:r>
+      <w:proofErr w:type="gramStart"/>
+      <w:r>
+        <w:t>the AI</w:t>
+      </w:r>
+      <w:proofErr w:type="gramEnd"/>
+      <w:r>
+        <w:t xml:space="preserve">, training the AI and integrating the AI into the Website. Furthermore, he was also responsible for the end-to-end encryption of the messages. All members worked on creating </w:t>
+      </w:r>
+      <w:proofErr w:type="gramStart"/>
+      <w:r>
+        <w:t>architectures</w:t>
+      </w:r>
+      <w:proofErr w:type="gramEnd"/>
+      <w:r>
+        <w:t xml:space="preserve"> for the application. Especially conceptualising the database where login and chat data is stored. </w:t>
       </w:r>
     </w:p>
     <w:p>
@@ -4188,11 +4566,35 @@
         <w:t>This was our favourite project of our young career so far, mainly because we were given the freedom to create what we want and the fact that we could work on one of the most important topics in computer science of this day. Through this project we were able to understand neural networks which are th</w:t>
       </w:r>
       <w:r>
-        <w:t xml:space="preserve">e basis for all modern AI. Furthermore, we were able to work with and understand the complex models of todays age which extend </w:t>
+        <w:t xml:space="preserve">e basis for all modern AI. Furthermore, we were able to work with and understand the complex models of </w:t>
+      </w:r>
+      <w:proofErr w:type="gramStart"/>
+      <w:r>
+        <w:t>todays</w:t>
+      </w:r>
+      <w:proofErr w:type="gramEnd"/>
+      <w:r>
+        <w:t xml:space="preserve"> age which extend </w:t>
       </w:r>
       <w:r>
         <w:lastRenderedPageBreak/>
-        <w:t>the classic neural networks, namely generative AI models like ChatGPT. We had a lot of fun understanding how AIs like ChatGPT work and how we can fine-tune these models to our demands. Furthermore, we were able to sophisticate and enlarge our knowledge of creating complex websites, which incorporate a java driven backend (in our case springboot), a javascript driven frontend (in our case angular) and database structure (in our case PostgreSQL). Especially conceptualizing and implementing the chat functionality demanded a lot of our knowledge acquired in courses like: Distributed Systems or Computer Networks. Thus, we could bring a lot of the learned concepts into practice. The same can be said for the end-to-end encryption. Here the knowledge acquired in the IT Security lecture</w:t>
+        <w:t xml:space="preserve">the classic neural networks, namely generative AI models like ChatGPT. We had a lot of fun understanding how AIs like ChatGPT </w:t>
+      </w:r>
+      <w:proofErr w:type="gramStart"/>
+      <w:r>
+        <w:t>work</w:t>
+      </w:r>
+      <w:proofErr w:type="gramEnd"/>
+      <w:r>
+        <w:t xml:space="preserve"> and how we can fine-tune these models to our demands. Furthermore, we were able to sophisticate and enlarge our knowledge of creating complex websites, which incorporate a java driven backend (in our case springboot), a javascript driven frontend (in our case angular) and database structure (in our case PostgreSQL). Especially conceptualizing and implementing the chat functionality demanded a lot of our knowledge acquired in courses like: Distributed Systems or Computer Networks. Thus, we could bring a lot of the </w:t>
+      </w:r>
+      <w:proofErr w:type="gramStart"/>
+      <w:r>
+        <w:t>learned concepts</w:t>
+      </w:r>
+      <w:proofErr w:type="gramEnd"/>
+      <w:r>
+        <w:t xml:space="preserve"> into practice. The same can be said for the end-to-end encryption. Here the knowledge acquired in the IT Security lecture</w:t>
       </w:r>
       <w:r>
         <w:t>s</w:t>
@@ -4204,10 +4606,34 @@
         <w:t>was</w:t>
       </w:r>
       <w:r>
-        <w:t xml:space="preserve"> of vital importance to realize our ideas. </w:t>
-      </w:r>
-      <w:r>
-        <w:t>As the mentioned courses were among some of our favourites in our journey in this university, we were able to sophisticate our interests and get a first idea of what to do after acquiring our bachelor’s degree. (If all goes well all of us are finishing this year or at the beginning of next year). In conclusion on behalf of the entire team: Utkarsh Fulara, Bilal Alali and Andrej Sum-Shik we would like to thank Prof. Dr. Ing. Markus Miettinen for giving us this wonderful opportunity. We are very satisfied with this course and are looking forward to the presentation where we can present our work to all the other students.</w:t>
+        <w:t xml:space="preserve"> of vital importance to </w:t>
+      </w:r>
+      <w:proofErr w:type="gramStart"/>
+      <w:r>
+        <w:t>realize</w:t>
+      </w:r>
+      <w:proofErr w:type="gramEnd"/>
+      <w:r>
+        <w:t xml:space="preserve"> our ideas. </w:t>
+      </w:r>
+      <w:r>
+        <w:t xml:space="preserve">As the </w:t>
+      </w:r>
+      <w:proofErr w:type="gramStart"/>
+      <w:r>
+        <w:t>mentioned courses</w:t>
+      </w:r>
+      <w:proofErr w:type="gramEnd"/>
+      <w:r>
+        <w:t xml:space="preserve"> were among some of our favourites in our journey in this university, we were able to sophisticate our interests and get a first idea of what to do after acquiring our bachelor’s degree. (If all goes well all of us are finishing this year or at the beginning of next year). In </w:t>
+      </w:r>
+      <w:proofErr w:type="gramStart"/>
+      <w:r>
+        <w:t>conclusion</w:t>
+      </w:r>
+      <w:proofErr w:type="gramEnd"/>
+      <w:r>
+        <w:t xml:space="preserve"> on behalf of the entire team: Utkarsh Fulara, Bilal Alali and Andrej Sum-Shik we would like to thank Prof. Dr. Ing. Markus Miettinen for giving us this wonderful opportunity. We are very satisfied with this course and are looking forward to the presentation where we can present our work to all the other students.</w:t>
       </w:r>
     </w:p>
     <w:p/>
@@ -5069,7 +5495,6 @@
   <w:style w:type="character" w:default="1" w:styleId="DefaultParagraphFont">
     <w:name w:val="Default Paragraph Font"/>
     <w:uiPriority w:val="1"/>
-    <w:semiHidden/>
     <w:unhideWhenUsed/>
   </w:style>
   <w:style w:type="table" w:default="1" w:styleId="TableNormal">

</xml_diff>